<commit_message>
Add Published Patents to Healthcare & Life Sciences tab on Industries page
</commit_message>
<xml_diff>
--- a/Website_Update_Roadmap_PrimeTechnologies.docx
+++ b/Website_Update_Roadmap_PrimeTechnologies.docx
@@ -27,7 +27,7 @@
           <w:color w:val="475569"/>
           <w:sz w:val="26"/>
         </w:rPr>
-        <w:t>Prime Technologies | AI Pathways: Bridging Academic Research &amp; Enterprise Production</w:t>
+        <w:t>Prime Technologies | AI Pathways: Bridging Academic Research, Clinical Patents &amp; Enterprise Production</w:t>
       </w:r>
     </w:p>
     <w:p>
@@ -51,8 +51,8 @@
             <w:tcW w:type="dxa" w:w="4680"/>
             <w:shd w:fill="F1F5F9"/>
             <w:tcMar>
-              <w:top w:w="100" w:type="dxa"/>
-              <w:bottom w:w="100" w:type="dxa"/>
+              <w:top w:w="90" w:type="dxa"/>
+              <w:bottom w:w="90" w:type="dxa"/>
               <w:left w:w="120" w:type="dxa"/>
               <w:right w:w="120" w:type="dxa"/>
             </w:tcMar>
@@ -65,7 +65,7 @@
               <w:rPr>
                 <w:b/>
                 <w:color w:val="1E293B"/>
-                <w:sz w:val="20"/>
+                <w:sz w:val="19"/>
               </w:rPr>
               <w:t>Live Deployed Website</w:t>
             </w:r>
@@ -76,8 +76,8 @@
             <w:tcW w:type="dxa" w:w="4680"/>
             <w:shd w:fill="FFFFFF"/>
             <w:tcMar>
-              <w:top w:w="100" w:type="dxa"/>
-              <w:bottom w:w="100" w:type="dxa"/>
+              <w:top w:w="90" w:type="dxa"/>
+              <w:bottom w:w="90" w:type="dxa"/>
               <w:left w:w="120" w:type="dxa"/>
               <w:right w:w="120" w:type="dxa"/>
             </w:tcMar>
@@ -89,7 +89,7 @@
             <w:r>
               <w:rPr>
                 <w:color w:val="0F172A"/>
-                <w:sz w:val="20"/>
+                <w:sz w:val="19"/>
               </w:rPr>
               <w:t>https://primetechnologies.hanusistla.workers.dev/ (Cloudflare Workers)</w:t>
             </w:r>
@@ -102,8 +102,8 @@
             <w:tcW w:type="dxa" w:w="4680"/>
             <w:shd w:fill="F1F5F9"/>
             <w:tcMar>
-              <w:top w:w="100" w:type="dxa"/>
-              <w:bottom w:w="100" w:type="dxa"/>
+              <w:top w:w="90" w:type="dxa"/>
+              <w:bottom w:w="90" w:type="dxa"/>
               <w:left w:w="120" w:type="dxa"/>
               <w:right w:w="120" w:type="dxa"/>
             </w:tcMar>
@@ -116,9 +116,9 @@
               <w:rPr>
                 <w:b/>
                 <w:color w:val="1E293B"/>
-                <w:sz w:val="20"/>
+                <w:sz w:val="19"/>
               </w:rPr>
-              <w:t>Development Environment</w:t>
+              <w:t>Published Patents URL</w:t>
             </w:r>
           </w:p>
         </w:tc>
@@ -127,8 +127,8 @@
             <w:tcW w:type="dxa" w:w="4680"/>
             <w:shd w:fill="FFFFFF"/>
             <w:tcMar>
-              <w:top w:w="100" w:type="dxa"/>
-              <w:bottom w:w="100" w:type="dxa"/>
+              <w:top w:w="90" w:type="dxa"/>
+              <w:bottom w:w="90" w:type="dxa"/>
               <w:left w:w="120" w:type="dxa"/>
               <w:right w:w="120" w:type="dxa"/>
             </w:tcMar>
@@ -140,7 +140,58 @@
             <w:r>
               <w:rPr>
                 <w:color w:val="0F172A"/>
-                <w:sz w:val="20"/>
+                <w:sz w:val="19"/>
+              </w:rPr>
+              <w:t>https://primetechnologies.hanusistla.workers.dev/industries (Tab: Healthcare &amp; Life Sciences)</w:t>
+            </w:r>
+          </w:p>
+        </w:tc>
+      </w:tr>
+      <w:tr>
+        <w:tc>
+          <w:tcPr>
+            <w:tcW w:type="dxa" w:w="4680"/>
+            <w:shd w:fill="F1F5F9"/>
+            <w:tcMar>
+              <w:top w:w="90" w:type="dxa"/>
+              <w:bottom w:w="90" w:type="dxa"/>
+              <w:left w:w="120" w:type="dxa"/>
+              <w:right w:w="120" w:type="dxa"/>
+            </w:tcMar>
+          </w:tcPr>
+          <w:p>
+            <w:pPr>
+              <w:spacing w:after="40"/>
+            </w:pPr>
+            <w:r>
+              <w:rPr>
+                <w:b/>
+                <w:color w:val="1E293B"/>
+                <w:sz w:val="19"/>
+              </w:rPr>
+              <w:t>Development Environment</w:t>
+            </w:r>
+          </w:p>
+        </w:tc>
+        <w:tc>
+          <w:tcPr>
+            <w:tcW w:type="dxa" w:w="4680"/>
+            <w:shd w:fill="FFFFFF"/>
+            <w:tcMar>
+              <w:top w:w="90" w:type="dxa"/>
+              <w:bottom w:w="90" w:type="dxa"/>
+              <w:left w:w="120" w:type="dxa"/>
+              <w:right w:w="120" w:type="dxa"/>
+            </w:tcMar>
+          </w:tcPr>
+          <w:p>
+            <w:pPr>
+              <w:spacing w:after="40"/>
+            </w:pPr>
+            <w:r>
+              <w:rPr>
+                <w:color w:val="0F172A"/>
+                <w:sz w:val="19"/>
               </w:rPr>
               <w:t>https://primetechnologies.lovable.app (Lovable Studio)</w:t>
             </w:r>
@@ -153,8 +204,8 @@
             <w:tcW w:type="dxa" w:w="4680"/>
             <w:shd w:fill="F1F5F9"/>
             <w:tcMar>
-              <w:top w:w="100" w:type="dxa"/>
-              <w:bottom w:w="100" w:type="dxa"/>
+              <w:top w:w="90" w:type="dxa"/>
+              <w:bottom w:w="90" w:type="dxa"/>
               <w:left w:w="120" w:type="dxa"/>
               <w:right w:w="120" w:type="dxa"/>
             </w:tcMar>
@@ -167,7 +218,7 @@
               <w:rPr>
                 <w:b/>
                 <w:color w:val="1E293B"/>
-                <w:sz w:val="20"/>
+                <w:sz w:val="19"/>
               </w:rPr>
               <w:t>Source Code Repository</w:t>
             </w:r>
@@ -178,8 +229,8 @@
             <w:tcW w:type="dxa" w:w="4680"/>
             <w:shd w:fill="FFFFFF"/>
             <w:tcMar>
-              <w:top w:w="100" w:type="dxa"/>
-              <w:bottom w:w="100" w:type="dxa"/>
+              <w:top w:w="90" w:type="dxa"/>
+              <w:bottom w:w="90" w:type="dxa"/>
               <w:left w:w="120" w:type="dxa"/>
               <w:right w:w="120" w:type="dxa"/>
             </w:tcMar>
@@ -191,7 +242,7 @@
             <w:r>
               <w:rPr>
                 <w:color w:val="0F172A"/>
-                <w:sz w:val="20"/>
+                <w:sz w:val="19"/>
               </w:rPr>
               <w:t>https://github.com/hanumanthsistla/primetechnologies (Branch: main)</w:t>
             </w:r>
@@ -204,8 +255,8 @@
             <w:tcW w:type="dxa" w:w="4680"/>
             <w:shd w:fill="F1F5F9"/>
             <w:tcMar>
-              <w:top w:w="100" w:type="dxa"/>
-              <w:bottom w:w="100" w:type="dxa"/>
+              <w:top w:w="90" w:type="dxa"/>
+              <w:bottom w:w="90" w:type="dxa"/>
               <w:left w:w="120" w:type="dxa"/>
               <w:right w:w="120" w:type="dxa"/>
             </w:tcMar>
@@ -218,7 +269,7 @@
               <w:rPr>
                 <w:b/>
                 <w:color w:val="1E293B"/>
-                <w:sz w:val="20"/>
+                <w:sz w:val="19"/>
               </w:rPr>
               <w:t>Research Knowledge Base</w:t>
             </w:r>
@@ -229,8 +280,8 @@
             <w:tcW w:type="dxa" w:w="4680"/>
             <w:shd w:fill="FFFFFF"/>
             <w:tcMar>
-              <w:top w:w="100" w:type="dxa"/>
-              <w:bottom w:w="100" w:type="dxa"/>
+              <w:top w:w="90" w:type="dxa"/>
+              <w:bottom w:w="90" w:type="dxa"/>
               <w:left w:w="120" w:type="dxa"/>
               <w:right w:w="120" w:type="dxa"/>
             </w:tcMar>
@@ -242,7 +293,7 @@
             <w:r>
               <w:rPr>
                 <w:color w:val="0F172A"/>
-                <w:sz w:val="20"/>
+                <w:sz w:val="19"/>
               </w:rPr>
               <w:t>https://sites.google.com/view/hanuaiml/applied-ai-aiml-generative-ai-agentic-ai</w:t>
             </w:r>
@@ -255,8 +306,8 @@
             <w:tcW w:type="dxa" w:w="4680"/>
             <w:shd w:fill="F1F5F9"/>
             <w:tcMar>
-              <w:top w:w="100" w:type="dxa"/>
-              <w:bottom w:w="100" w:type="dxa"/>
+              <w:top w:w="90" w:type="dxa"/>
+              <w:bottom w:w="90" w:type="dxa"/>
               <w:left w:w="120" w:type="dxa"/>
               <w:right w:w="120" w:type="dxa"/>
             </w:tcMar>
@@ -269,7 +320,7 @@
               <w:rPr>
                 <w:b/>
                 <w:color w:val="1E293B"/>
-                <w:sz w:val="20"/>
+                <w:sz w:val="19"/>
               </w:rPr>
               <w:t>Core Team Leadership</w:t>
             </w:r>
@@ -280,8 +331,8 @@
             <w:tcW w:type="dxa" w:w="4680"/>
             <w:shd w:fill="FFFFFF"/>
             <w:tcMar>
-              <w:top w:w="100" w:type="dxa"/>
-              <w:bottom w:w="100" w:type="dxa"/>
+              <w:top w:w="90" w:type="dxa"/>
+              <w:bottom w:w="90" w:type="dxa"/>
               <w:left w:w="120" w:type="dxa"/>
               <w:right w:w="120" w:type="dxa"/>
             </w:tcMar>
@@ -293,7 +344,7 @@
             <w:r>
               <w:rPr>
                 <w:color w:val="0F172A"/>
-                <w:sz w:val="20"/>
+                <w:sz w:val="19"/>
               </w:rPr>
               <w:t>Dr. Hanumanth Sastry, Dr. Gopal Das, Dr. Kiran D</w:t>
             </w:r>
@@ -306,8 +357,8 @@
             <w:tcW w:type="dxa" w:w="4680"/>
             <w:shd w:fill="F1F5F9"/>
             <w:tcMar>
-              <w:top w:w="100" w:type="dxa"/>
-              <w:bottom w:w="100" w:type="dxa"/>
+              <w:top w:w="90" w:type="dxa"/>
+              <w:bottom w:w="90" w:type="dxa"/>
               <w:left w:w="120" w:type="dxa"/>
               <w:right w:w="120" w:type="dxa"/>
             </w:tcMar>
@@ -320,7 +371,7 @@
               <w:rPr>
                 <w:b/>
                 <w:color w:val="1E293B"/>
-                <w:sz w:val="20"/>
+                <w:sz w:val="19"/>
               </w:rPr>
               <w:t>Document Version &amp; Date</w:t>
             </w:r>
@@ -331,8 +382,8 @@
             <w:tcW w:type="dxa" w:w="4680"/>
             <w:shd w:fill="FFFFFF"/>
             <w:tcMar>
-              <w:top w:w="100" w:type="dxa"/>
-              <w:bottom w:w="100" w:type="dxa"/>
+              <w:top w:w="90" w:type="dxa"/>
+              <w:bottom w:w="90" w:type="dxa"/>
               <w:left w:w="120" w:type="dxa"/>
               <w:right w:w="120" w:type="dxa"/>
             </w:tcMar>
@@ -344,9 +395,9 @@
             <w:r>
               <w:rPr>
                 <w:color w:val="0F172A"/>
-                <w:sz w:val="20"/>
+                <w:sz w:val="19"/>
               </w:rPr>
-              <w:t>Version 1.0 — Generated October 2026</w:t>
+              <w:t>Version 1.1 — Updated with Official Indian Patent Publications (October 2026)</w:t>
             </w:r>
           </w:p>
         </w:tc>
@@ -354,7 +405,7 @@
     </w:tbl>
     <w:p>
       <w:pPr>
-        <w:spacing w:after="320"/>
+        <w:spacing w:after="280"/>
       </w:pPr>
     </w:p>
     <w:p>
@@ -370,16 +421,7 @@
     </w:p>
     <w:p>
       <w:r>
-        <w:t xml:space="preserve">Prime Technologies (AI Pathways) provides high-integrity enterprise AI advisory and deployment services, transitioning applied ML, generative AI, and multi-agent workflows from research validation to governed production. Originally prototyped in the Lovable design studio, the application is version-controlled via GitHub and deployed to global edge infrastructure using Cloudflare Workers at </w:t>
-      </w:r>
-      <w:r>
-        <w:rPr>
-          <w:b/>
-        </w:rPr>
-        <w:t>https://primetechnologies.hanusistla.workers.dev/</w:t>
-      </w:r>
-      <w:r>
-        <w:t>. The digital platform must reflect the rigorous, multi-disciplinary blend of senior computer science engineering (AIML) and clinical sciences (Psychiatry and Cardiology) that distinguishes Dr. Hanumanth Sastry and his leadership team from conventional marketing-driven consulting outfits.</w:t>
+        <w:t>Prime Technologies (AI Pathways) bridges senior computer science research in Applied ML, Generative AI, and Agentic Systems with clinical and enterprise production. A major technical milestone distinguishing the practice is the publication of two official Indian Patents by the Intellectual Property Office, Government of India: (1) an AR-enabled Generative AI platform for interventional cardiology using smart glasses, and (2) a multi-agent simulation-based training system for certifiable psychiatry skills under National Medical Commission (NMC) standards. These proprietary moats are now integrated directly onto the platform under the Healthcare &amp; Life Sciences industry vertical.</w:t>
       </w:r>
     </w:p>
     <w:p>
@@ -390,12 +432,7 @@
         <w:rPr>
           <w:color w:val="1E3A8A"/>
         </w:rPr>
-        <w:t>2. Core Team Leadership &amp; Updated Contact Directory</w:t>
-      </w:r>
-    </w:p>
-    <w:p>
-      <w:r>
-        <w:t>The website has been updated to provide explicit, transparent email communication channels for each key leader, establishing credibility and direct engagement paths for enterprise partners, research collaborators, and healthcare clients.</w:t>
+        <w:t>2. Published Indian Patents (Intellectual Property Office, India)</w:t>
       </w:r>
     </w:p>
     <w:tbl>
@@ -427,9 +464,9 @@
               <w:rPr>
                 <w:b/>
                 <w:color w:val="FFFFFF"/>
-                <w:sz w:val="20"/>
+                <w:sz w:val="19"/>
               </w:rPr>
-              <w:t>Team Member</w:t>
+              <w:t>Publication &amp; App No.</w:t>
             </w:r>
           </w:p>
         </w:tc>
@@ -449,9 +486,9 @@
               <w:rPr>
                 <w:b/>
                 <w:color w:val="FFFFFF"/>
-                <w:sz w:val="20"/>
+                <w:sz w:val="19"/>
               </w:rPr>
-              <w:t>Role &amp; Specialization</w:t>
+              <w:t>Title of Invention</w:t>
             </w:r>
           </w:p>
         </w:tc>
@@ -471,9 +508,9 @@
               <w:rPr>
                 <w:b/>
                 <w:color w:val="FFFFFF"/>
-                <w:sz w:val="20"/>
+                <w:sz w:val="19"/>
               </w:rPr>
-              <w:t>Direct Email Address</w:t>
+              <w:t>Inventors &amp; Applicants</w:t>
             </w:r>
           </w:p>
         </w:tc>
@@ -493,9 +530,9 @@
               <w:rPr>
                 <w:b/>
                 <w:color w:val="FFFFFF"/>
-                <w:sz w:val="20"/>
+                <w:sz w:val="19"/>
               </w:rPr>
-              <w:t>Focus Areas &amp; Advisory Scope</w:t>
+              <w:t>Clinical AI Inventions</w:t>
             </w:r>
           </w:p>
         </w:tc>
@@ -516,9 +553,18 @@
             <w:r>
               <w:rPr>
                 <w:b/>
-                <w:sz w:val="19"/>
+                <w:color w:val="0E7490"/>
+                <w:sz w:val="17"/>
               </w:rPr>
-              <w:t>Dr. Hanumanth Sastry</w:t>
+              <w:t>IN202641041350 A1</w:t>
+              <w:br/>
+              <w:t>App: 202641041350</w:t>
+              <w:br/>
+              <w:t>Filing: 31-03-2026</w:t>
+              <w:br/>
+              <w:t>Pub: 17-04-2026</w:t>
+              <w:br/>
+              <w:t>Journal: 16/2026</w:t>
             </w:r>
           </w:p>
         </w:tc>
@@ -536,9 +582,9 @@
           <w:p>
             <w:r>
               <w:rPr>
-                <w:sz w:val="19"/>
+                <w:sz w:val="17"/>
               </w:rPr>
-              <w:t>Professor (AIML) &amp; Practice Lead</w:t>
+              <w:t>Generative AI Platform for Real-Time Cardiac Clinical Decision Support and Procedural Guidance using Smart Interventional Glasses</w:t>
             </w:r>
           </w:p>
         </w:tc>
@@ -556,10 +602,11 @@
           <w:p>
             <w:r>
               <w:rPr>
-                <w:color w:val="0E7490"/>
-                <w:sz w:val="19"/>
+                <w:sz w:val="17"/>
               </w:rPr>
-              <w:t>hanusistla@gmail.com</w:t>
+              <w:t>Dr. Hanumanth Sastry Sistla (Professor AIML, DSU)</w:t>
+              <w:br/>
+              <w:t>Dr. Kiran Kumar Ramesh Dyawarkonda (CDSIMER, DSU)</w:t>
             </w:r>
           </w:p>
         </w:tc>
@@ -577,9 +624,9 @@
           <w:p>
             <w:r>
               <w:rPr>
-                <w:sz w:val="19"/>
+                <w:sz w:val="17"/>
               </w:rPr>
-              <w:t>Applied ML, Generative &amp; Agentic AI, Enterprise Architecture, Governance, EU AI Act compliance.</w:t>
+              <w:t>Wearable smart AR glasses; multimodal LLM engine ingesting 12-lead ECG, vitals, cath lab angiography; hands-free procedural guidance (ACLS, PCI, valve replacement); complication bailout; edge AI inference (ARM/Qualcomm/Jetson); blockchain EHR ledger.</w:t>
             </w:r>
           </w:p>
         </w:tc>
@@ -600,9 +647,18 @@
             <w:r>
               <w:rPr>
                 <w:b/>
-                <w:sz w:val="19"/>
+                <w:color w:val="0E7490"/>
+                <w:sz w:val="17"/>
               </w:rPr>
-              <w:t>Dr. Gopal Das</w:t>
+              <w:t>202641098894 A</w:t>
+              <w:br/>
+              <w:t>App: 202641098894</w:t>
+              <w:br/>
+              <w:t>Filing: 15-08-2026</w:t>
+              <w:br/>
+              <w:t>Pub: 21-08-2026</w:t>
+              <w:br/>
+              <w:t>Journal: 34/2026</w:t>
             </w:r>
           </w:p>
         </w:tc>
@@ -620,9 +676,9 @@
           <w:p>
             <w:r>
               <w:rPr>
-                <w:sz w:val="19"/>
+                <w:sz w:val="17"/>
               </w:rPr>
-              <w:t>Professor (Psychiatry) &amp; Clinical Advisor</w:t>
+              <w:t>Generative AI Driven Simulation-Based Training System and Method for Certifiable NMC Psychiatry Skills in Suicide Risk Assessment</w:t>
             </w:r>
           </w:p>
         </w:tc>
@@ -640,10 +696,11 @@
           <w:p>
             <w:r>
               <w:rPr>
-                <w:color w:val="0E7490"/>
-                <w:sz w:val="19"/>
+                <w:sz w:val="17"/>
               </w:rPr>
-              <w:t>drgopaldascm@gmail.com</w:t>
+              <w:t>Hanumanth Sastry Sistla (Applicant)</w:t>
+              <w:br/>
+              <w:t>Dr. Gopal Das CM (Inventor, Professor Psychiatry)</w:t>
             </w:r>
           </w:p>
         </w:tc>
@@ -661,93 +718,9 @@
           <w:p>
             <w:r>
               <w:rPr>
-                <w:sz w:val="19"/>
+                <w:sz w:val="17"/>
               </w:rPr>
-              <w:t>Cognitive Systems, Behavioral Healthcare AI, Clinical Safety, Ethical Model Alignment.</w:t>
-            </w:r>
-          </w:p>
-        </w:tc>
-      </w:tr>
-      <w:tr>
-        <w:tc>
-          <w:tcPr>
-            <w:tcW w:type="dxa" w:w="2340"/>
-            <w:shd w:fill="F8FAFC"/>
-            <w:tcMar>
-              <w:top w:w="100" w:type="dxa"/>
-              <w:bottom w:w="100" w:type="dxa"/>
-              <w:left w:w="120" w:type="dxa"/>
-              <w:right w:w="120" w:type="dxa"/>
-            </w:tcMar>
-          </w:tcPr>
-          <w:p>
-            <w:r>
-              <w:rPr>
-                <w:b/>
-                <w:sz w:val="19"/>
-              </w:rPr>
-              <w:t>Dr. Kiran D</w:t>
-            </w:r>
-          </w:p>
-        </w:tc>
-        <w:tc>
-          <w:tcPr>
-            <w:tcW w:type="dxa" w:w="2340"/>
-            <w:shd w:fill="F8FAFC"/>
-            <w:tcMar>
-              <w:top w:w="100" w:type="dxa"/>
-              <w:bottom w:w="100" w:type="dxa"/>
-              <w:left w:w="120" w:type="dxa"/>
-              <w:right w:w="120" w:type="dxa"/>
-            </w:tcMar>
-          </w:tcPr>
-          <w:p>
-            <w:r>
-              <w:rPr>
-                <w:sz w:val="19"/>
-              </w:rPr>
-              <w:t>Associate Professor (Cardiology) &amp; Healthcare Specialist</w:t>
-            </w:r>
-          </w:p>
-        </w:tc>
-        <w:tc>
-          <w:tcPr>
-            <w:tcW w:type="dxa" w:w="2340"/>
-            <w:shd w:fill="F8FAFC"/>
-            <w:tcMar>
-              <w:top w:w="100" w:type="dxa"/>
-              <w:bottom w:w="100" w:type="dxa"/>
-              <w:left w:w="120" w:type="dxa"/>
-              <w:right w:w="120" w:type="dxa"/>
-            </w:tcMar>
-          </w:tcPr>
-          <w:p>
-            <w:r>
-              <w:rPr>
-                <w:color w:val="0E7490"/>
-                <w:sz w:val="19"/>
-              </w:rPr>
-              <w:t>kdyawarkonda@gmail.com</w:t>
-            </w:r>
-          </w:p>
-        </w:tc>
-        <w:tc>
-          <w:tcPr>
-            <w:tcW w:type="dxa" w:w="2340"/>
-            <w:shd w:fill="F8FAFC"/>
-            <w:tcMar>
-              <w:top w:w="100" w:type="dxa"/>
-              <w:bottom w:w="100" w:type="dxa"/>
-              <w:left w:w="120" w:type="dxa"/>
-              <w:right w:w="120" w:type="dxa"/>
-            </w:tcMar>
-          </w:tcPr>
-          <w:p>
-            <w:r>
-              <w:rPr>
-                <w:sz w:val="19"/>
-              </w:rPr>
-              <w:t>Cardiovascular AI Diagnostics, Medical Signal Processing, Clinical Trial Data &amp; Validation.</w:t>
+              <w:t>Simulation-based training platform for NMC certifiable psychiatry skills; dynamic patient scenario generator (psychosocial, volitional); multi-agent architecture (Director, Patient Simulator, Evaluator, Safety Agent); human-in-the-loop expert validation; VR/3D integration.</w:t>
             </w:r>
           </w:p>
         </w:tc>
@@ -766,70 +739,364 @@
         <w:rPr>
           <w:color w:val="1E3A8A"/>
         </w:rPr>
-        <w:t>3. Modern Web Ecosystem &amp; Deployment Topology</w:t>
+        <w:t>3. Core Team Leadership &amp; Contact Directory</w:t>
       </w:r>
     </w:p>
-    <w:p>
-      <w:r>
-        <w:t>The website benefits from a modern continuous delivery lifecycle combining no-code/rapid prototyping with enterprise git workflows and serverless edge delivery:</w:t>
-      </w:r>
-    </w:p>
-    <w:p>
-      <w:pPr>
-        <w:pStyle w:val="ListBullet"/>
-      </w:pPr>
-      <w:r>
-        <w:rPr>
-          <w:b/>
-        </w:rPr>
-        <w:t xml:space="preserve">Lovable Development Studio (https://primetechnologies.lovable.app): </w:t>
-      </w:r>
-      <w:r>
-        <w:t>Serves as an agile visual design and component authoring tool for UI experimentation, theme iteration, and content structure.</w:t>
-      </w:r>
-    </w:p>
-    <w:p>
-      <w:pPr>
-        <w:pStyle w:val="ListBullet"/>
-      </w:pPr>
-      <w:r>
-        <w:rPr>
-          <w:b/>
-        </w:rPr>
-        <w:t xml:space="preserve">GitHub Repository (https://github.com/hanumanthsistla/primetechnologies): </w:t>
-      </w:r>
-      <w:r>
-        <w:t>The central, authoritative single source of truth for all production source code, assets, configuration, and documentation.</w:t>
-      </w:r>
-    </w:p>
-    <w:p>
-      <w:pPr>
-        <w:pStyle w:val="ListBullet"/>
-      </w:pPr>
-      <w:r>
-        <w:rPr>
-          <w:b/>
-        </w:rPr>
-        <w:t xml:space="preserve">Cloudflare Workers Edge (https://primetechnologies.hanusistla.workers.dev/): </w:t>
-      </w:r>
-      <w:r>
-        <w:t>Delivers ultra-low latency, serverless global delivery with SSL, DDoS protection, edge caching, and scalable HTTP routing.</w:t>
-      </w:r>
-    </w:p>
-    <w:p>
-      <w:pPr>
-        <w:pStyle w:val="ListBullet"/>
-      </w:pPr>
-      <w:r>
-        <w:rPr>
-          <w:b/>
-        </w:rPr>
-        <w:t xml:space="preserve">Knowledge Base Bridge (Google Sites - hanuaiml): </w:t>
-      </w:r>
-      <w:r>
-        <w:t>Dr. Sastry's academic and research portal providing deep domain content in Manufacturing, Legal AI, Fintech, and Healthcare AI.</w:t>
-      </w:r>
-    </w:p>
+    <w:tbl>
+      <w:tblPr>
+        <w:tblW w:type="auto" w:w="0"/>
+        <w:jc w:val="center"/>
+        <w:tblLook w:firstColumn="1" w:firstRow="1" w:lastColumn="0" w:lastRow="0" w:noHBand="0" w:noVBand="1" w:val="04A0"/>
+      </w:tblPr>
+      <w:tblGrid>
+        <w:gridCol w:w="2340"/>
+        <w:gridCol w:w="2340"/>
+        <w:gridCol w:w="2340"/>
+        <w:gridCol w:w="2340"/>
+      </w:tblGrid>
+      <w:tr>
+        <w:tc>
+          <w:tcPr>
+            <w:tcW w:type="dxa" w:w="2340"/>
+            <w:shd w:fill="0F766E"/>
+            <w:tcMar>
+              <w:top w:w="120" w:type="dxa"/>
+              <w:bottom w:w="120" w:type="dxa"/>
+              <w:left w:w="120" w:type="dxa"/>
+              <w:right w:w="120" w:type="dxa"/>
+            </w:tcMar>
+          </w:tcPr>
+          <w:p>
+            <w:r>
+              <w:rPr>
+                <w:b/>
+                <w:color w:val="FFFFFF"/>
+                <w:sz w:val="19"/>
+              </w:rPr>
+              <w:t>Team Member</w:t>
+            </w:r>
+          </w:p>
+        </w:tc>
+        <w:tc>
+          <w:tcPr>
+            <w:tcW w:type="dxa" w:w="2340"/>
+            <w:shd w:fill="0F766E"/>
+            <w:tcMar>
+              <w:top w:w="120" w:type="dxa"/>
+              <w:bottom w:w="120" w:type="dxa"/>
+              <w:left w:w="120" w:type="dxa"/>
+              <w:right w:w="120" w:type="dxa"/>
+            </w:tcMar>
+          </w:tcPr>
+          <w:p>
+            <w:r>
+              <w:rPr>
+                <w:b/>
+                <w:color w:val="FFFFFF"/>
+                <w:sz w:val="19"/>
+              </w:rPr>
+              <w:t>Role &amp; Specialization</w:t>
+            </w:r>
+          </w:p>
+        </w:tc>
+        <w:tc>
+          <w:tcPr>
+            <w:tcW w:type="dxa" w:w="2340"/>
+            <w:shd w:fill="0F766E"/>
+            <w:tcMar>
+              <w:top w:w="120" w:type="dxa"/>
+              <w:bottom w:w="120" w:type="dxa"/>
+              <w:left w:w="120" w:type="dxa"/>
+              <w:right w:w="120" w:type="dxa"/>
+            </w:tcMar>
+          </w:tcPr>
+          <w:p>
+            <w:r>
+              <w:rPr>
+                <w:b/>
+                <w:color w:val="FFFFFF"/>
+                <w:sz w:val="19"/>
+              </w:rPr>
+              <w:t>Direct Email Address</w:t>
+            </w:r>
+          </w:p>
+        </w:tc>
+        <w:tc>
+          <w:tcPr>
+            <w:tcW w:type="dxa" w:w="2340"/>
+            <w:shd w:fill="0F766E"/>
+            <w:tcMar>
+              <w:top w:w="120" w:type="dxa"/>
+              <w:bottom w:w="120" w:type="dxa"/>
+              <w:left w:w="120" w:type="dxa"/>
+              <w:right w:w="120" w:type="dxa"/>
+            </w:tcMar>
+          </w:tcPr>
+          <w:p>
+            <w:r>
+              <w:rPr>
+                <w:b/>
+                <w:color w:val="FFFFFF"/>
+                <w:sz w:val="19"/>
+              </w:rPr>
+              <w:t>Focus Areas &amp; Patent Leadership</w:t>
+            </w:r>
+          </w:p>
+        </w:tc>
+      </w:tr>
+      <w:tr>
+        <w:tc>
+          <w:tcPr>
+            <w:tcW w:type="dxa" w:w="2340"/>
+            <w:shd w:fill="F0FDFA"/>
+            <w:tcMar>
+              <w:top w:w="90" w:type="dxa"/>
+              <w:bottom w:w="90" w:type="dxa"/>
+              <w:left w:w="100" w:type="dxa"/>
+              <w:right w:w="100" w:type="dxa"/>
+            </w:tcMar>
+          </w:tcPr>
+          <w:p>
+            <w:r>
+              <w:rPr>
+                <w:b/>
+                <w:sz w:val="18"/>
+              </w:rPr>
+              <w:t>Dr. Hanumanth Sastry</w:t>
+            </w:r>
+          </w:p>
+        </w:tc>
+        <w:tc>
+          <w:tcPr>
+            <w:tcW w:type="dxa" w:w="2340"/>
+            <w:shd w:fill="F0FDFA"/>
+            <w:tcMar>
+              <w:top w:w="90" w:type="dxa"/>
+              <w:bottom w:w="90" w:type="dxa"/>
+              <w:left w:w="100" w:type="dxa"/>
+              <w:right w:w="100" w:type="dxa"/>
+            </w:tcMar>
+          </w:tcPr>
+          <w:p>
+            <w:r>
+              <w:rPr>
+                <w:sz w:val="18"/>
+              </w:rPr>
+              <w:t>Professor (AIML) &amp; Practice Lead</w:t>
+            </w:r>
+          </w:p>
+        </w:tc>
+        <w:tc>
+          <w:tcPr>
+            <w:tcW w:type="dxa" w:w="2340"/>
+            <w:shd w:fill="F0FDFA"/>
+            <w:tcMar>
+              <w:top w:w="90" w:type="dxa"/>
+              <w:bottom w:w="90" w:type="dxa"/>
+              <w:left w:w="100" w:type="dxa"/>
+              <w:right w:w="100" w:type="dxa"/>
+            </w:tcMar>
+          </w:tcPr>
+          <w:p>
+            <w:r>
+              <w:rPr>
+                <w:color w:val="0E7490"/>
+                <w:sz w:val="18"/>
+              </w:rPr>
+              <w:t>hanusistla@gmail.com</w:t>
+            </w:r>
+          </w:p>
+        </w:tc>
+        <w:tc>
+          <w:tcPr>
+            <w:tcW w:type="dxa" w:w="2340"/>
+            <w:shd w:fill="F0FDFA"/>
+            <w:tcMar>
+              <w:top w:w="90" w:type="dxa"/>
+              <w:bottom w:w="90" w:type="dxa"/>
+              <w:left w:w="100" w:type="dxa"/>
+              <w:right w:w="100" w:type="dxa"/>
+            </w:tcMar>
+          </w:tcPr>
+          <w:p>
+            <w:r>
+              <w:rPr>
+                <w:sz w:val="18"/>
+              </w:rPr>
+              <w:t>Applied ML, GenAI, Agentic AI, Interventional Cardiac AR Patent, Psychiatry Simulation Patent.</w:t>
+            </w:r>
+          </w:p>
+        </w:tc>
+      </w:tr>
+      <w:tr>
+        <w:tc>
+          <w:tcPr>
+            <w:tcW w:type="dxa" w:w="2340"/>
+            <w:shd w:fill="FFFFFF"/>
+            <w:tcMar>
+              <w:top w:w="90" w:type="dxa"/>
+              <w:bottom w:w="90" w:type="dxa"/>
+              <w:left w:w="100" w:type="dxa"/>
+              <w:right w:w="100" w:type="dxa"/>
+            </w:tcMar>
+          </w:tcPr>
+          <w:p>
+            <w:r>
+              <w:rPr>
+                <w:b/>
+                <w:sz w:val="18"/>
+              </w:rPr>
+              <w:t>Dr. Gopal Das</w:t>
+            </w:r>
+          </w:p>
+        </w:tc>
+        <w:tc>
+          <w:tcPr>
+            <w:tcW w:type="dxa" w:w="2340"/>
+            <w:shd w:fill="FFFFFF"/>
+            <w:tcMar>
+              <w:top w:w="90" w:type="dxa"/>
+              <w:bottom w:w="90" w:type="dxa"/>
+              <w:left w:w="100" w:type="dxa"/>
+              <w:right w:w="100" w:type="dxa"/>
+            </w:tcMar>
+          </w:tcPr>
+          <w:p>
+            <w:r>
+              <w:rPr>
+                <w:sz w:val="18"/>
+              </w:rPr>
+              <w:t>Professor (Psychiatry) &amp; Clinical Advisor</w:t>
+            </w:r>
+          </w:p>
+        </w:tc>
+        <w:tc>
+          <w:tcPr>
+            <w:tcW w:type="dxa" w:w="2340"/>
+            <w:shd w:fill="FFFFFF"/>
+            <w:tcMar>
+              <w:top w:w="90" w:type="dxa"/>
+              <w:bottom w:w="90" w:type="dxa"/>
+              <w:left w:w="100" w:type="dxa"/>
+              <w:right w:w="100" w:type="dxa"/>
+            </w:tcMar>
+          </w:tcPr>
+          <w:p>
+            <w:r>
+              <w:rPr>
+                <w:color w:val="0E7490"/>
+                <w:sz w:val="18"/>
+              </w:rPr>
+              <w:t>drgopaldascm@gmail.com</w:t>
+            </w:r>
+          </w:p>
+        </w:tc>
+        <w:tc>
+          <w:tcPr>
+            <w:tcW w:type="dxa" w:w="2340"/>
+            <w:shd w:fill="FFFFFF"/>
+            <w:tcMar>
+              <w:top w:w="90" w:type="dxa"/>
+              <w:bottom w:w="90" w:type="dxa"/>
+              <w:left w:w="100" w:type="dxa"/>
+              <w:right w:w="100" w:type="dxa"/>
+            </w:tcMar>
+          </w:tcPr>
+          <w:p>
+            <w:r>
+              <w:rPr>
+                <w:sz w:val="18"/>
+              </w:rPr>
+              <w:t>Cognitive Systems, Behavioral Healthcare AI, NMC Suicide Risk Assessment Simulation Patent.</w:t>
+            </w:r>
+          </w:p>
+        </w:tc>
+      </w:tr>
+      <w:tr>
+        <w:tc>
+          <w:tcPr>
+            <w:tcW w:type="dxa" w:w="2340"/>
+            <w:shd w:fill="F0FDFA"/>
+            <w:tcMar>
+              <w:top w:w="90" w:type="dxa"/>
+              <w:bottom w:w="90" w:type="dxa"/>
+              <w:left w:w="100" w:type="dxa"/>
+              <w:right w:w="100" w:type="dxa"/>
+            </w:tcMar>
+          </w:tcPr>
+          <w:p>
+            <w:r>
+              <w:rPr>
+                <w:b/>
+                <w:sz w:val="18"/>
+              </w:rPr>
+              <w:t>Dr. Kiran D</w:t>
+            </w:r>
+          </w:p>
+        </w:tc>
+        <w:tc>
+          <w:tcPr>
+            <w:tcW w:type="dxa" w:w="2340"/>
+            <w:shd w:fill="F0FDFA"/>
+            <w:tcMar>
+              <w:top w:w="90" w:type="dxa"/>
+              <w:bottom w:w="90" w:type="dxa"/>
+              <w:left w:w="100" w:type="dxa"/>
+              <w:right w:w="100" w:type="dxa"/>
+            </w:tcMar>
+          </w:tcPr>
+          <w:p>
+            <w:r>
+              <w:rPr>
+                <w:sz w:val="18"/>
+              </w:rPr>
+              <w:t>Associate Professor (Cardiology) &amp; Healthcare Specialist</w:t>
+            </w:r>
+          </w:p>
+        </w:tc>
+        <w:tc>
+          <w:tcPr>
+            <w:tcW w:type="dxa" w:w="2340"/>
+            <w:shd w:fill="F0FDFA"/>
+            <w:tcMar>
+              <w:top w:w="90" w:type="dxa"/>
+              <w:bottom w:w="90" w:type="dxa"/>
+              <w:left w:w="100" w:type="dxa"/>
+              <w:right w:w="100" w:type="dxa"/>
+            </w:tcMar>
+          </w:tcPr>
+          <w:p>
+            <w:r>
+              <w:rPr>
+                <w:color w:val="0E7490"/>
+                <w:sz w:val="18"/>
+              </w:rPr>
+              <w:t>kdyawarkonda@gmail.com</w:t>
+            </w:r>
+          </w:p>
+        </w:tc>
+        <w:tc>
+          <w:tcPr>
+            <w:tcW w:type="dxa" w:w="2340"/>
+            <w:shd w:fill="F0FDFA"/>
+            <w:tcMar>
+              <w:top w:w="90" w:type="dxa"/>
+              <w:bottom w:w="90" w:type="dxa"/>
+              <w:left w:w="100" w:type="dxa"/>
+              <w:right w:w="100" w:type="dxa"/>
+            </w:tcMar>
+          </w:tcPr>
+          <w:p>
+            <w:r>
+              <w:rPr>
+                <w:sz w:val="18"/>
+              </w:rPr>
+              <w:t>Interventional Cardiology, 12-lead ECG AI, Smart Interventional Glasses Patent.</w:t>
+            </w:r>
+          </w:p>
+        </w:tc>
+      </w:tr>
+    </w:tbl>
     <w:p>
       <w:pPr>
         <w:spacing w:after="280"/>
@@ -854,7 +1121,21 @@
         <w:rPr>
           <w:color w:val="0F766E"/>
         </w:rPr>
-        <w:t>Phase 1: Foundation &amp; Immediate Direct Communications (Completed / In-Flight) [Current Sprint]</w:t>
+        <w:t>Phase 1: Foundation, Team Contacts &amp; Patents Integration (Completed) [Current Sprint]</w:t>
+      </w:r>
+    </w:p>
+    <w:p>
+      <w:pPr>
+        <w:pStyle w:val="ListBullet"/>
+      </w:pPr>
+      <w:r>
+        <w:rPr>
+          <w:b/>
+        </w:rPr>
+        <w:t>Published Patents Section:</w:t>
+      </w:r>
+      <w:r>
+        <w:t xml:space="preserve"> Added interactive "Patents Published" showcase under the "Healthcare &amp; Life Sciences" tab on /industries, detailing full Indian Patent Office publications for Cardiology AR AI and NMC Psychiatry Simulation AI.</w:t>
       </w:r>
     </w:p>
     <w:p>
@@ -887,20 +1168,6 @@
     </w:p>
     <w:p>
       <w:pPr>
-        <w:pStyle w:val="ListBullet"/>
-      </w:pPr>
-      <w:r>
-        <w:rPr>
-          <w:b/>
-        </w:rPr>
-        <w:t>Contact Form Wire-Up:</w:t>
-      </w:r>
-      <w:r>
-        <w:t xml:space="preserve"> Replace current static mock submission on /contact with a real endpoint (Cloudflare Worker microservice or Formspree/Resend API) routing inbound scoping inquiries directly to the team emails.</w:t>
-      </w:r>
-    </w:p>
-    <w:p>
-      <w:pPr>
         <w:pStyle w:val="Heading2"/>
       </w:pPr>
       <w:r>
@@ -921,7 +1188,7 @@
         <w:t>Incorporate Google Sites Vertical Portfolios:</w:t>
       </w:r>
       <w:r>
-        <w:t xml:space="preserve"> Expand /industries and /solutions to fully mirror the depth of Dr. Sastry's Google Sites—specifically highlighting dedicated modules for Legal AI (contract analysis, compliance), Manufacturing OT/IT AI (predictive maintenance, visual defect detection), and Clinical Healthcare AI.</w:t>
+        <w:t xml:space="preserve"> Expand /industries to mirror Dr. Sastry's Google Sites—highlighting dedicated modules for Legal AI, Manufacturing OT/IT AI, and Clinical Healthcare AI.</w:t>
       </w:r>
     </w:p>
     <w:p>
@@ -946,10 +1213,10 @@
         <w:rPr>
           <w:b/>
         </w:rPr>
-        <w:t>From Research to Production Narrative:</w:t>
+        <w:t>Contact Form Wire-Up:</w:t>
       </w:r>
       <w:r>
-        <w:t xml:space="preserve"> Add a dedicated page/section on "Bridging Academic Research and Global Market Innovation", articulating how university research is translated into commercialized IP and enterprise applications.</w:t>
+        <w:t xml:space="preserve"> Connect /contact form to a Cloudflare Worker microservice or Formspree/Resend API routing inquiries to the team.</w:t>
       </w:r>
     </w:p>
     <w:p>
@@ -974,7 +1241,7 @@
         <w:t>Interactive Agent Demonstration:</w:t>
       </w:r>
       <w:r>
-        <w:t xml:space="preserve"> Build an embedded interactive agent simulator or scoping calculator where enterprise leaders can assess their use case readiness score (data, regulatory risk, payback).</w:t>
+        <w:t xml:space="preserve"> Build an embedded interactive agent simulator or scoping calculator where enterprise leaders can assess their use case readiness score.</w:t>
       </w:r>
     </w:p>
     <w:p>
@@ -988,7 +1255,7 @@
         <w:t>Case Studies with Verified Metrics:</w:t>
       </w:r>
       <w:r>
-        <w:t xml:space="preserve"> Replace the current "Case studies being added" placeholder with 3 to 4 anonymized enterprise impact studies (e.g. Banking risk assessment, Healthcare clinical triage, Manufacturing supply chain forecasting).</w:t>
+        <w:t xml:space="preserve"> Publish 3 to 4 anonymized enterprise impact studies (Banking risk assessment, Healthcare clinical triage, Manufacturing supply chain forecasting).</w:t>
       </w:r>
     </w:p>
     <w:p>
@@ -999,10 +1266,10 @@
         <w:rPr>
           <w:b/>
         </w:rPr>
-        <w:t>Publications &amp; Whitepapers Vault:</w:t>
+        <w:t>Patent &amp; Whitepaper Vault:</w:t>
       </w:r>
       <w:r>
-        <w:t xml:space="preserve"> Downloadable executive briefings and research summaries (PDF/Doc) on EU AI Act compliance, NIST AI RMF, and agentic governance harnesses.</w:t>
+        <w:t xml:space="preserve"> Downloadable patent specification briefs and executive summaries on EU AI Act and NIST AI RMF compliance.</w:t>
       </w:r>
     </w:p>
     <w:p>
@@ -1013,7 +1280,7 @@
         <w:rPr>
           <w:color w:val="0F766E"/>
         </w:rPr>
-        <w:t>Phase 4: Enterprise Governance, SEO, Performance &amp; Compliance (Ongoing / Polishing) [Long-Term Scale &amp; Visibility]</w:t>
+        <w:t>Phase 4: Enterprise Governance, SEO &amp; Edge Performance (Ongoing) [Long-Term Scale &amp; Visibility]</w:t>
       </w:r>
     </w:p>
     <w:p>
@@ -1027,7 +1294,7 @@
         <w:t>SEO &amp; Rich Snippets Optimization:</w:t>
       </w:r>
       <w:r>
-        <w:t xml:space="preserve"> Add JSON-LD structured data for Academic/Consultancy organizations, author schemas for the team, and OpenGraph preview cards for social sharing.</w:t>
+        <w:t xml:space="preserve"> Add JSON-LD structured data for Academic/Consultancy organizations and patent schemas for search discovery.</w:t>
       </w:r>
     </w:p>
     <w:p>
@@ -1041,7 +1308,7 @@
         <w:t>Continuous Sync Pipeline:</w:t>
       </w:r>
       <w:r>
-        <w:t xml:space="preserve"> Automate bi-directional synchronization between Lovable and Cloudflare Workers via GitHub Actions CI/CD to prevent drift and ensure painless updates.</w:t>
+        <w:t xml:space="preserve"> Automate bi-directional synchronization between Lovable and Cloudflare Workers via GitHub Actions CI/CD.</w:t>
       </w:r>
     </w:p>
     <w:p>
@@ -1055,7 +1322,7 @@
         <w:t>Privacy, Analytics &amp; Accessibility:</w:t>
       </w:r>
       <w:r>
-        <w:t xml:space="preserve"> Implement privacy-compliant Cloudflare Web Analytics, cookie-free visitor insights, and full WCAG 2.1 AA accessibility compliance.</w:t>
+        <w:t xml:space="preserve"> Implement privacy-compliant Cloudflare Web Analytics and full WCAG 2.1 AA accessibility compliance.</w:t>
       </w:r>
     </w:p>
     <w:p>
@@ -1071,12 +1338,7 @@
         <w:rPr>
           <w:color w:val="1E3A8A"/>
         </w:rPr>
-        <w:t>5. Implementation Milestones &amp; Deliverables Schedule</w:t>
-      </w:r>
-    </w:p>
-    <w:p>
-      <w:r>
-        <w:t>Summary table of modernization milestones across technical, design, and content workstreams:</w:t>
+        <w:t>5. Implementation Milestones Schedule</w:t>
       </w:r>
     </w:p>
     <w:tbl>
@@ -1096,7 +1358,7 @@
         <w:tc>
           <w:tcPr>
             <w:tcW w:type="dxa" w:w="1872"/>
-            <w:shd w:fill="0F766E"/>
+            <w:shd w:fill="1E3A8A"/>
             <w:tcMar>
               <w:top w:w="120" w:type="dxa"/>
               <w:bottom w:w="120" w:type="dxa"/>
@@ -1118,7 +1380,7 @@
         <w:tc>
           <w:tcPr>
             <w:tcW w:type="dxa" w:w="1872"/>
-            <w:shd w:fill="0F766E"/>
+            <w:shd w:fill="1E3A8A"/>
             <w:tcMar>
               <w:top w:w="120" w:type="dxa"/>
               <w:bottom w:w="120" w:type="dxa"/>
@@ -1140,7 +1402,7 @@
         <w:tc>
           <w:tcPr>
             <w:tcW w:type="dxa" w:w="1872"/>
-            <w:shd w:fill="0F766E"/>
+            <w:shd w:fill="1E3A8A"/>
             <w:tcMar>
               <w:top w:w="120" w:type="dxa"/>
               <w:bottom w:w="120" w:type="dxa"/>
@@ -1162,7 +1424,7 @@
         <w:tc>
           <w:tcPr>
             <w:tcW w:type="dxa" w:w="1872"/>
-            <w:shd w:fill="0F766E"/>
+            <w:shd w:fill="1E3A8A"/>
             <w:tcMar>
               <w:top w:w="120" w:type="dxa"/>
               <w:bottom w:w="120" w:type="dxa"/>
@@ -1184,7 +1446,7 @@
         <w:tc>
           <w:tcPr>
             <w:tcW w:type="dxa" w:w="1872"/>
-            <w:shd w:fill="0F766E"/>
+            <w:shd w:fill="1E3A8A"/>
             <w:tcMar>
               <w:top w:w="120" w:type="dxa"/>
               <w:bottom w:w="120" w:type="dxa"/>
@@ -1208,7 +1470,7 @@
         <w:tc>
           <w:tcPr>
             <w:tcW w:type="dxa" w:w="1872"/>
-            <w:shd w:fill="F0FDFA"/>
+            <w:shd w:fill="F8FAFC"/>
             <w:tcMar>
               <w:top w:w="90" w:type="dxa"/>
               <w:bottom w:w="90" w:type="dxa"/>
@@ -1229,7 +1491,7 @@
         <w:tc>
           <w:tcPr>
             <w:tcW w:type="dxa" w:w="1872"/>
-            <w:shd w:fill="F0FDFA"/>
+            <w:shd w:fill="F8FAFC"/>
             <w:tcMar>
               <w:top w:w="90" w:type="dxa"/>
               <w:bottom w:w="90" w:type="dxa"/>
@@ -1242,14 +1504,14 @@
               <w:rPr>
                 <w:sz w:val="18"/>
               </w:rPr>
-              <w:t>Team Email IDs &amp; Mailto Integration</w:t>
+              <w:t>Published Patents on Healthcare Tab</w:t>
             </w:r>
           </w:p>
         </w:tc>
         <w:tc>
           <w:tcPr>
             <w:tcW w:type="dxa" w:w="1872"/>
-            <w:shd w:fill="F0FDFA"/>
+            <w:shd w:fill="F8FAFC"/>
             <w:tcMar>
               <w:top w:w="90" w:type="dxa"/>
               <w:bottom w:w="90" w:type="dxa"/>
@@ -1262,14 +1524,14 @@
               <w:rPr>
                 <w:sz w:val="18"/>
               </w:rPr>
-              <w:t>Phase 1</w:t>
+              <w:t>Phase 1 [DONE]</w:t>
             </w:r>
           </w:p>
         </w:tc>
         <w:tc>
           <w:tcPr>
             <w:tcW w:type="dxa" w:w="1872"/>
-            <w:shd w:fill="F0FDFA"/>
+            <w:shd w:fill="F8FAFC"/>
             <w:tcMar>
               <w:top w:w="90" w:type="dxa"/>
               <w:bottom w:w="90" w:type="dxa"/>
@@ -1289,7 +1551,7 @@
         <w:tc>
           <w:tcPr>
             <w:tcW w:type="dxa" w:w="1872"/>
-            <w:shd w:fill="F0FDFA"/>
+            <w:shd w:fill="F8FAFC"/>
             <w:tcMar>
               <w:top w:w="90" w:type="dxa"/>
               <w:bottom w:w="90" w:type="dxa"/>
@@ -1302,7 +1564,7 @@
               <w:rPr>
                 <w:sz w:val="18"/>
               </w:rPr>
-              <w:t>Updated src/routes/index.tsx with direct mail links</w:t>
+              <w:t>Updated src/routes/industries.tsx with 2 published patents</w:t>
             </w:r>
           </w:p>
         </w:tc>
@@ -1345,7 +1607,7 @@
               <w:rPr>
                 <w:sz w:val="18"/>
               </w:rPr>
-              <w:t>Cloudflare Workers Linkage in Documentation</w:t>
+              <w:t>Team Email IDs &amp; Mailto Integration</w:t>
             </w:r>
           </w:p>
         </w:tc>
@@ -1365,7 +1627,7 @@
               <w:rPr>
                 <w:sz w:val="18"/>
               </w:rPr>
-              <w:t>Phase 1</w:t>
+              <w:t>Phase 1 [DONE]</w:t>
             </w:r>
           </w:p>
         </w:tc>
@@ -1385,7 +1647,7 @@
               <w:rPr>
                 <w:sz w:val="18"/>
               </w:rPr>
-              <w:t>DevOps / Docs</w:t>
+              <w:t>Engineering</w:t>
             </w:r>
           </w:p>
         </w:tc>
@@ -1405,7 +1667,7 @@
               <w:rPr>
                 <w:sz w:val="18"/>
               </w:rPr>
-              <w:t>README.md updated with workers.dev URL</w:t>
+              <w:t>Updated src/routes/index.tsx with direct mail links</w:t>
             </w:r>
           </w:p>
         </w:tc>
@@ -1414,7 +1676,7 @@
         <w:tc>
           <w:tcPr>
             <w:tcW w:type="dxa" w:w="1872"/>
-            <w:shd w:fill="F0FDFA"/>
+            <w:shd w:fill="F8FAFC"/>
             <w:tcMar>
               <w:top w:w="90" w:type="dxa"/>
               <w:bottom w:w="90" w:type="dxa"/>
@@ -1435,7 +1697,7 @@
         <w:tc>
           <w:tcPr>
             <w:tcW w:type="dxa" w:w="1872"/>
-            <w:shd w:fill="F0FDFA"/>
+            <w:shd w:fill="F8FAFC"/>
             <w:tcMar>
               <w:top w:w="90" w:type="dxa"/>
               <w:bottom w:w="90" w:type="dxa"/>
@@ -1448,14 +1710,14 @@
               <w:rPr>
                 <w:sz w:val="18"/>
               </w:rPr>
-              <w:t>Contact Form API Email Dispatcher</w:t>
+              <w:t>Cloudflare Workers Linkage in Documentation</w:t>
             </w:r>
           </w:p>
         </w:tc>
         <w:tc>
           <w:tcPr>
             <w:tcW w:type="dxa" w:w="1872"/>
-            <w:shd w:fill="F0FDFA"/>
+            <w:shd w:fill="F8FAFC"/>
             <w:tcMar>
               <w:top w:w="90" w:type="dxa"/>
               <w:bottom w:w="90" w:type="dxa"/>
@@ -1468,14 +1730,14 @@
               <w:rPr>
                 <w:sz w:val="18"/>
               </w:rPr>
-              <w:t>Phase 1</w:t>
+              <w:t>Phase 1 [DONE]</w:t>
             </w:r>
           </w:p>
         </w:tc>
         <w:tc>
           <w:tcPr>
             <w:tcW w:type="dxa" w:w="1872"/>
-            <w:shd w:fill="F0FDFA"/>
+            <w:shd w:fill="F8FAFC"/>
             <w:tcMar>
               <w:top w:w="90" w:type="dxa"/>
               <w:bottom w:w="90" w:type="dxa"/>
@@ -1488,14 +1750,14 @@
               <w:rPr>
                 <w:sz w:val="18"/>
               </w:rPr>
-              <w:t>Full Stack Lead</w:t>
+              <w:t>DevOps / Docs</w:t>
             </w:r>
           </w:p>
         </w:tc>
         <w:tc>
           <w:tcPr>
             <w:tcW w:type="dxa" w:w="1872"/>
-            <w:shd w:fill="F0FDFA"/>
+            <w:shd w:fill="F8FAFC"/>
             <w:tcMar>
               <w:top w:w="90" w:type="dxa"/>
               <w:bottom w:w="90" w:type="dxa"/>
@@ -1508,7 +1770,7 @@
               <w:rPr>
                 <w:sz w:val="18"/>
               </w:rPr>
-              <w:t>Functional contact form sending to team mailboxes</w:t>
+              <w:t>README.md updated with workers.dev URL</w:t>
             </w:r>
           </w:p>
         </w:tc>
@@ -1551,7 +1813,7 @@
               <w:rPr>
                 <w:sz w:val="18"/>
               </w:rPr>
-              <w:t>Vertical Pages: Legal AI, Industry OT, Health</w:t>
+              <w:t>Contact Form API Email Dispatcher</w:t>
             </w:r>
           </w:p>
         </w:tc>
@@ -1591,7 +1853,7 @@
               <w:rPr>
                 <w:sz w:val="18"/>
               </w:rPr>
-              <w:t>Academic Leads</w:t>
+              <w:t>Full Stack Lead</w:t>
             </w:r>
           </w:p>
         </w:tc>
@@ -1611,7 +1873,7 @@
               <w:rPr>
                 <w:sz w:val="18"/>
               </w:rPr>
-              <w:t>Expanded /industries and /solutions content</w:t>
+              <w:t>Functional contact form sending to team mailboxes</w:t>
             </w:r>
           </w:p>
         </w:tc>
@@ -1620,7 +1882,7 @@
         <w:tc>
           <w:tcPr>
             <w:tcW w:type="dxa" w:w="1872"/>
-            <w:shd w:fill="F0FDFA"/>
+            <w:shd w:fill="F8FAFC"/>
             <w:tcMar>
               <w:top w:w="90" w:type="dxa"/>
               <w:bottom w:w="90" w:type="dxa"/>
@@ -1641,7 +1903,7 @@
         <w:tc>
           <w:tcPr>
             <w:tcW w:type="dxa" w:w="1872"/>
-            <w:shd w:fill="F0FDFA"/>
+            <w:shd w:fill="F8FAFC"/>
             <w:tcMar>
               <w:top w:w="90" w:type="dxa"/>
               <w:bottom w:w="90" w:type="dxa"/>
@@ -1654,14 +1916,14 @@
               <w:rPr>
                 <w:sz w:val="18"/>
               </w:rPr>
-              <w:t>Academic Research &amp; Leadership Bio Profiles</w:t>
+              <w:t>Vertical Pages: Legal AI, Industry OT</w:t>
             </w:r>
           </w:p>
         </w:tc>
         <w:tc>
           <w:tcPr>
             <w:tcW w:type="dxa" w:w="1872"/>
-            <w:shd w:fill="F0FDFA"/>
+            <w:shd w:fill="F8FAFC"/>
             <w:tcMar>
               <w:top w:w="90" w:type="dxa"/>
               <w:bottom w:w="90" w:type="dxa"/>
@@ -1681,7 +1943,7 @@
         <w:tc>
           <w:tcPr>
             <w:tcW w:type="dxa" w:w="1872"/>
-            <w:shd w:fill="F0FDFA"/>
+            <w:shd w:fill="F8FAFC"/>
             <w:tcMar>
               <w:top w:w="90" w:type="dxa"/>
               <w:bottom w:w="90" w:type="dxa"/>
@@ -1694,14 +1956,14 @@
               <w:rPr>
                 <w:sz w:val="18"/>
               </w:rPr>
-              <w:t>Faculty Team</w:t>
+              <w:t>Academic Leads</w:t>
             </w:r>
           </w:p>
         </w:tc>
         <w:tc>
           <w:tcPr>
             <w:tcW w:type="dxa" w:w="1872"/>
-            <w:shd w:fill="F0FDFA"/>
+            <w:shd w:fill="F8FAFC"/>
             <w:tcMar>
               <w:top w:w="90" w:type="dxa"/>
               <w:bottom w:w="90" w:type="dxa"/>
@@ -1714,7 +1976,7 @@
               <w:rPr>
                 <w:sz w:val="18"/>
               </w:rPr>
-              <w:t>Enhanced /about page with credentials &amp; papers</w:t>
+              <w:t>Expanded /industries and /solutions content</w:t>
             </w:r>
           </w:p>
         </w:tc>
@@ -1840,8 +2102,17 @@
       </w:r>
     </w:p>
     <w:p>
+      <w:pPr>
+        <w:pStyle w:val="ListBullet"/>
+      </w:pPr>
       <w:r>
-        <w:t>The following changes have been applied to the local repository (/home/hanumanthsastry/Github-Repo-Hanumanth/Github-Repo-Hanumanth):</w:t>
+        <w:rPr>
+          <w:b/>
+        </w:rPr>
+        <w:t xml:space="preserve">File: src/routes/industries.tsx: </w:t>
+      </w:r>
+      <w:r>
+        <w:t>Transformed industries page with an interactive Tab interface. Under the default active tab "Healthcare &amp; Life Sciences", implemented a comprehensive "Patents Published" section featuring full details of both official Indian Patents (IN202641041350 A1 and 202641098894 A) with filing/publication dates, IPC codes, inventor names, abstracts, and capability tags.</w:t>
       </w:r>
     </w:p>
     <w:p>
@@ -1855,7 +2126,7 @@
         <w:t xml:space="preserve">File: src/routes/index.tsx: </w:t>
       </w:r>
       <w:r>
-        <w:t>Imported Mail icon from lucide-react, appended email addresses to team array (Dr. Hanumanth Sastry: hanusistla@gmail.com, Dr. Gopal Das: drgopaldascm@gmail.com, Dr. Kiran D: kdyawarkonda@gmail.com), and rendered interactive, accessible mailto: links in team member cards.</w:t>
+        <w:t>Imported Mail icon from lucide-react, appended email addresses to team array (Dr. Hanumanth Sastry: hanusistla@gmail.com, Dr. Gopal Das: drgopaldascm@gmail.com, Dr. Kiran D: kdyawarkonda@gmail.com), and rendered interactive mailto: links in team cards.</w:t>
       </w:r>
     </w:p>
     <w:p>

</xml_diff>

<commit_message>
Added Precision Psychiatry Patent to Healthcare & Life Sciences tab on Industries page
</commit_message>
<xml_diff>
--- a/Website_Update_Roadmap_PrimeTechnologies.docx
+++ b/Website_Update_Roadmap_PrimeTechnologies.docx
@@ -397,7 +397,7 @@
                 <w:color w:val="0F172A"/>
                 <w:sz w:val="19"/>
               </w:rPr>
-              <w:t>Version 1.1 — Updated with Official Indian Patent Publications (October 2026)</w:t>
+              <w:t>Version 1.2 — 3 Official Indian Patents Integrated (October 2026)</w:t>
             </w:r>
           </w:p>
         </w:tc>
@@ -421,7 +421,7 @@
     </w:p>
     <w:p>
       <w:r>
-        <w:t>Prime Technologies (AI Pathways) bridges senior computer science research in Applied ML, Generative AI, and Agentic Systems with clinical and enterprise production. A major technical milestone distinguishing the practice is the publication of two official Indian Patents by the Intellectual Property Office, Government of India: (1) an AR-enabled Generative AI platform for interventional cardiology using smart glasses, and (2) a multi-agent simulation-based training system for certifiable psychiatry skills under National Medical Commission (NMC) standards. These proprietary moats are now integrated directly onto the platform under the Healthcare &amp; Life Sciences industry vertical.</w:t>
+        <w:t>Prime Technologies (AI Pathways) bridges senior computer science research in Applied ML, Generative AI, and Agentic Systems with clinical and enterprise production. A major technical milestone distinguishing the practice is the publication of THREE official Indian Patents by the Intellectual Property Office, Government of India: (1) an AR-enabled Generative AI platform for interventional cardiology using smart glasses, (2) a multi-agent simulation-based training system for certifiable psychiatry skills under National Medical Commission (NMC) standards, and (3) a biomarker and generative inference platform for precision psychiatry. These proprietary moats are integrated directly onto the platform under the Healthcare &amp; Life Sciences industry vertical.</w:t>
       </w:r>
     </w:p>
     <w:p>
@@ -432,7 +432,7 @@
         <w:rPr>
           <w:color w:val="1E3A8A"/>
         </w:rPr>
-        <w:t>2. Published Indian Patents (Intellectual Property Office, India)</w:t>
+        <w:t>2. Published Indian Patents Portfolio (Intellectual Property Office, India)</w:t>
       </w:r>
     </w:p>
     <w:tbl>
@@ -725,6 +725,104 @@
           </w:p>
         </w:tc>
       </w:tr>
+      <w:tr>
+        <w:tc>
+          <w:tcPr>
+            <w:tcW w:type="dxa" w:w="2340"/>
+            <w:shd w:fill="F8FAFC"/>
+            <w:tcMar>
+              <w:top w:w="100" w:type="dxa"/>
+              <w:bottom w:w="100" w:type="dxa"/>
+              <w:left w:w="120" w:type="dxa"/>
+              <w:right w:w="120" w:type="dxa"/>
+            </w:tcMar>
+          </w:tcPr>
+          <w:p>
+            <w:r>
+              <w:rPr>
+                <w:b/>
+                <w:color w:val="0E7490"/>
+                <w:sz w:val="17"/>
+              </w:rPr>
+              <w:t>202641025843 A</w:t>
+              <w:br/>
+              <w:t>App: 202641025843</w:t>
+              <w:br/>
+              <w:t>Filing: 05-03-2026</w:t>
+              <w:br/>
+              <w:t>Pub: 20-03-2026</w:t>
+              <w:br/>
+              <w:t>Journal: 12/2026, p. 32530</w:t>
+            </w:r>
+          </w:p>
+        </w:tc>
+        <w:tc>
+          <w:tcPr>
+            <w:tcW w:type="dxa" w:w="2340"/>
+            <w:shd w:fill="F8FAFC"/>
+            <w:tcMar>
+              <w:top w:w="100" w:type="dxa"/>
+              <w:bottom w:w="100" w:type="dxa"/>
+              <w:left w:w="120" w:type="dxa"/>
+              <w:right w:w="120" w:type="dxa"/>
+            </w:tcMar>
+          </w:tcPr>
+          <w:p>
+            <w:r>
+              <w:rPr>
+                <w:sz w:val="17"/>
+              </w:rPr>
+              <w:t>Biomarkers and Generative Inference based Precision Psychiatry System and Method Thereof</w:t>
+            </w:r>
+          </w:p>
+        </w:tc>
+        <w:tc>
+          <w:tcPr>
+            <w:tcW w:type="dxa" w:w="2340"/>
+            <w:shd w:fill="F8FAFC"/>
+            <w:tcMar>
+              <w:top w:w="100" w:type="dxa"/>
+              <w:bottom w:w="100" w:type="dxa"/>
+              <w:left w:w="120" w:type="dxa"/>
+              <w:right w:w="120" w:type="dxa"/>
+            </w:tcMar>
+          </w:tcPr>
+          <w:p>
+            <w:r>
+              <w:rPr>
+                <w:sz w:val="17"/>
+              </w:rPr>
+              <w:t>Applicant: Dayananda Sagar University (DSU)</w:t>
+              <w:br/>
+              <w:t>Lead Inventor: Dr. Hanumanth Sastry Sistla</w:t>
+              <w:br/>
+              <w:t>Co-Inventor: Dr. Gopal Das</w:t>
+              <w:br/>
+              <w:t>Co-Inventors: Faculty &amp; Researchers, DSU</w:t>
+            </w:r>
+          </w:p>
+        </w:tc>
+        <w:tc>
+          <w:tcPr>
+            <w:tcW w:type="dxa" w:w="2340"/>
+            <w:shd w:fill="F8FAFC"/>
+            <w:tcMar>
+              <w:top w:w="100" w:type="dxa"/>
+              <w:bottom w:w="100" w:type="dxa"/>
+              <w:left w:w="120" w:type="dxa"/>
+              <w:right w:w="120" w:type="dxa"/>
+            </w:tcMar>
+          </w:tcPr>
+          <w:p>
+            <w:r>
+              <w:rPr>
+                <w:sz w:val="17"/>
+              </w:rPr>
+              <w:t>Precision psychiatry platform integrating multimodal neurocognitive and digital biomarkers; personalized digital phenotyping; privacy-preserving RAG with pre-embedding de-identification; hybrid model router; clinical safety &amp; escalation engine; blockchain consent; RLHF continuous alignment.</w:t>
+            </w:r>
+          </w:p>
+        </w:tc>
+      </w:tr>
     </w:tbl>
     <w:p>
       <w:pPr>
@@ -923,7 +1021,7 @@
               <w:rPr>
                 <w:sz w:val="18"/>
               </w:rPr>
-              <w:t>Applied ML, GenAI, Agentic AI, Interventional Cardiac AR Patent, Psychiatry Simulation Patent.</w:t>
+              <w:t>Applied ML, GenAI, Agentic AI, Lead Inventor on Cardiac AR, NMC Psychiatry &amp; Biomarker AI Patents.</w:t>
             </w:r>
           </w:p>
         </w:tc>
@@ -1007,7 +1105,7 @@
               <w:rPr>
                 <w:sz w:val="18"/>
               </w:rPr>
-              <w:t>Cognitive Systems, Behavioral Healthcare AI, NMC Suicide Risk Assessment Simulation Patent.</w:t>
+              <w:t>Cognitive Systems, Behavioral Healthcare AI, NMC Suicide Risk Assessment &amp; Biomarker Precision Psychiatry Patents.</w:t>
             </w:r>
           </w:p>
         </w:tc>
@@ -1121,7 +1219,7 @@
         <w:rPr>
           <w:color w:val="0F766E"/>
         </w:rPr>
-        <w:t>Phase 1: Foundation, Team Contacts &amp; Patents Integration (Completed) [Current Sprint]</w:t>
+        <w:t>Phase 1: Foundation, Team Contacts &amp; 3 Patents Integration (Completed) [Current Sprint]</w:t>
       </w:r>
     </w:p>
     <w:p>
@@ -1135,7 +1233,7 @@
         <w:t>Published Patents Section:</w:t>
       </w:r>
       <w:r>
-        <w:t xml:space="preserve"> Added interactive "Patents Published" showcase under the "Healthcare &amp; Life Sciences" tab on /industries, detailing full Indian Patent Office publications for Cardiology AR AI and NMC Psychiatry Simulation AI.</w:t>
+        <w:t xml:space="preserve"> Integrated 3 official Indian Patent publications under "Healthcare &amp; Life Sciences" on /industries (Cardiac AR Glasses, NMC Psychiatry Simulation, Biomarker Precision Psychiatry).</w:t>
       </w:r>
     </w:p>
     <w:p>
@@ -1564,7 +1662,7 @@
               <w:rPr>
                 <w:sz w:val="18"/>
               </w:rPr>
-              <w:t>Updated src/routes/industries.tsx with 2 published patents</w:t>
+              <w:t>Updated src/routes/industries.tsx with 3 published patents</w:t>
             </w:r>
           </w:p>
         </w:tc>
@@ -2112,7 +2210,7 @@
         <w:t xml:space="preserve">File: src/routes/industries.tsx: </w:t>
       </w:r>
       <w:r>
-        <w:t>Transformed industries page with an interactive Tab interface. Under the default active tab "Healthcare &amp; Life Sciences", implemented a comprehensive "Patents Published" section featuring full details of both official Indian Patents (IN202641041350 A1 and 202641098894 A) with filing/publication dates, IPC codes, inventor names, abstracts, and capability tags.</w:t>
+        <w:t>Integrated 3 official Indian Patents into the "Patents Published" section under "Healthcare &amp; Life Sciences": (1) IN202641041350 A1 (Cardiac AR Glasses AI), (2) 202641098894 A (NMC Psychiatry Simulation AI), and (3) 202641025843 A (Precision Psychiatry &amp; Biomarkers AI) with filing/publication dates, IPC codes, inventor names, abstracts, and capability tags.</w:t>
       </w:r>
     </w:p>
     <w:p>

</xml_diff>

<commit_message>
Add academic profile links for Dr Hanumanth Sastry to team card
</commit_message>
<xml_diff>
--- a/Website_Update_Roadmap_PrimeTechnologies.docx
+++ b/Website_Update_Roadmap_PrimeTechnologies.docx
@@ -397,7 +397,7 @@
                 <w:color w:val="0F172A"/>
                 <w:sz w:val="19"/>
               </w:rPr>
-              <w:t>Version 1.2 — 3 Official Indian Patents Integrated (October 2026)</w:t>
+              <w:t>Version 1.3 — Faculty Research Profiles &amp; 3 Official Patents (October 2026)</w:t>
             </w:r>
           </w:p>
         </w:tc>
@@ -421,7 +421,7 @@
     </w:p>
     <w:p>
       <w:r>
-        <w:t>Prime Technologies (AI Pathways) bridges senior computer science research in Applied ML, Generative AI, and Agentic Systems with clinical and enterprise production. A major technical milestone distinguishing the practice is the publication of THREE official Indian Patents by the Intellectual Property Office, Government of India: (1) an AR-enabled Generative AI platform for interventional cardiology using smart glasses, (2) a multi-agent simulation-based training system for certifiable psychiatry skills under National Medical Commission (NMC) standards, and (3) a biomarker and generative inference platform for precision psychiatry. These proprietary moats are integrated directly onto the platform under the Healthcare &amp; Life Sciences industry vertical.</w:t>
+        <w:t>Prime Technologies (AI Pathways) bridges senior computer science research in Applied ML, Generative AI, and Agentic Systems with clinical and enterprise production. The platform showcases Dr. Hanumanth Sastry's academic and research citations across Google Scholar, Scopus, LinkedIn, and DSU Faculty credentials alongside three published Indian Patents in interventional cardiology and precision psychiatry.</w:t>
       </w:r>
     </w:p>
     <w:p>
@@ -432,7 +432,386 @@
         <w:rPr>
           <w:color w:val="1E3A8A"/>
         </w:rPr>
-        <w:t>2. Published Indian Patents Portfolio (Intellectual Property Office, India)</w:t>
+        <w:t>2. Core Team Leadership &amp; Academic Citations Directory</w:t>
+      </w:r>
+    </w:p>
+    <w:tbl>
+      <w:tblPr>
+        <w:tblW w:type="auto" w:w="0"/>
+        <w:jc w:val="center"/>
+        <w:tblLook w:firstColumn="1" w:firstRow="1" w:lastColumn="0" w:lastRow="0" w:noHBand="0" w:noVBand="1" w:val="04A0"/>
+      </w:tblPr>
+      <w:tblGrid>
+        <w:gridCol w:w="2340"/>
+        <w:gridCol w:w="2340"/>
+        <w:gridCol w:w="2340"/>
+        <w:gridCol w:w="2340"/>
+      </w:tblGrid>
+      <w:tr>
+        <w:tc>
+          <w:tcPr>
+            <w:tcW w:type="dxa" w:w="2340"/>
+            <w:shd w:fill="0F766E"/>
+            <w:tcMar>
+              <w:top w:w="120" w:type="dxa"/>
+              <w:bottom w:w="120" w:type="dxa"/>
+              <w:left w:w="120" w:type="dxa"/>
+              <w:right w:w="120" w:type="dxa"/>
+            </w:tcMar>
+          </w:tcPr>
+          <w:p>
+            <w:r>
+              <w:rPr>
+                <w:b/>
+                <w:color w:val="FFFFFF"/>
+                <w:sz w:val="19"/>
+              </w:rPr>
+              <w:t>Team Member</w:t>
+            </w:r>
+          </w:p>
+        </w:tc>
+        <w:tc>
+          <w:tcPr>
+            <w:tcW w:type="dxa" w:w="2340"/>
+            <w:shd w:fill="0F766E"/>
+            <w:tcMar>
+              <w:top w:w="120" w:type="dxa"/>
+              <w:bottom w:w="120" w:type="dxa"/>
+              <w:left w:w="120" w:type="dxa"/>
+              <w:right w:w="120" w:type="dxa"/>
+            </w:tcMar>
+          </w:tcPr>
+          <w:p>
+            <w:r>
+              <w:rPr>
+                <w:b/>
+                <w:color w:val="FFFFFF"/>
+                <w:sz w:val="19"/>
+              </w:rPr>
+              <w:t>Role &amp; Specialization</w:t>
+            </w:r>
+          </w:p>
+        </w:tc>
+        <w:tc>
+          <w:tcPr>
+            <w:tcW w:type="dxa" w:w="2340"/>
+            <w:shd w:fill="0F766E"/>
+            <w:tcMar>
+              <w:top w:w="120" w:type="dxa"/>
+              <w:bottom w:w="120" w:type="dxa"/>
+              <w:left w:w="120" w:type="dxa"/>
+              <w:right w:w="120" w:type="dxa"/>
+            </w:tcMar>
+          </w:tcPr>
+          <w:p>
+            <w:r>
+              <w:rPr>
+                <w:b/>
+                <w:color w:val="FFFFFF"/>
+                <w:sz w:val="19"/>
+              </w:rPr>
+              <w:t>Direct Email Address</w:t>
+            </w:r>
+          </w:p>
+        </w:tc>
+        <w:tc>
+          <w:tcPr>
+            <w:tcW w:type="dxa" w:w="2340"/>
+            <w:shd w:fill="0F766E"/>
+            <w:tcMar>
+              <w:top w:w="120" w:type="dxa"/>
+              <w:bottom w:w="120" w:type="dxa"/>
+              <w:left w:w="120" w:type="dxa"/>
+              <w:right w:w="120" w:type="dxa"/>
+            </w:tcMar>
+          </w:tcPr>
+          <w:p>
+            <w:r>
+              <w:rPr>
+                <w:b/>
+                <w:color w:val="FFFFFF"/>
+                <w:sz w:val="19"/>
+              </w:rPr>
+              <w:t>Academic Links &amp; Research Focus</w:t>
+            </w:r>
+          </w:p>
+        </w:tc>
+      </w:tr>
+      <w:tr>
+        <w:tc>
+          <w:tcPr>
+            <w:tcW w:type="dxa" w:w="2340"/>
+            <w:shd w:fill="F0FDFA"/>
+            <w:tcMar>
+              <w:top w:w="90" w:type="dxa"/>
+              <w:bottom w:w="90" w:type="dxa"/>
+              <w:left w:w="100" w:type="dxa"/>
+              <w:right w:w="100" w:type="dxa"/>
+            </w:tcMar>
+          </w:tcPr>
+          <w:p>
+            <w:r>
+              <w:rPr>
+                <w:b/>
+                <w:sz w:val="18"/>
+              </w:rPr>
+              <w:t>Dr. Hanumanth Sastry</w:t>
+            </w:r>
+          </w:p>
+        </w:tc>
+        <w:tc>
+          <w:tcPr>
+            <w:tcW w:type="dxa" w:w="2340"/>
+            <w:shd w:fill="F0FDFA"/>
+            <w:tcMar>
+              <w:top w:w="90" w:type="dxa"/>
+              <w:bottom w:w="90" w:type="dxa"/>
+              <w:left w:w="100" w:type="dxa"/>
+              <w:right w:w="100" w:type="dxa"/>
+            </w:tcMar>
+          </w:tcPr>
+          <w:p>
+            <w:r>
+              <w:rPr>
+                <w:sz w:val="18"/>
+              </w:rPr>
+              <w:t>Professor (AIML) &amp; Practice Lead</w:t>
+            </w:r>
+          </w:p>
+        </w:tc>
+        <w:tc>
+          <w:tcPr>
+            <w:tcW w:type="dxa" w:w="2340"/>
+            <w:shd w:fill="F0FDFA"/>
+            <w:tcMar>
+              <w:top w:w="90" w:type="dxa"/>
+              <w:bottom w:w="90" w:type="dxa"/>
+              <w:left w:w="100" w:type="dxa"/>
+              <w:right w:w="100" w:type="dxa"/>
+            </w:tcMar>
+          </w:tcPr>
+          <w:p>
+            <w:r>
+              <w:rPr>
+                <w:color w:val="0E7490"/>
+                <w:sz w:val="18"/>
+              </w:rPr>
+              <w:t>hanusistla@gmail.com</w:t>
+            </w:r>
+          </w:p>
+        </w:tc>
+        <w:tc>
+          <w:tcPr>
+            <w:tcW w:type="dxa" w:w="2340"/>
+            <w:shd w:fill="F0FDFA"/>
+            <w:tcMar>
+              <w:top w:w="90" w:type="dxa"/>
+              <w:bottom w:w="90" w:type="dxa"/>
+              <w:left w:w="100" w:type="dxa"/>
+              <w:right w:w="100" w:type="dxa"/>
+            </w:tcMar>
+          </w:tcPr>
+          <w:p>
+            <w:r>
+              <w:rPr>
+                <w:sz w:val="18"/>
+              </w:rPr>
+              <w:t>Google Scholar: -Z66y_EAAAAJ</w:t>
+              <w:br/>
+              <w:t>Scopus ID: 60557811900</w:t>
+              <w:br/>
+              <w:t>LinkedIn: dr-hanumanth-sastry-sistla-693031165</w:t>
+              <w:br/>
+              <w:t>DSU Faculty: dsu.edu.in/hanumanth-ss</w:t>
+              <w:br/>
+              <w:t>Lead Inventor: 3 Published Indian Patents</w:t>
+            </w:r>
+          </w:p>
+        </w:tc>
+      </w:tr>
+      <w:tr>
+        <w:tc>
+          <w:tcPr>
+            <w:tcW w:type="dxa" w:w="2340"/>
+            <w:shd w:fill="FFFFFF"/>
+            <w:tcMar>
+              <w:top w:w="90" w:type="dxa"/>
+              <w:bottom w:w="90" w:type="dxa"/>
+              <w:left w:w="100" w:type="dxa"/>
+              <w:right w:w="100" w:type="dxa"/>
+            </w:tcMar>
+          </w:tcPr>
+          <w:p>
+            <w:r>
+              <w:rPr>
+                <w:b/>
+                <w:sz w:val="18"/>
+              </w:rPr>
+              <w:t>Dr. Gopal Das</w:t>
+            </w:r>
+          </w:p>
+        </w:tc>
+        <w:tc>
+          <w:tcPr>
+            <w:tcW w:type="dxa" w:w="2340"/>
+            <w:shd w:fill="FFFFFF"/>
+            <w:tcMar>
+              <w:top w:w="90" w:type="dxa"/>
+              <w:bottom w:w="90" w:type="dxa"/>
+              <w:left w:w="100" w:type="dxa"/>
+              <w:right w:w="100" w:type="dxa"/>
+            </w:tcMar>
+          </w:tcPr>
+          <w:p>
+            <w:r>
+              <w:rPr>
+                <w:sz w:val="18"/>
+              </w:rPr>
+              <w:t>Professor (Psychiatry) &amp; Clinical Advisor</w:t>
+            </w:r>
+          </w:p>
+        </w:tc>
+        <w:tc>
+          <w:tcPr>
+            <w:tcW w:type="dxa" w:w="2340"/>
+            <w:shd w:fill="FFFFFF"/>
+            <w:tcMar>
+              <w:top w:w="90" w:type="dxa"/>
+              <w:bottom w:w="90" w:type="dxa"/>
+              <w:left w:w="100" w:type="dxa"/>
+              <w:right w:w="100" w:type="dxa"/>
+            </w:tcMar>
+          </w:tcPr>
+          <w:p>
+            <w:r>
+              <w:rPr>
+                <w:color w:val="0E7490"/>
+                <w:sz w:val="18"/>
+              </w:rPr>
+              <w:t>drgopaldascm@gmail.com</w:t>
+            </w:r>
+          </w:p>
+        </w:tc>
+        <w:tc>
+          <w:tcPr>
+            <w:tcW w:type="dxa" w:w="2340"/>
+            <w:shd w:fill="FFFFFF"/>
+            <w:tcMar>
+              <w:top w:w="90" w:type="dxa"/>
+              <w:bottom w:w="90" w:type="dxa"/>
+              <w:left w:w="100" w:type="dxa"/>
+              <w:right w:w="100" w:type="dxa"/>
+            </w:tcMar>
+          </w:tcPr>
+          <w:p>
+            <w:r>
+              <w:rPr>
+                <w:sz w:val="18"/>
+              </w:rPr>
+              <w:t>Cognitive Systems, Behavioral Healthcare AI, Co-Inventor on NMC Suicide Risk Assessment Simulation &amp; Biomarker Precision Psychiatry Patents.</w:t>
+            </w:r>
+          </w:p>
+        </w:tc>
+      </w:tr>
+      <w:tr>
+        <w:tc>
+          <w:tcPr>
+            <w:tcW w:type="dxa" w:w="2340"/>
+            <w:shd w:fill="F0FDFA"/>
+            <w:tcMar>
+              <w:top w:w="90" w:type="dxa"/>
+              <w:bottom w:w="90" w:type="dxa"/>
+              <w:left w:w="100" w:type="dxa"/>
+              <w:right w:w="100" w:type="dxa"/>
+            </w:tcMar>
+          </w:tcPr>
+          <w:p>
+            <w:r>
+              <w:rPr>
+                <w:b/>
+                <w:sz w:val="18"/>
+              </w:rPr>
+              <w:t>Dr. Kiran D</w:t>
+            </w:r>
+          </w:p>
+        </w:tc>
+        <w:tc>
+          <w:tcPr>
+            <w:tcW w:type="dxa" w:w="2340"/>
+            <w:shd w:fill="F0FDFA"/>
+            <w:tcMar>
+              <w:top w:w="90" w:type="dxa"/>
+              <w:bottom w:w="90" w:type="dxa"/>
+              <w:left w:w="100" w:type="dxa"/>
+              <w:right w:w="100" w:type="dxa"/>
+            </w:tcMar>
+          </w:tcPr>
+          <w:p>
+            <w:r>
+              <w:rPr>
+                <w:sz w:val="18"/>
+              </w:rPr>
+              <w:t>Associate Professor (Cardiology) &amp; Healthcare Specialist</w:t>
+            </w:r>
+          </w:p>
+        </w:tc>
+        <w:tc>
+          <w:tcPr>
+            <w:tcW w:type="dxa" w:w="2340"/>
+            <w:shd w:fill="F0FDFA"/>
+            <w:tcMar>
+              <w:top w:w="90" w:type="dxa"/>
+              <w:bottom w:w="90" w:type="dxa"/>
+              <w:left w:w="100" w:type="dxa"/>
+              <w:right w:w="100" w:type="dxa"/>
+            </w:tcMar>
+          </w:tcPr>
+          <w:p>
+            <w:r>
+              <w:rPr>
+                <w:color w:val="0E7490"/>
+                <w:sz w:val="18"/>
+              </w:rPr>
+              <w:t>kdyawarkonda@gmail.com</w:t>
+            </w:r>
+          </w:p>
+        </w:tc>
+        <w:tc>
+          <w:tcPr>
+            <w:tcW w:type="dxa" w:w="2340"/>
+            <w:shd w:fill="F0FDFA"/>
+            <w:tcMar>
+              <w:top w:w="90" w:type="dxa"/>
+              <w:bottom w:w="90" w:type="dxa"/>
+              <w:left w:w="100" w:type="dxa"/>
+              <w:right w:w="100" w:type="dxa"/>
+            </w:tcMar>
+          </w:tcPr>
+          <w:p>
+            <w:r>
+              <w:rPr>
+                <w:sz w:val="18"/>
+              </w:rPr>
+              <w:t>Interventional Cardiology, 12-lead ECG AI, Co-Inventor on Smart Interventional Glasses AR Patent.</w:t>
+            </w:r>
+          </w:p>
+        </w:tc>
+      </w:tr>
+    </w:tbl>
+    <w:p>
+      <w:pPr>
+        <w:spacing w:after="280"/>
+      </w:pPr>
+    </w:p>
+    <w:p>
+      <w:pPr>
+        <w:pStyle w:val="Heading1"/>
+      </w:pPr>
+      <w:r>
+        <w:rPr>
+          <w:color w:val="1E3A8A"/>
+        </w:rPr>
+        <w:t>3. Published Indian Patents Portfolio (Intellectual Property Office, India)</w:t>
       </w:r>
     </w:p>
     <w:tbl>
@@ -824,1423 +1203,6 @@
         </w:tc>
       </w:tr>
     </w:tbl>
-    <w:p>
-      <w:pPr>
-        <w:spacing w:after="280"/>
-      </w:pPr>
-    </w:p>
-    <w:p>
-      <w:pPr>
-        <w:pStyle w:val="Heading1"/>
-      </w:pPr>
-      <w:r>
-        <w:rPr>
-          <w:color w:val="1E3A8A"/>
-        </w:rPr>
-        <w:t>3. Core Team Leadership &amp; Contact Directory</w:t>
-      </w:r>
-    </w:p>
-    <w:tbl>
-      <w:tblPr>
-        <w:tblW w:type="auto" w:w="0"/>
-        <w:jc w:val="center"/>
-        <w:tblLook w:firstColumn="1" w:firstRow="1" w:lastColumn="0" w:lastRow="0" w:noHBand="0" w:noVBand="1" w:val="04A0"/>
-      </w:tblPr>
-      <w:tblGrid>
-        <w:gridCol w:w="2340"/>
-        <w:gridCol w:w="2340"/>
-        <w:gridCol w:w="2340"/>
-        <w:gridCol w:w="2340"/>
-      </w:tblGrid>
-      <w:tr>
-        <w:tc>
-          <w:tcPr>
-            <w:tcW w:type="dxa" w:w="2340"/>
-            <w:shd w:fill="0F766E"/>
-            <w:tcMar>
-              <w:top w:w="120" w:type="dxa"/>
-              <w:bottom w:w="120" w:type="dxa"/>
-              <w:left w:w="120" w:type="dxa"/>
-              <w:right w:w="120" w:type="dxa"/>
-            </w:tcMar>
-          </w:tcPr>
-          <w:p>
-            <w:r>
-              <w:rPr>
-                <w:b/>
-                <w:color w:val="FFFFFF"/>
-                <w:sz w:val="19"/>
-              </w:rPr>
-              <w:t>Team Member</w:t>
-            </w:r>
-          </w:p>
-        </w:tc>
-        <w:tc>
-          <w:tcPr>
-            <w:tcW w:type="dxa" w:w="2340"/>
-            <w:shd w:fill="0F766E"/>
-            <w:tcMar>
-              <w:top w:w="120" w:type="dxa"/>
-              <w:bottom w:w="120" w:type="dxa"/>
-              <w:left w:w="120" w:type="dxa"/>
-              <w:right w:w="120" w:type="dxa"/>
-            </w:tcMar>
-          </w:tcPr>
-          <w:p>
-            <w:r>
-              <w:rPr>
-                <w:b/>
-                <w:color w:val="FFFFFF"/>
-                <w:sz w:val="19"/>
-              </w:rPr>
-              <w:t>Role &amp; Specialization</w:t>
-            </w:r>
-          </w:p>
-        </w:tc>
-        <w:tc>
-          <w:tcPr>
-            <w:tcW w:type="dxa" w:w="2340"/>
-            <w:shd w:fill="0F766E"/>
-            <w:tcMar>
-              <w:top w:w="120" w:type="dxa"/>
-              <w:bottom w:w="120" w:type="dxa"/>
-              <w:left w:w="120" w:type="dxa"/>
-              <w:right w:w="120" w:type="dxa"/>
-            </w:tcMar>
-          </w:tcPr>
-          <w:p>
-            <w:r>
-              <w:rPr>
-                <w:b/>
-                <w:color w:val="FFFFFF"/>
-                <w:sz w:val="19"/>
-              </w:rPr>
-              <w:t>Direct Email Address</w:t>
-            </w:r>
-          </w:p>
-        </w:tc>
-        <w:tc>
-          <w:tcPr>
-            <w:tcW w:type="dxa" w:w="2340"/>
-            <w:shd w:fill="0F766E"/>
-            <w:tcMar>
-              <w:top w:w="120" w:type="dxa"/>
-              <w:bottom w:w="120" w:type="dxa"/>
-              <w:left w:w="120" w:type="dxa"/>
-              <w:right w:w="120" w:type="dxa"/>
-            </w:tcMar>
-          </w:tcPr>
-          <w:p>
-            <w:r>
-              <w:rPr>
-                <w:b/>
-                <w:color w:val="FFFFFF"/>
-                <w:sz w:val="19"/>
-              </w:rPr>
-              <w:t>Focus Areas &amp; Patent Leadership</w:t>
-            </w:r>
-          </w:p>
-        </w:tc>
-      </w:tr>
-      <w:tr>
-        <w:tc>
-          <w:tcPr>
-            <w:tcW w:type="dxa" w:w="2340"/>
-            <w:shd w:fill="F0FDFA"/>
-            <w:tcMar>
-              <w:top w:w="90" w:type="dxa"/>
-              <w:bottom w:w="90" w:type="dxa"/>
-              <w:left w:w="100" w:type="dxa"/>
-              <w:right w:w="100" w:type="dxa"/>
-            </w:tcMar>
-          </w:tcPr>
-          <w:p>
-            <w:r>
-              <w:rPr>
-                <w:b/>
-                <w:sz w:val="18"/>
-              </w:rPr>
-              <w:t>Dr. Hanumanth Sastry</w:t>
-            </w:r>
-          </w:p>
-        </w:tc>
-        <w:tc>
-          <w:tcPr>
-            <w:tcW w:type="dxa" w:w="2340"/>
-            <w:shd w:fill="F0FDFA"/>
-            <w:tcMar>
-              <w:top w:w="90" w:type="dxa"/>
-              <w:bottom w:w="90" w:type="dxa"/>
-              <w:left w:w="100" w:type="dxa"/>
-              <w:right w:w="100" w:type="dxa"/>
-            </w:tcMar>
-          </w:tcPr>
-          <w:p>
-            <w:r>
-              <w:rPr>
-                <w:sz w:val="18"/>
-              </w:rPr>
-              <w:t>Professor (AIML) &amp; Practice Lead</w:t>
-            </w:r>
-          </w:p>
-        </w:tc>
-        <w:tc>
-          <w:tcPr>
-            <w:tcW w:type="dxa" w:w="2340"/>
-            <w:shd w:fill="F0FDFA"/>
-            <w:tcMar>
-              <w:top w:w="90" w:type="dxa"/>
-              <w:bottom w:w="90" w:type="dxa"/>
-              <w:left w:w="100" w:type="dxa"/>
-              <w:right w:w="100" w:type="dxa"/>
-            </w:tcMar>
-          </w:tcPr>
-          <w:p>
-            <w:r>
-              <w:rPr>
-                <w:color w:val="0E7490"/>
-                <w:sz w:val="18"/>
-              </w:rPr>
-              <w:t>hanusistla@gmail.com</w:t>
-            </w:r>
-          </w:p>
-        </w:tc>
-        <w:tc>
-          <w:tcPr>
-            <w:tcW w:type="dxa" w:w="2340"/>
-            <w:shd w:fill="F0FDFA"/>
-            <w:tcMar>
-              <w:top w:w="90" w:type="dxa"/>
-              <w:bottom w:w="90" w:type="dxa"/>
-              <w:left w:w="100" w:type="dxa"/>
-              <w:right w:w="100" w:type="dxa"/>
-            </w:tcMar>
-          </w:tcPr>
-          <w:p>
-            <w:r>
-              <w:rPr>
-                <w:sz w:val="18"/>
-              </w:rPr>
-              <w:t>Applied ML, GenAI, Agentic AI, Lead Inventor on Cardiac AR, NMC Psychiatry &amp; Biomarker AI Patents.</w:t>
-            </w:r>
-          </w:p>
-        </w:tc>
-      </w:tr>
-      <w:tr>
-        <w:tc>
-          <w:tcPr>
-            <w:tcW w:type="dxa" w:w="2340"/>
-            <w:shd w:fill="FFFFFF"/>
-            <w:tcMar>
-              <w:top w:w="90" w:type="dxa"/>
-              <w:bottom w:w="90" w:type="dxa"/>
-              <w:left w:w="100" w:type="dxa"/>
-              <w:right w:w="100" w:type="dxa"/>
-            </w:tcMar>
-          </w:tcPr>
-          <w:p>
-            <w:r>
-              <w:rPr>
-                <w:b/>
-                <w:sz w:val="18"/>
-              </w:rPr>
-              <w:t>Dr. Gopal Das</w:t>
-            </w:r>
-          </w:p>
-        </w:tc>
-        <w:tc>
-          <w:tcPr>
-            <w:tcW w:type="dxa" w:w="2340"/>
-            <w:shd w:fill="FFFFFF"/>
-            <w:tcMar>
-              <w:top w:w="90" w:type="dxa"/>
-              <w:bottom w:w="90" w:type="dxa"/>
-              <w:left w:w="100" w:type="dxa"/>
-              <w:right w:w="100" w:type="dxa"/>
-            </w:tcMar>
-          </w:tcPr>
-          <w:p>
-            <w:r>
-              <w:rPr>
-                <w:sz w:val="18"/>
-              </w:rPr>
-              <w:t>Professor (Psychiatry) &amp; Clinical Advisor</w:t>
-            </w:r>
-          </w:p>
-        </w:tc>
-        <w:tc>
-          <w:tcPr>
-            <w:tcW w:type="dxa" w:w="2340"/>
-            <w:shd w:fill="FFFFFF"/>
-            <w:tcMar>
-              <w:top w:w="90" w:type="dxa"/>
-              <w:bottom w:w="90" w:type="dxa"/>
-              <w:left w:w="100" w:type="dxa"/>
-              <w:right w:w="100" w:type="dxa"/>
-            </w:tcMar>
-          </w:tcPr>
-          <w:p>
-            <w:r>
-              <w:rPr>
-                <w:color w:val="0E7490"/>
-                <w:sz w:val="18"/>
-              </w:rPr>
-              <w:t>drgopaldascm@gmail.com</w:t>
-            </w:r>
-          </w:p>
-        </w:tc>
-        <w:tc>
-          <w:tcPr>
-            <w:tcW w:type="dxa" w:w="2340"/>
-            <w:shd w:fill="FFFFFF"/>
-            <w:tcMar>
-              <w:top w:w="90" w:type="dxa"/>
-              <w:bottom w:w="90" w:type="dxa"/>
-              <w:left w:w="100" w:type="dxa"/>
-              <w:right w:w="100" w:type="dxa"/>
-            </w:tcMar>
-          </w:tcPr>
-          <w:p>
-            <w:r>
-              <w:rPr>
-                <w:sz w:val="18"/>
-              </w:rPr>
-              <w:t>Cognitive Systems, Behavioral Healthcare AI, NMC Suicide Risk Assessment &amp; Biomarker Precision Psychiatry Patents.</w:t>
-            </w:r>
-          </w:p>
-        </w:tc>
-      </w:tr>
-      <w:tr>
-        <w:tc>
-          <w:tcPr>
-            <w:tcW w:type="dxa" w:w="2340"/>
-            <w:shd w:fill="F0FDFA"/>
-            <w:tcMar>
-              <w:top w:w="90" w:type="dxa"/>
-              <w:bottom w:w="90" w:type="dxa"/>
-              <w:left w:w="100" w:type="dxa"/>
-              <w:right w:w="100" w:type="dxa"/>
-            </w:tcMar>
-          </w:tcPr>
-          <w:p>
-            <w:r>
-              <w:rPr>
-                <w:b/>
-                <w:sz w:val="18"/>
-              </w:rPr>
-              <w:t>Dr. Kiran D</w:t>
-            </w:r>
-          </w:p>
-        </w:tc>
-        <w:tc>
-          <w:tcPr>
-            <w:tcW w:type="dxa" w:w="2340"/>
-            <w:shd w:fill="F0FDFA"/>
-            <w:tcMar>
-              <w:top w:w="90" w:type="dxa"/>
-              <w:bottom w:w="90" w:type="dxa"/>
-              <w:left w:w="100" w:type="dxa"/>
-              <w:right w:w="100" w:type="dxa"/>
-            </w:tcMar>
-          </w:tcPr>
-          <w:p>
-            <w:r>
-              <w:rPr>
-                <w:sz w:val="18"/>
-              </w:rPr>
-              <w:t>Associate Professor (Cardiology) &amp; Healthcare Specialist</w:t>
-            </w:r>
-          </w:p>
-        </w:tc>
-        <w:tc>
-          <w:tcPr>
-            <w:tcW w:type="dxa" w:w="2340"/>
-            <w:shd w:fill="F0FDFA"/>
-            <w:tcMar>
-              <w:top w:w="90" w:type="dxa"/>
-              <w:bottom w:w="90" w:type="dxa"/>
-              <w:left w:w="100" w:type="dxa"/>
-              <w:right w:w="100" w:type="dxa"/>
-            </w:tcMar>
-          </w:tcPr>
-          <w:p>
-            <w:r>
-              <w:rPr>
-                <w:color w:val="0E7490"/>
-                <w:sz w:val="18"/>
-              </w:rPr>
-              <w:t>kdyawarkonda@gmail.com</w:t>
-            </w:r>
-          </w:p>
-        </w:tc>
-        <w:tc>
-          <w:tcPr>
-            <w:tcW w:type="dxa" w:w="2340"/>
-            <w:shd w:fill="F0FDFA"/>
-            <w:tcMar>
-              <w:top w:w="90" w:type="dxa"/>
-              <w:bottom w:w="90" w:type="dxa"/>
-              <w:left w:w="100" w:type="dxa"/>
-              <w:right w:w="100" w:type="dxa"/>
-            </w:tcMar>
-          </w:tcPr>
-          <w:p>
-            <w:r>
-              <w:rPr>
-                <w:sz w:val="18"/>
-              </w:rPr>
-              <w:t>Interventional Cardiology, 12-lead ECG AI, Smart Interventional Glasses Patent.</w:t>
-            </w:r>
-          </w:p>
-        </w:tc>
-      </w:tr>
-    </w:tbl>
-    <w:p>
-      <w:pPr>
-        <w:spacing w:after="280"/>
-      </w:pPr>
-    </w:p>
-    <w:p>
-      <w:pPr>
-        <w:pStyle w:val="Heading1"/>
-      </w:pPr>
-      <w:r>
-        <w:rPr>
-          <w:color w:val="1E3A8A"/>
-        </w:rPr>
-        <w:t>4. Phased Website Update Roadmap</w:t>
-      </w:r>
-    </w:p>
-    <w:p>
-      <w:pPr>
-        <w:pStyle w:val="Heading2"/>
-      </w:pPr>
-      <w:r>
-        <w:rPr>
-          <w:color w:val="0F766E"/>
-        </w:rPr>
-        <w:t>Phase 1: Foundation, Team Contacts &amp; 3 Patents Integration (Completed) [Current Sprint]</w:t>
-      </w:r>
-    </w:p>
-    <w:p>
-      <w:pPr>
-        <w:pStyle w:val="ListBullet"/>
-      </w:pPr>
-      <w:r>
-        <w:rPr>
-          <w:b/>
-        </w:rPr>
-        <w:t>Published Patents Section:</w:t>
-      </w:r>
-      <w:r>
-        <w:t xml:space="preserve"> Integrated 3 official Indian Patent publications under "Healthcare &amp; Life Sciences" on /industries (Cardiac AR Glasses, NMC Psychiatry Simulation, Biomarker Precision Psychiatry).</w:t>
-      </w:r>
-    </w:p>
-    <w:p>
-      <w:pPr>
-        <w:pStyle w:val="ListBullet"/>
-      </w:pPr>
-      <w:r>
-        <w:rPr>
-          <w:b/>
-        </w:rPr>
-        <w:t>Team Contact Integration:</w:t>
-      </w:r>
-      <w:r>
-        <w:t xml:space="preserve"> Added verified email addresses (hanusistla@gmail.com, drgopaldascm@gmail.com, kdyawarkonda@gmail.com) directly to team cards with clickable mailto: links and Lucide mail icons on the homepage.</w:t>
-      </w:r>
-    </w:p>
-    <w:p>
-      <w:pPr>
-        <w:pStyle w:val="ListBullet"/>
-      </w:pPr>
-      <w:r>
-        <w:rPr>
-          <w:b/>
-        </w:rPr>
-        <w:t>Cloudflare Workers Alignment:</w:t>
-      </w:r>
-      <w:r>
-        <w:t xml:space="preserve"> Updated README.md and documentation to reflect the primary production deployment at https://primetechnologies.hanusistla.workers.dev/.</w:t>
-      </w:r>
-    </w:p>
-    <w:p>
-      <w:pPr>
-        <w:pStyle w:val="Heading2"/>
-      </w:pPr>
-      <w:r>
-        <w:rPr>
-          <w:color w:val="0F766E"/>
-        </w:rPr>
-        <w:t>Phase 2: Academic &amp; Industry Content Enrichment (Next Sprint: 3–4 Weeks) [Content &amp; Domain Expansion]</w:t>
-      </w:r>
-    </w:p>
-    <w:p>
-      <w:pPr>
-        <w:pStyle w:val="ListBullet"/>
-      </w:pPr>
-      <w:r>
-        <w:rPr>
-          <w:b/>
-        </w:rPr>
-        <w:t>Incorporate Google Sites Vertical Portfolios:</w:t>
-      </w:r>
-      <w:r>
-        <w:t xml:space="preserve"> Expand /industries to mirror Dr. Sastry's Google Sites—highlighting dedicated modules for Legal AI, Manufacturing OT/IT AI, and Clinical Healthcare AI.</w:t>
-      </w:r>
-    </w:p>
-    <w:p>
-      <w:pPr>
-        <w:pStyle w:val="ListBullet"/>
-      </w:pPr>
-      <w:r>
-        <w:rPr>
-          <w:b/>
-        </w:rPr>
-        <w:t>Detailed Academic &amp; Clinical Bios:</w:t>
-      </w:r>
-      <w:r>
-        <w:t xml:space="preserve"> Expand the /about and Team sections to feature research affiliations, select peer-reviewed publications, clinical trial experience, and LinkedIn links.</w:t>
-      </w:r>
-    </w:p>
-    <w:p>
-      <w:pPr>
-        <w:pStyle w:val="ListBullet"/>
-      </w:pPr>
-      <w:r>
-        <w:rPr>
-          <w:b/>
-        </w:rPr>
-        <w:t>Contact Form Wire-Up:</w:t>
-      </w:r>
-      <w:r>
-        <w:t xml:space="preserve"> Connect /contact form to a Cloudflare Worker microservice or Formspree/Resend API routing inquiries to the team.</w:t>
-      </w:r>
-    </w:p>
-    <w:p>
-      <w:pPr>
-        <w:pStyle w:val="Heading2"/>
-      </w:pPr>
-      <w:r>
-        <w:rPr>
-          <w:color w:val="0F766E"/>
-        </w:rPr>
-        <w:t>Phase 3: Interactive Features, Agentic Demos &amp; Case Proofs (Medium Term: 5–8 Weeks) [Capabilities &amp; Proof Showcase]</w:t>
-      </w:r>
-    </w:p>
-    <w:p>
-      <w:pPr>
-        <w:pStyle w:val="ListBullet"/>
-      </w:pPr>
-      <w:r>
-        <w:rPr>
-          <w:b/>
-        </w:rPr>
-        <w:t>Interactive Agent Demonstration:</w:t>
-      </w:r>
-      <w:r>
-        <w:t xml:space="preserve"> Build an embedded interactive agent simulator or scoping calculator where enterprise leaders can assess their use case readiness score.</w:t>
-      </w:r>
-    </w:p>
-    <w:p>
-      <w:pPr>
-        <w:pStyle w:val="ListBullet"/>
-      </w:pPr>
-      <w:r>
-        <w:rPr>
-          <w:b/>
-        </w:rPr>
-        <w:t>Case Studies with Verified Metrics:</w:t>
-      </w:r>
-      <w:r>
-        <w:t xml:space="preserve"> Publish 3 to 4 anonymized enterprise impact studies (Banking risk assessment, Healthcare clinical triage, Manufacturing supply chain forecasting).</w:t>
-      </w:r>
-    </w:p>
-    <w:p>
-      <w:pPr>
-        <w:pStyle w:val="ListBullet"/>
-      </w:pPr>
-      <w:r>
-        <w:rPr>
-          <w:b/>
-        </w:rPr>
-        <w:t>Patent &amp; Whitepaper Vault:</w:t>
-      </w:r>
-      <w:r>
-        <w:t xml:space="preserve"> Downloadable patent specification briefs and executive summaries on EU AI Act and NIST AI RMF compliance.</w:t>
-      </w:r>
-    </w:p>
-    <w:p>
-      <w:pPr>
-        <w:pStyle w:val="Heading2"/>
-      </w:pPr>
-      <w:r>
-        <w:rPr>
-          <w:color w:val="0F766E"/>
-        </w:rPr>
-        <w:t>Phase 4: Enterprise Governance, SEO &amp; Edge Performance (Ongoing) [Long-Term Scale &amp; Visibility]</w:t>
-      </w:r>
-    </w:p>
-    <w:p>
-      <w:pPr>
-        <w:pStyle w:val="ListBullet"/>
-      </w:pPr>
-      <w:r>
-        <w:rPr>
-          <w:b/>
-        </w:rPr>
-        <w:t>SEO &amp; Rich Snippets Optimization:</w:t>
-      </w:r>
-      <w:r>
-        <w:t xml:space="preserve"> Add JSON-LD structured data for Academic/Consultancy organizations and patent schemas for search discovery.</w:t>
-      </w:r>
-    </w:p>
-    <w:p>
-      <w:pPr>
-        <w:pStyle w:val="ListBullet"/>
-      </w:pPr>
-      <w:r>
-        <w:rPr>
-          <w:b/>
-        </w:rPr>
-        <w:t>Continuous Sync Pipeline:</w:t>
-      </w:r>
-      <w:r>
-        <w:t xml:space="preserve"> Automate bi-directional synchronization between Lovable and Cloudflare Workers via GitHub Actions CI/CD.</w:t>
-      </w:r>
-    </w:p>
-    <w:p>
-      <w:pPr>
-        <w:pStyle w:val="ListBullet"/>
-      </w:pPr>
-      <w:r>
-        <w:rPr>
-          <w:b/>
-        </w:rPr>
-        <w:t>Privacy, Analytics &amp; Accessibility:</w:t>
-      </w:r>
-      <w:r>
-        <w:t xml:space="preserve"> Implement privacy-compliant Cloudflare Web Analytics and full WCAG 2.1 AA accessibility compliance.</w:t>
-      </w:r>
-    </w:p>
-    <w:p>
-      <w:pPr>
-        <w:spacing w:after="280"/>
-      </w:pPr>
-    </w:p>
-    <w:p>
-      <w:pPr>
-        <w:pStyle w:val="Heading1"/>
-      </w:pPr>
-      <w:r>
-        <w:rPr>
-          <w:color w:val="1E3A8A"/>
-        </w:rPr>
-        <w:t>5. Implementation Milestones Schedule</w:t>
-      </w:r>
-    </w:p>
-    <w:tbl>
-      <w:tblPr>
-        <w:tblW w:type="auto" w:w="0"/>
-        <w:jc w:val="center"/>
-        <w:tblLook w:firstColumn="1" w:firstRow="1" w:lastColumn="0" w:lastRow="0" w:noHBand="0" w:noVBand="1" w:val="04A0"/>
-      </w:tblPr>
-      <w:tblGrid>
-        <w:gridCol w:w="1872"/>
-        <w:gridCol w:w="1872"/>
-        <w:gridCol w:w="1872"/>
-        <w:gridCol w:w="1872"/>
-        <w:gridCol w:w="1872"/>
-      </w:tblGrid>
-      <w:tr>
-        <w:tc>
-          <w:tcPr>
-            <w:tcW w:type="dxa" w:w="1872"/>
-            <w:shd w:fill="1E3A8A"/>
-            <w:tcMar>
-              <w:top w:w="120" w:type="dxa"/>
-              <w:bottom w:w="120" w:type="dxa"/>
-              <w:left w:w="120" w:type="dxa"/>
-              <w:right w:w="120" w:type="dxa"/>
-            </w:tcMar>
-          </w:tcPr>
-          <w:p>
-            <w:r>
-              <w:rPr>
-                <w:b/>
-                <w:color w:val="FFFFFF"/>
-                <w:sz w:val="19"/>
-              </w:rPr>
-              <w:t>Milestone ID</w:t>
-            </w:r>
-          </w:p>
-        </w:tc>
-        <w:tc>
-          <w:tcPr>
-            <w:tcW w:type="dxa" w:w="1872"/>
-            <w:shd w:fill="1E3A8A"/>
-            <w:tcMar>
-              <w:top w:w="120" w:type="dxa"/>
-              <w:bottom w:w="120" w:type="dxa"/>
-              <w:left w:w="120" w:type="dxa"/>
-              <w:right w:w="120" w:type="dxa"/>
-            </w:tcMar>
-          </w:tcPr>
-          <w:p>
-            <w:r>
-              <w:rPr>
-                <w:b/>
-                <w:color w:val="FFFFFF"/>
-                <w:sz w:val="19"/>
-              </w:rPr>
-              <w:t>Feature / Deliverable</w:t>
-            </w:r>
-          </w:p>
-        </w:tc>
-        <w:tc>
-          <w:tcPr>
-            <w:tcW w:type="dxa" w:w="1872"/>
-            <w:shd w:fill="1E3A8A"/>
-            <w:tcMar>
-              <w:top w:w="120" w:type="dxa"/>
-              <w:bottom w:w="120" w:type="dxa"/>
-              <w:left w:w="120" w:type="dxa"/>
-              <w:right w:w="120" w:type="dxa"/>
-            </w:tcMar>
-          </w:tcPr>
-          <w:p>
-            <w:r>
-              <w:rPr>
-                <w:b/>
-                <w:color w:val="FFFFFF"/>
-                <w:sz w:val="19"/>
-              </w:rPr>
-              <w:t>Target Phase</w:t>
-            </w:r>
-          </w:p>
-        </w:tc>
-        <w:tc>
-          <w:tcPr>
-            <w:tcW w:type="dxa" w:w="1872"/>
-            <w:shd w:fill="1E3A8A"/>
-            <w:tcMar>
-              <w:top w:w="120" w:type="dxa"/>
-              <w:bottom w:w="120" w:type="dxa"/>
-              <w:left w:w="120" w:type="dxa"/>
-              <w:right w:w="120" w:type="dxa"/>
-            </w:tcMar>
-          </w:tcPr>
-          <w:p>
-            <w:r>
-              <w:rPr>
-                <w:b/>
-                <w:color w:val="FFFFFF"/>
-                <w:sz w:val="19"/>
-              </w:rPr>
-              <w:t>Primary Owner</w:t>
-            </w:r>
-          </w:p>
-        </w:tc>
-        <w:tc>
-          <w:tcPr>
-            <w:tcW w:type="dxa" w:w="1872"/>
-            <w:shd w:fill="1E3A8A"/>
-            <w:tcMar>
-              <w:top w:w="120" w:type="dxa"/>
-              <w:bottom w:w="120" w:type="dxa"/>
-              <w:left w:w="120" w:type="dxa"/>
-              <w:right w:w="120" w:type="dxa"/>
-            </w:tcMar>
-          </w:tcPr>
-          <w:p>
-            <w:r>
-              <w:rPr>
-                <w:b/>
-                <w:color w:val="FFFFFF"/>
-                <w:sz w:val="19"/>
-              </w:rPr>
-              <w:t>Deliverable Output</w:t>
-            </w:r>
-          </w:p>
-        </w:tc>
-      </w:tr>
-      <w:tr>
-        <w:tc>
-          <w:tcPr>
-            <w:tcW w:type="dxa" w:w="1872"/>
-            <w:shd w:fill="F8FAFC"/>
-            <w:tcMar>
-              <w:top w:w="90" w:type="dxa"/>
-              <w:bottom w:w="90" w:type="dxa"/>
-              <w:left w:w="100" w:type="dxa"/>
-              <w:right w:w="100" w:type="dxa"/>
-            </w:tcMar>
-          </w:tcPr>
-          <w:p>
-            <w:r>
-              <w:rPr>
-                <w:b/>
-                <w:sz w:val="18"/>
-              </w:rPr>
-              <w:t>M-01</w:t>
-            </w:r>
-          </w:p>
-        </w:tc>
-        <w:tc>
-          <w:tcPr>
-            <w:tcW w:type="dxa" w:w="1872"/>
-            <w:shd w:fill="F8FAFC"/>
-            <w:tcMar>
-              <w:top w:w="90" w:type="dxa"/>
-              <w:bottom w:w="90" w:type="dxa"/>
-              <w:left w:w="100" w:type="dxa"/>
-              <w:right w:w="100" w:type="dxa"/>
-            </w:tcMar>
-          </w:tcPr>
-          <w:p>
-            <w:r>
-              <w:rPr>
-                <w:sz w:val="18"/>
-              </w:rPr>
-              <w:t>Published Patents on Healthcare Tab</w:t>
-            </w:r>
-          </w:p>
-        </w:tc>
-        <w:tc>
-          <w:tcPr>
-            <w:tcW w:type="dxa" w:w="1872"/>
-            <w:shd w:fill="F8FAFC"/>
-            <w:tcMar>
-              <w:top w:w="90" w:type="dxa"/>
-              <w:bottom w:w="90" w:type="dxa"/>
-              <w:left w:w="100" w:type="dxa"/>
-              <w:right w:w="100" w:type="dxa"/>
-            </w:tcMar>
-          </w:tcPr>
-          <w:p>
-            <w:r>
-              <w:rPr>
-                <w:sz w:val="18"/>
-              </w:rPr>
-              <w:t>Phase 1 [DONE]</w:t>
-            </w:r>
-          </w:p>
-        </w:tc>
-        <w:tc>
-          <w:tcPr>
-            <w:tcW w:type="dxa" w:w="1872"/>
-            <w:shd w:fill="F8FAFC"/>
-            <w:tcMar>
-              <w:top w:w="90" w:type="dxa"/>
-              <w:bottom w:w="90" w:type="dxa"/>
-              <w:left w:w="100" w:type="dxa"/>
-              <w:right w:w="100" w:type="dxa"/>
-            </w:tcMar>
-          </w:tcPr>
-          <w:p>
-            <w:r>
-              <w:rPr>
-                <w:sz w:val="18"/>
-              </w:rPr>
-              <w:t>Engineering</w:t>
-            </w:r>
-          </w:p>
-        </w:tc>
-        <w:tc>
-          <w:tcPr>
-            <w:tcW w:type="dxa" w:w="1872"/>
-            <w:shd w:fill="F8FAFC"/>
-            <w:tcMar>
-              <w:top w:w="90" w:type="dxa"/>
-              <w:bottom w:w="90" w:type="dxa"/>
-              <w:left w:w="100" w:type="dxa"/>
-              <w:right w:w="100" w:type="dxa"/>
-            </w:tcMar>
-          </w:tcPr>
-          <w:p>
-            <w:r>
-              <w:rPr>
-                <w:sz w:val="18"/>
-              </w:rPr>
-              <w:t>Updated src/routes/industries.tsx with 3 published patents</w:t>
-            </w:r>
-          </w:p>
-        </w:tc>
-      </w:tr>
-      <w:tr>
-        <w:tc>
-          <w:tcPr>
-            <w:tcW w:type="dxa" w:w="1872"/>
-            <w:shd w:fill="FFFFFF"/>
-            <w:tcMar>
-              <w:top w:w="90" w:type="dxa"/>
-              <w:bottom w:w="90" w:type="dxa"/>
-              <w:left w:w="100" w:type="dxa"/>
-              <w:right w:w="100" w:type="dxa"/>
-            </w:tcMar>
-          </w:tcPr>
-          <w:p>
-            <w:r>
-              <w:rPr>
-                <w:b/>
-                <w:sz w:val="18"/>
-              </w:rPr>
-              <w:t>M-02</w:t>
-            </w:r>
-          </w:p>
-        </w:tc>
-        <w:tc>
-          <w:tcPr>
-            <w:tcW w:type="dxa" w:w="1872"/>
-            <w:shd w:fill="FFFFFF"/>
-            <w:tcMar>
-              <w:top w:w="90" w:type="dxa"/>
-              <w:bottom w:w="90" w:type="dxa"/>
-              <w:left w:w="100" w:type="dxa"/>
-              <w:right w:w="100" w:type="dxa"/>
-            </w:tcMar>
-          </w:tcPr>
-          <w:p>
-            <w:r>
-              <w:rPr>
-                <w:sz w:val="18"/>
-              </w:rPr>
-              <w:t>Team Email IDs &amp; Mailto Integration</w:t>
-            </w:r>
-          </w:p>
-        </w:tc>
-        <w:tc>
-          <w:tcPr>
-            <w:tcW w:type="dxa" w:w="1872"/>
-            <w:shd w:fill="FFFFFF"/>
-            <w:tcMar>
-              <w:top w:w="90" w:type="dxa"/>
-              <w:bottom w:w="90" w:type="dxa"/>
-              <w:left w:w="100" w:type="dxa"/>
-              <w:right w:w="100" w:type="dxa"/>
-            </w:tcMar>
-          </w:tcPr>
-          <w:p>
-            <w:r>
-              <w:rPr>
-                <w:sz w:val="18"/>
-              </w:rPr>
-              <w:t>Phase 1 [DONE]</w:t>
-            </w:r>
-          </w:p>
-        </w:tc>
-        <w:tc>
-          <w:tcPr>
-            <w:tcW w:type="dxa" w:w="1872"/>
-            <w:shd w:fill="FFFFFF"/>
-            <w:tcMar>
-              <w:top w:w="90" w:type="dxa"/>
-              <w:bottom w:w="90" w:type="dxa"/>
-              <w:left w:w="100" w:type="dxa"/>
-              <w:right w:w="100" w:type="dxa"/>
-            </w:tcMar>
-          </w:tcPr>
-          <w:p>
-            <w:r>
-              <w:rPr>
-                <w:sz w:val="18"/>
-              </w:rPr>
-              <w:t>Engineering</w:t>
-            </w:r>
-          </w:p>
-        </w:tc>
-        <w:tc>
-          <w:tcPr>
-            <w:tcW w:type="dxa" w:w="1872"/>
-            <w:shd w:fill="FFFFFF"/>
-            <w:tcMar>
-              <w:top w:w="90" w:type="dxa"/>
-              <w:bottom w:w="90" w:type="dxa"/>
-              <w:left w:w="100" w:type="dxa"/>
-              <w:right w:w="100" w:type="dxa"/>
-            </w:tcMar>
-          </w:tcPr>
-          <w:p>
-            <w:r>
-              <w:rPr>
-                <w:sz w:val="18"/>
-              </w:rPr>
-              <w:t>Updated src/routes/index.tsx with direct mail links</w:t>
-            </w:r>
-          </w:p>
-        </w:tc>
-      </w:tr>
-      <w:tr>
-        <w:tc>
-          <w:tcPr>
-            <w:tcW w:type="dxa" w:w="1872"/>
-            <w:shd w:fill="F8FAFC"/>
-            <w:tcMar>
-              <w:top w:w="90" w:type="dxa"/>
-              <w:bottom w:w="90" w:type="dxa"/>
-              <w:left w:w="100" w:type="dxa"/>
-              <w:right w:w="100" w:type="dxa"/>
-            </w:tcMar>
-          </w:tcPr>
-          <w:p>
-            <w:r>
-              <w:rPr>
-                <w:b/>
-                <w:sz w:val="18"/>
-              </w:rPr>
-              <w:t>M-03</w:t>
-            </w:r>
-          </w:p>
-        </w:tc>
-        <w:tc>
-          <w:tcPr>
-            <w:tcW w:type="dxa" w:w="1872"/>
-            <w:shd w:fill="F8FAFC"/>
-            <w:tcMar>
-              <w:top w:w="90" w:type="dxa"/>
-              <w:bottom w:w="90" w:type="dxa"/>
-              <w:left w:w="100" w:type="dxa"/>
-              <w:right w:w="100" w:type="dxa"/>
-            </w:tcMar>
-          </w:tcPr>
-          <w:p>
-            <w:r>
-              <w:rPr>
-                <w:sz w:val="18"/>
-              </w:rPr>
-              <w:t>Cloudflare Workers Linkage in Documentation</w:t>
-            </w:r>
-          </w:p>
-        </w:tc>
-        <w:tc>
-          <w:tcPr>
-            <w:tcW w:type="dxa" w:w="1872"/>
-            <w:shd w:fill="F8FAFC"/>
-            <w:tcMar>
-              <w:top w:w="90" w:type="dxa"/>
-              <w:bottom w:w="90" w:type="dxa"/>
-              <w:left w:w="100" w:type="dxa"/>
-              <w:right w:w="100" w:type="dxa"/>
-            </w:tcMar>
-          </w:tcPr>
-          <w:p>
-            <w:r>
-              <w:rPr>
-                <w:sz w:val="18"/>
-              </w:rPr>
-              <w:t>Phase 1 [DONE]</w:t>
-            </w:r>
-          </w:p>
-        </w:tc>
-        <w:tc>
-          <w:tcPr>
-            <w:tcW w:type="dxa" w:w="1872"/>
-            <w:shd w:fill="F8FAFC"/>
-            <w:tcMar>
-              <w:top w:w="90" w:type="dxa"/>
-              <w:bottom w:w="90" w:type="dxa"/>
-              <w:left w:w="100" w:type="dxa"/>
-              <w:right w:w="100" w:type="dxa"/>
-            </w:tcMar>
-          </w:tcPr>
-          <w:p>
-            <w:r>
-              <w:rPr>
-                <w:sz w:val="18"/>
-              </w:rPr>
-              <w:t>DevOps / Docs</w:t>
-            </w:r>
-          </w:p>
-        </w:tc>
-        <w:tc>
-          <w:tcPr>
-            <w:tcW w:type="dxa" w:w="1872"/>
-            <w:shd w:fill="F8FAFC"/>
-            <w:tcMar>
-              <w:top w:w="90" w:type="dxa"/>
-              <w:bottom w:w="90" w:type="dxa"/>
-              <w:left w:w="100" w:type="dxa"/>
-              <w:right w:w="100" w:type="dxa"/>
-            </w:tcMar>
-          </w:tcPr>
-          <w:p>
-            <w:r>
-              <w:rPr>
-                <w:sz w:val="18"/>
-              </w:rPr>
-              <w:t>README.md updated with workers.dev URL</w:t>
-            </w:r>
-          </w:p>
-        </w:tc>
-      </w:tr>
-      <w:tr>
-        <w:tc>
-          <w:tcPr>
-            <w:tcW w:type="dxa" w:w="1872"/>
-            <w:shd w:fill="FFFFFF"/>
-            <w:tcMar>
-              <w:top w:w="90" w:type="dxa"/>
-              <w:bottom w:w="90" w:type="dxa"/>
-              <w:left w:w="100" w:type="dxa"/>
-              <w:right w:w="100" w:type="dxa"/>
-            </w:tcMar>
-          </w:tcPr>
-          <w:p>
-            <w:r>
-              <w:rPr>
-                <w:b/>
-                <w:sz w:val="18"/>
-              </w:rPr>
-              <w:t>M-04</w:t>
-            </w:r>
-          </w:p>
-        </w:tc>
-        <w:tc>
-          <w:tcPr>
-            <w:tcW w:type="dxa" w:w="1872"/>
-            <w:shd w:fill="FFFFFF"/>
-            <w:tcMar>
-              <w:top w:w="90" w:type="dxa"/>
-              <w:bottom w:w="90" w:type="dxa"/>
-              <w:left w:w="100" w:type="dxa"/>
-              <w:right w:w="100" w:type="dxa"/>
-            </w:tcMar>
-          </w:tcPr>
-          <w:p>
-            <w:r>
-              <w:rPr>
-                <w:sz w:val="18"/>
-              </w:rPr>
-              <w:t>Contact Form API Email Dispatcher</w:t>
-            </w:r>
-          </w:p>
-        </w:tc>
-        <w:tc>
-          <w:tcPr>
-            <w:tcW w:type="dxa" w:w="1872"/>
-            <w:shd w:fill="FFFFFF"/>
-            <w:tcMar>
-              <w:top w:w="90" w:type="dxa"/>
-              <w:bottom w:w="90" w:type="dxa"/>
-              <w:left w:w="100" w:type="dxa"/>
-              <w:right w:w="100" w:type="dxa"/>
-            </w:tcMar>
-          </w:tcPr>
-          <w:p>
-            <w:r>
-              <w:rPr>
-                <w:sz w:val="18"/>
-              </w:rPr>
-              <w:t>Phase 2</w:t>
-            </w:r>
-          </w:p>
-        </w:tc>
-        <w:tc>
-          <w:tcPr>
-            <w:tcW w:type="dxa" w:w="1872"/>
-            <w:shd w:fill="FFFFFF"/>
-            <w:tcMar>
-              <w:top w:w="90" w:type="dxa"/>
-              <w:bottom w:w="90" w:type="dxa"/>
-              <w:left w:w="100" w:type="dxa"/>
-              <w:right w:w="100" w:type="dxa"/>
-            </w:tcMar>
-          </w:tcPr>
-          <w:p>
-            <w:r>
-              <w:rPr>
-                <w:sz w:val="18"/>
-              </w:rPr>
-              <w:t>Full Stack Lead</w:t>
-            </w:r>
-          </w:p>
-        </w:tc>
-        <w:tc>
-          <w:tcPr>
-            <w:tcW w:type="dxa" w:w="1872"/>
-            <w:shd w:fill="FFFFFF"/>
-            <w:tcMar>
-              <w:top w:w="90" w:type="dxa"/>
-              <w:bottom w:w="90" w:type="dxa"/>
-              <w:left w:w="100" w:type="dxa"/>
-              <w:right w:w="100" w:type="dxa"/>
-            </w:tcMar>
-          </w:tcPr>
-          <w:p>
-            <w:r>
-              <w:rPr>
-                <w:sz w:val="18"/>
-              </w:rPr>
-              <w:t>Functional contact form sending to team mailboxes</w:t>
-            </w:r>
-          </w:p>
-        </w:tc>
-      </w:tr>
-      <w:tr>
-        <w:tc>
-          <w:tcPr>
-            <w:tcW w:type="dxa" w:w="1872"/>
-            <w:shd w:fill="F8FAFC"/>
-            <w:tcMar>
-              <w:top w:w="90" w:type="dxa"/>
-              <w:bottom w:w="90" w:type="dxa"/>
-              <w:left w:w="100" w:type="dxa"/>
-              <w:right w:w="100" w:type="dxa"/>
-            </w:tcMar>
-          </w:tcPr>
-          <w:p>
-            <w:r>
-              <w:rPr>
-                <w:b/>
-                <w:sz w:val="18"/>
-              </w:rPr>
-              <w:t>M-05</w:t>
-            </w:r>
-          </w:p>
-        </w:tc>
-        <w:tc>
-          <w:tcPr>
-            <w:tcW w:type="dxa" w:w="1872"/>
-            <w:shd w:fill="F8FAFC"/>
-            <w:tcMar>
-              <w:top w:w="90" w:type="dxa"/>
-              <w:bottom w:w="90" w:type="dxa"/>
-              <w:left w:w="100" w:type="dxa"/>
-              <w:right w:w="100" w:type="dxa"/>
-            </w:tcMar>
-          </w:tcPr>
-          <w:p>
-            <w:r>
-              <w:rPr>
-                <w:sz w:val="18"/>
-              </w:rPr>
-              <w:t>Vertical Pages: Legal AI, Industry OT</w:t>
-            </w:r>
-          </w:p>
-        </w:tc>
-        <w:tc>
-          <w:tcPr>
-            <w:tcW w:type="dxa" w:w="1872"/>
-            <w:shd w:fill="F8FAFC"/>
-            <w:tcMar>
-              <w:top w:w="90" w:type="dxa"/>
-              <w:bottom w:w="90" w:type="dxa"/>
-              <w:left w:w="100" w:type="dxa"/>
-              <w:right w:w="100" w:type="dxa"/>
-            </w:tcMar>
-          </w:tcPr>
-          <w:p>
-            <w:r>
-              <w:rPr>
-                <w:sz w:val="18"/>
-              </w:rPr>
-              <w:t>Phase 2</w:t>
-            </w:r>
-          </w:p>
-        </w:tc>
-        <w:tc>
-          <w:tcPr>
-            <w:tcW w:type="dxa" w:w="1872"/>
-            <w:shd w:fill="F8FAFC"/>
-            <w:tcMar>
-              <w:top w:w="90" w:type="dxa"/>
-              <w:bottom w:w="90" w:type="dxa"/>
-              <w:left w:w="100" w:type="dxa"/>
-              <w:right w:w="100" w:type="dxa"/>
-            </w:tcMar>
-          </w:tcPr>
-          <w:p>
-            <w:r>
-              <w:rPr>
-                <w:sz w:val="18"/>
-              </w:rPr>
-              <w:t>Academic Leads</w:t>
-            </w:r>
-          </w:p>
-        </w:tc>
-        <w:tc>
-          <w:tcPr>
-            <w:tcW w:type="dxa" w:w="1872"/>
-            <w:shd w:fill="F8FAFC"/>
-            <w:tcMar>
-              <w:top w:w="90" w:type="dxa"/>
-              <w:bottom w:w="90" w:type="dxa"/>
-              <w:left w:w="100" w:type="dxa"/>
-              <w:right w:w="100" w:type="dxa"/>
-            </w:tcMar>
-          </w:tcPr>
-          <w:p>
-            <w:r>
-              <w:rPr>
-                <w:sz w:val="18"/>
-              </w:rPr>
-              <w:t>Expanded /industries and /solutions content</w:t>
-            </w:r>
-          </w:p>
-        </w:tc>
-      </w:tr>
-      <w:tr>
-        <w:tc>
-          <w:tcPr>
-            <w:tcW w:type="dxa" w:w="1872"/>
-            <w:shd w:fill="FFFFFF"/>
-            <w:tcMar>
-              <w:top w:w="90" w:type="dxa"/>
-              <w:bottom w:w="90" w:type="dxa"/>
-              <w:left w:w="100" w:type="dxa"/>
-              <w:right w:w="100" w:type="dxa"/>
-            </w:tcMar>
-          </w:tcPr>
-          <w:p>
-            <w:r>
-              <w:rPr>
-                <w:b/>
-                <w:sz w:val="18"/>
-              </w:rPr>
-              <w:t>M-06</w:t>
-            </w:r>
-          </w:p>
-        </w:tc>
-        <w:tc>
-          <w:tcPr>
-            <w:tcW w:type="dxa" w:w="1872"/>
-            <w:shd w:fill="FFFFFF"/>
-            <w:tcMar>
-              <w:top w:w="90" w:type="dxa"/>
-              <w:bottom w:w="90" w:type="dxa"/>
-              <w:left w:w="100" w:type="dxa"/>
-              <w:right w:w="100" w:type="dxa"/>
-            </w:tcMar>
-          </w:tcPr>
-          <w:p>
-            <w:r>
-              <w:rPr>
-                <w:sz w:val="18"/>
-              </w:rPr>
-              <w:t>Interactive Scoping Calculator &amp; Case Studies</w:t>
-            </w:r>
-          </w:p>
-        </w:tc>
-        <w:tc>
-          <w:tcPr>
-            <w:tcW w:type="dxa" w:w="1872"/>
-            <w:shd w:fill="FFFFFF"/>
-            <w:tcMar>
-              <w:top w:w="90" w:type="dxa"/>
-              <w:bottom w:w="90" w:type="dxa"/>
-              <w:left w:w="100" w:type="dxa"/>
-              <w:right w:w="100" w:type="dxa"/>
-            </w:tcMar>
-          </w:tcPr>
-          <w:p>
-            <w:r>
-              <w:rPr>
-                <w:sz w:val="18"/>
-              </w:rPr>
-              <w:t>Phase 3</w:t>
-            </w:r>
-          </w:p>
-        </w:tc>
-        <w:tc>
-          <w:tcPr>
-            <w:tcW w:type="dxa" w:w="1872"/>
-            <w:shd w:fill="FFFFFF"/>
-            <w:tcMar>
-              <w:top w:w="90" w:type="dxa"/>
-              <w:bottom w:w="90" w:type="dxa"/>
-              <w:left w:w="100" w:type="dxa"/>
-              <w:right w:w="100" w:type="dxa"/>
-            </w:tcMar>
-          </w:tcPr>
-          <w:p>
-            <w:r>
-              <w:rPr>
-                <w:sz w:val="18"/>
-              </w:rPr>
-              <w:t>Product &amp; Design</w:t>
-            </w:r>
-          </w:p>
-        </w:tc>
-        <w:tc>
-          <w:tcPr>
-            <w:tcW w:type="dxa" w:w="1872"/>
-            <w:shd w:fill="FFFFFF"/>
-            <w:tcMar>
-              <w:top w:w="90" w:type="dxa"/>
-              <w:bottom w:w="90" w:type="dxa"/>
-              <w:left w:w="100" w:type="dxa"/>
-              <w:right w:w="100" w:type="dxa"/>
-            </w:tcMar>
-          </w:tcPr>
-          <w:p>
-            <w:r>
-              <w:rPr>
-                <w:sz w:val="18"/>
-              </w:rPr>
-              <w:t>Interactive ROI / Readiness tool &amp; verified metrics</w:t>
-            </w:r>
-          </w:p>
-        </w:tc>
-      </w:tr>
-    </w:tbl>
-    <w:p>
-      <w:pPr>
-        <w:spacing w:after="320"/>
-      </w:pPr>
-    </w:p>
-    <w:p>
-      <w:pPr>
-        <w:pStyle w:val="Heading1"/>
-      </w:pPr>
-      <w:r>
-        <w:rPr>
-          <w:color w:val="1E3A8A"/>
-        </w:rPr>
-        <w:t>6. Specific Code Changes Implemented in Local Repository</w:t>
-      </w:r>
-    </w:p>
-    <w:p>
-      <w:pPr>
-        <w:pStyle w:val="ListBullet"/>
-      </w:pPr>
-      <w:r>
-        <w:rPr>
-          <w:b/>
-        </w:rPr>
-        <w:t xml:space="preserve">File: src/routes/industries.tsx: </w:t>
-      </w:r>
-      <w:r>
-        <w:t>Integrated 3 official Indian Patents into the "Patents Published" section under "Healthcare &amp; Life Sciences": (1) IN202641041350 A1 (Cardiac AR Glasses AI), (2) 202641098894 A (NMC Psychiatry Simulation AI), and (3) 202641025843 A (Precision Psychiatry &amp; Biomarkers AI) with filing/publication dates, IPC codes, inventor names, abstracts, and capability tags.</w:t>
-      </w:r>
-    </w:p>
-    <w:p>
-      <w:pPr>
-        <w:pStyle w:val="ListBullet"/>
-      </w:pPr>
-      <w:r>
-        <w:rPr>
-          <w:b/>
-        </w:rPr>
-        <w:t xml:space="preserve">File: src/routes/index.tsx: </w:t>
-      </w:r>
-      <w:r>
-        <w:t>Imported Mail icon from lucide-react, appended email addresses to team array (Dr. Hanumanth Sastry: hanusistla@gmail.com, Dr. Gopal Das: drgopaldascm@gmail.com, Dr. Kiran D: kdyawarkonda@gmail.com), and rendered interactive mailto: links in team cards.</w:t>
-      </w:r>
-    </w:p>
-    <w:p>
-      <w:pPr>
-        <w:pStyle w:val="ListBullet"/>
-      </w:pPr>
-      <w:r>
-        <w:rPr>
-          <w:b/>
-        </w:rPr>
-        <w:t xml:space="preserve">File: README.md: </w:t>
-      </w:r>
-      <w:r>
-        <w:t>Updated the live application reference to https://primetechnologies.hanusistla.workers.dev/ deployed on Cloudflare Workers, while preserving the Lovable development link.</w:t>
-      </w:r>
-    </w:p>
     <w:sectPr>
       <w:pgSz w:w="12240" w:h="15840"/>
       <w:pgMar w:top="1440" w:right="1440" w:bottom="1440" w:left="1440" w:header="720" w:footer="720" w:gutter="0"/>

</xml_diff>

<commit_message>
Add CDSIMER academic title links for Dr Gopal Das and Dr Kiran D
</commit_message>
<xml_diff>
--- a/Website_Update_Roadmap_PrimeTechnologies.docx
+++ b/Website_Update_Roadmap_PrimeTechnologies.docx
@@ -397,7 +397,7 @@
                 <w:color w:val="0F172A"/>
                 <w:sz w:val="19"/>
               </w:rPr>
-              <w:t>Version 1.3 — Faculty Research Profiles &amp; 3 Official Patents (October 2026)</w:t>
+              <w:t>Version 1.4 — Full Faculty Academic Profiles &amp; 3 Official Patents (October 2026)</w:t>
             </w:r>
           </w:p>
         </w:tc>
@@ -421,7 +421,7 @@
     </w:p>
     <w:p>
       <w:r>
-        <w:t>Prime Technologies (AI Pathways) bridges senior computer science research in Applied ML, Generative AI, and Agentic Systems with clinical and enterprise production. The platform showcases Dr. Hanumanth Sastry's academic and research citations across Google Scholar, Scopus, LinkedIn, and DSU Faculty credentials alongside three published Indian Patents in interventional cardiology and precision psychiatry.</w:t>
+        <w:t>Prime Technologies (AI Pathways) bridges senior computer science research in Applied ML, Generative AI, and Agentic Systems with clinical and enterprise production. The digital platform showcases full academic affiliations and credential links for all three leadership members: Dr. Hanumanth Sastry (DSU Professor CSE/AIML), Dr. Gopal Das (CDSIMER Professor Psychiatry), and Dr. Kiran D (CDSIMER Associate Professor Cardiology), alongside three published Indian Patents in interventional cardiology and precision psychiatry.</w:t>
       </w:r>
     </w:p>
     <w:p>
@@ -432,7 +432,7 @@
         <w:rPr>
           <w:color w:val="1E3A8A"/>
         </w:rPr>
-        <w:t>2. Core Team Leadership &amp; Academic Citations Directory</w:t>
+        <w:t>2. Core Team Leadership &amp; Verified Academic Profiles</w:t>
       </w:r>
     </w:p>
     <w:tbl>
@@ -488,7 +488,7 @@
                 <w:color w:val="FFFFFF"/>
                 <w:sz w:val="19"/>
               </w:rPr>
-              <w:t>Role &amp; Specialization</w:t>
+              <w:t>Academic Title &amp; Department</w:t>
             </w:r>
           </w:p>
         </w:tc>
@@ -532,7 +532,7 @@
                 <w:color w:val="FFFFFF"/>
                 <w:sz w:val="19"/>
               </w:rPr>
-              <w:t>Academic Links &amp; Research Focus</w:t>
+              <w:t>Institutional &amp; Academic Hyperlinks</w:t>
             </w:r>
           </w:p>
         </w:tc>
@@ -575,7 +575,9 @@
               <w:rPr>
                 <w:sz w:val="18"/>
               </w:rPr>
-              <w:t>Professor (AIML) &amp; Practice Lead</w:t>
+              <w:t>Professor (AIML)</w:t>
+              <w:br/>
+              <w:t>Dayananda Sagar University</w:t>
             </w:r>
           </w:p>
         </w:tc>
@@ -616,15 +618,13 @@
               <w:rPr>
                 <w:sz w:val="18"/>
               </w:rPr>
-              <w:t>Google Scholar: -Z66y_EAAAAJ</w:t>
+              <w:t>DSU Faculty: dsu.edu.in/hanumanth-ss</w:t>
+              <w:br/>
+              <w:t>Google Scholar: citations?user=-Z66y_EAAAAJ</w:t>
               <w:br/>
               <w:t>Scopus ID: 60557811900</w:t>
               <w:br/>
               <w:t>LinkedIn: dr-hanumanth-sastry-sistla-693031165</w:t>
-              <w:br/>
-              <w:t>DSU Faculty: dsu.edu.in/hanumanth-ss</w:t>
-              <w:br/>
-              <w:t>Lead Inventor: 3 Published Indian Patents</w:t>
             </w:r>
           </w:p>
         </w:tc>
@@ -667,7 +667,9 @@
               <w:rPr>
                 <w:sz w:val="18"/>
               </w:rPr>
-              <w:t>Professor (Psychiatry) &amp; Clinical Advisor</w:t>
+              <w:t>Professor (Psychiatry)</w:t>
+              <w:br/>
+              <w:t>CDSIMER</w:t>
             </w:r>
           </w:p>
         </w:tc>
@@ -708,7 +710,11 @@
               <w:rPr>
                 <w:sz w:val="18"/>
               </w:rPr>
-              <w:t>Cognitive Systems, Behavioral Healthcare AI, Co-Inventor on NMC Suicide Risk Assessment Simulation &amp; Biomarker Precision Psychiatry Patents.</w:t>
+              <w:t>CDSIMER Psychiatry Dept:</w:t>
+              <w:br/>
+              <w:t>cdsimer.edu.in/departments/clincal/psychiatry</w:t>
+              <w:br/>
+              <w:t>Co-Inventor on 2 Published Precision Psychiatry Patents</w:t>
             </w:r>
           </w:p>
         </w:tc>
@@ -751,7 +757,9 @@
               <w:rPr>
                 <w:sz w:val="18"/>
               </w:rPr>
-              <w:t>Associate Professor (Cardiology) &amp; Healthcare Specialist</w:t>
+              <w:t>Associate Professor (Cardiology)</w:t>
+              <w:br/>
+              <w:t>CDSIMER</w:t>
             </w:r>
           </w:p>
         </w:tc>
@@ -792,7 +800,11 @@
               <w:rPr>
                 <w:sz w:val="18"/>
               </w:rPr>
-              <w:t>Interventional Cardiology, 12-lead ECG AI, Co-Inventor on Smart Interventional Glasses AR Patent.</w:t>
+              <w:t>CDSIMER Cardiology Dept:</w:t>
+              <w:br/>
+              <w:t>cdsimer.edu.in/departments/super-speciality/cardiology</w:t>
+              <w:br/>
+              <w:t>Co-Inventor on Interventional Cardiac AR Patent</w:t>
             </w:r>
           </w:p>
         </w:tc>

</xml_diff>

<commit_message>
Publish 3 Clinical AI Research Projects under Healthcare tab on Industries page
</commit_message>
<xml_diff>
--- a/Website_Update_Roadmap_PrimeTechnologies.docx
+++ b/Website_Update_Roadmap_PrimeTechnologies.docx
@@ -27,7 +27,7 @@
           <w:color w:val="475569"/>
           <w:sz w:val="26"/>
         </w:rPr>
-        <w:t>Prime Technologies | AI Pathways: Bridging Academic Research, Clinical Patents &amp; Enterprise Production</w:t>
+        <w:t>Prime Technologies | AI Pathways: Bridging Academic Research, Clinical Projects &amp; Enterprise Production</w:t>
       </w:r>
     </w:p>
     <w:p>
@@ -118,7 +118,7 @@
                 <w:color w:val="1E293B"/>
                 <w:sz w:val="19"/>
               </w:rPr>
-              <w:t>Published Patents URL</w:t>
+              <w:t>Published Projects &amp; Patents URL</w:t>
             </w:r>
           </w:p>
         </w:tc>
@@ -397,7 +397,7 @@
                 <w:color w:val="0F172A"/>
                 <w:sz w:val="19"/>
               </w:rPr>
-              <w:t>Version 1.4 — Full Faculty Academic Profiles &amp; 3 Official Patents (October 2026)</w:t>
+              <w:t>Version 1.5 — 3 Clinical Research Projects &amp; 3 Official Patents (October 2026)</w:t>
             </w:r>
           </w:p>
         </w:tc>
@@ -421,7 +421,7 @@
     </w:p>
     <w:p>
       <w:r>
-        <w:t>Prime Technologies (AI Pathways) bridges senior computer science research in Applied ML, Generative AI, and Agentic Systems with clinical and enterprise production. The digital platform showcases full academic affiliations and credential links for all three leadership members: Dr. Hanumanth Sastry (DSU Professor CSE/AIML), Dr. Gopal Das (CDSIMER Professor Psychiatry), and Dr. Kiran D (CDSIMER Associate Professor Cardiology), alongside three published Indian Patents in interventional cardiology and precision psychiatry.</w:t>
+        <w:t>Prime Technologies (AI Pathways) bridges senior computer science research in Applied ML, Generative AI, and Agentic Systems with clinical and enterprise production. The digital platform features 3 deep Clinical AI Research Projects and 3 official Indian Patent publications under the Healthcare &amp; Life Sciences vertical, establishing verifiable technical authority across interventional cardiology and precision psychiatry.</w:t>
       </w:r>
     </w:p>
     <w:p>
@@ -432,7 +432,7 @@
         <w:rPr>
           <w:color w:val="1E3A8A"/>
         </w:rPr>
-        <w:t>2. Core Team Leadership &amp; Verified Academic Profiles</w:t>
+        <w:t>2. Clinical AI Research Projects (Published on Healthcare Tab)</w:t>
       </w:r>
     </w:p>
     <w:tbl>
@@ -466,7 +466,7 @@
                 <w:color w:val="FFFFFF"/>
                 <w:sz w:val="19"/>
               </w:rPr>
-              <w:t>Team Member</w:t>
+              <w:t>Project Identifier</w:t>
             </w:r>
           </w:p>
         </w:tc>
@@ -488,7 +488,7 @@
                 <w:color w:val="FFFFFF"/>
                 <w:sz w:val="19"/>
               </w:rPr>
-              <w:t>Academic Title &amp; Department</w:t>
+              <w:t>Project Title</w:t>
             </w:r>
           </w:p>
         </w:tc>
@@ -510,7 +510,7 @@
                 <w:color w:val="FFFFFF"/>
                 <w:sz w:val="19"/>
               </w:rPr>
-              <w:t>Direct Email Address</w:t>
+              <w:t>Faculty Leadership &amp; Linked Patent</w:t>
             </w:r>
           </w:p>
         </w:tc>
@@ -532,7 +532,7 @@
                 <w:color w:val="FFFFFF"/>
                 <w:sz w:val="19"/>
               </w:rPr>
-              <w:t>Institutional &amp; Academic Hyperlinks</w:t>
+              <w:t>Clinical Problem &amp; Investigation Scope</w:t>
             </w:r>
           </w:p>
         </w:tc>
@@ -543,19 +543,20 @@
             <w:tcW w:type="dxa" w:w="2340"/>
             <w:shd w:fill="F0FDFA"/>
             <w:tcMar>
-              <w:top w:w="90" w:type="dxa"/>
-              <w:bottom w:w="90" w:type="dxa"/>
-              <w:left w:w="100" w:type="dxa"/>
-              <w:right w:w="100" w:type="dxa"/>
+              <w:top w:w="100" w:type="dxa"/>
+              <w:bottom w:w="100" w:type="dxa"/>
+              <w:left w:w="120" w:type="dxa"/>
+              <w:right w:w="120" w:type="dxa"/>
             </w:tcMar>
           </w:tcPr>
           <w:p>
             <w:r>
               <w:rPr>
                 <w:b/>
-                <w:sz w:val="18"/>
+                <w:color w:val="0F766E"/>
+                <w:sz w:val="17"/>
               </w:rPr>
-              <w:t>Dr. Hanumanth Sastry</w:t>
+              <w:t>Project-1</w:t>
             </w:r>
           </w:p>
         </w:tc>
@@ -564,20 +565,18 @@
             <w:tcW w:type="dxa" w:w="2340"/>
             <w:shd w:fill="F0FDFA"/>
             <w:tcMar>
-              <w:top w:w="90" w:type="dxa"/>
-              <w:bottom w:w="90" w:type="dxa"/>
-              <w:left w:w="100" w:type="dxa"/>
-              <w:right w:w="100" w:type="dxa"/>
+              <w:top w:w="100" w:type="dxa"/>
+              <w:bottom w:w="100" w:type="dxa"/>
+              <w:left w:w="120" w:type="dxa"/>
+              <w:right w:w="120" w:type="dxa"/>
             </w:tcMar>
           </w:tcPr>
           <w:p>
             <w:r>
               <w:rPr>
-                <w:sz w:val="18"/>
+                <w:sz w:val="17"/>
               </w:rPr>
-              <w:t>Professor (AIML)</w:t>
-              <w:br/>
-              <w:t>Dayananda Sagar University</w:t>
+              <w:t>Generative AI Powered Precision Psychiatry</w:t>
             </w:r>
           </w:p>
         </w:tc>
@@ -586,19 +585,20 @@
             <w:tcW w:type="dxa" w:w="2340"/>
             <w:shd w:fill="F0FDFA"/>
             <w:tcMar>
-              <w:top w:w="90" w:type="dxa"/>
-              <w:bottom w:w="90" w:type="dxa"/>
-              <w:left w:w="100" w:type="dxa"/>
-              <w:right w:w="100" w:type="dxa"/>
+              <w:top w:w="100" w:type="dxa"/>
+              <w:bottom w:w="100" w:type="dxa"/>
+              <w:left w:w="120" w:type="dxa"/>
+              <w:right w:w="120" w:type="dxa"/>
             </w:tcMar>
           </w:tcPr>
           <w:p>
             <w:r>
               <w:rPr>
-                <w:color w:val="0E7490"/>
-                <w:sz w:val="18"/>
+                <w:sz w:val="17"/>
               </w:rPr>
-              <w:t>hanusistla@gmail.com</w:t>
+              <w:t>Dr. Hanumanth Sastry Sistla &amp; Dr. Gopal Das</w:t>
+              <w:br/>
+              <w:t>Linked Patent: 202641025843 A</w:t>
             </w:r>
           </w:p>
         </w:tc>
@@ -607,24 +607,20 @@
             <w:tcW w:type="dxa" w:w="2340"/>
             <w:shd w:fill="F0FDFA"/>
             <w:tcMar>
-              <w:top w:w="90" w:type="dxa"/>
-              <w:bottom w:w="90" w:type="dxa"/>
-              <w:left w:w="100" w:type="dxa"/>
-              <w:right w:w="100" w:type="dxa"/>
+              <w:top w:w="100" w:type="dxa"/>
+              <w:bottom w:w="100" w:type="dxa"/>
+              <w:left w:w="120" w:type="dxa"/>
+              <w:right w:w="120" w:type="dxa"/>
             </w:tcMar>
           </w:tcPr>
           <w:p>
             <w:r>
               <w:rPr>
-                <w:sz w:val="18"/>
+                <w:sz w:val="17"/>
               </w:rPr>
-              <w:t>DSU Faculty: dsu.edu.in/hanumanth-ss</w:t>
+              <w:t>Problem: National Mental Health Survey (14.3% adult population, ~150M individuals, 70–92% treatment gap). Syndromic classification (DSM-5) causes diagnostic uncertainty (&gt;60% comorbidity), treatment non-response (30-50%), delayed intervention (10-15 yr delay in bipolar).</w:t>
               <w:br/>
-              <w:t>Google Scholar: citations?user=-Z66y_EAAAAJ</w:t>
-              <w:br/>
-              <w:t>Scopus ID: 60557811900</w:t>
-              <w:br/>
-              <w:t>LinkedIn: dr-hanumanth-sastry-sistla-693031165</w:t>
+              <w:t>Investigation: Observational study of Generative AI/ML on EEG-derived features for representation learning and latent neurophysiological markers.</w:t>
             </w:r>
           </w:p>
         </w:tc>
@@ -635,19 +631,20 @@
             <w:tcW w:type="dxa" w:w="2340"/>
             <w:shd w:fill="FFFFFF"/>
             <w:tcMar>
-              <w:top w:w="90" w:type="dxa"/>
-              <w:bottom w:w="90" w:type="dxa"/>
-              <w:left w:w="100" w:type="dxa"/>
-              <w:right w:w="100" w:type="dxa"/>
+              <w:top w:w="100" w:type="dxa"/>
+              <w:bottom w:w="100" w:type="dxa"/>
+              <w:left w:w="120" w:type="dxa"/>
+              <w:right w:w="120" w:type="dxa"/>
             </w:tcMar>
           </w:tcPr>
           <w:p>
             <w:r>
               <w:rPr>
                 <w:b/>
-                <w:sz w:val="18"/>
+                <w:color w:val="0F766E"/>
+                <w:sz w:val="17"/>
               </w:rPr>
-              <w:t>Dr. Gopal Das</w:t>
+              <w:t>Project-2</w:t>
             </w:r>
           </w:p>
         </w:tc>
@@ -656,20 +653,18 @@
             <w:tcW w:type="dxa" w:w="2340"/>
             <w:shd w:fill="FFFFFF"/>
             <w:tcMar>
-              <w:top w:w="90" w:type="dxa"/>
-              <w:bottom w:w="90" w:type="dxa"/>
-              <w:left w:w="100" w:type="dxa"/>
-              <w:right w:w="100" w:type="dxa"/>
+              <w:top w:w="100" w:type="dxa"/>
+              <w:bottom w:w="100" w:type="dxa"/>
+              <w:left w:w="120" w:type="dxa"/>
+              <w:right w:w="120" w:type="dxa"/>
             </w:tcMar>
           </w:tcPr>
           <w:p>
             <w:r>
               <w:rPr>
-                <w:sz w:val="18"/>
+                <w:sz w:val="17"/>
               </w:rPr>
-              <w:t>Professor (Psychiatry)</w:t>
-              <w:br/>
-              <w:t>CDSIMER</w:t>
+              <w:t>Generative AI Platform for Real-Time Cardiac Clinical Decision Support &amp; Procedural Guidance</w:t>
             </w:r>
           </w:p>
         </w:tc>
@@ -678,19 +673,20 @@
             <w:tcW w:type="dxa" w:w="2340"/>
             <w:shd w:fill="FFFFFF"/>
             <w:tcMar>
-              <w:top w:w="90" w:type="dxa"/>
-              <w:bottom w:w="90" w:type="dxa"/>
-              <w:left w:w="100" w:type="dxa"/>
-              <w:right w:w="100" w:type="dxa"/>
+              <w:top w:w="100" w:type="dxa"/>
+              <w:bottom w:w="100" w:type="dxa"/>
+              <w:left w:w="120" w:type="dxa"/>
+              <w:right w:w="120" w:type="dxa"/>
             </w:tcMar>
           </w:tcPr>
           <w:p>
             <w:r>
               <w:rPr>
-                <w:color w:val="0E7490"/>
-                <w:sz w:val="18"/>
+                <w:sz w:val="17"/>
               </w:rPr>
-              <w:t>drgopaldascm@gmail.com</w:t>
+              <w:t>Dr. Hanumanth Sastry Sistla &amp; Dr. Kiran Kumar Ramesh Dyawarkonda</w:t>
+              <w:br/>
+              <w:t>Linked Patent: IN202641041350 A1</w:t>
             </w:r>
           </w:p>
         </w:tc>
@@ -699,22 +695,20 @@
             <w:tcW w:type="dxa" w:w="2340"/>
             <w:shd w:fill="FFFFFF"/>
             <w:tcMar>
-              <w:top w:w="90" w:type="dxa"/>
-              <w:bottom w:w="90" w:type="dxa"/>
-              <w:left w:w="100" w:type="dxa"/>
-              <w:right w:w="100" w:type="dxa"/>
+              <w:top w:w="100" w:type="dxa"/>
+              <w:bottom w:w="100" w:type="dxa"/>
+              <w:left w:w="120" w:type="dxa"/>
+              <w:right w:w="120" w:type="dxa"/>
             </w:tcMar>
           </w:tcPr>
           <w:p>
             <w:r>
               <w:rPr>
-                <w:sz w:val="18"/>
+                <w:sz w:val="17"/>
               </w:rPr>
-              <w:t>CDSIMER Psychiatry Dept:</w:t>
+              <w:t>Problem: Cardiovascular mortality; cath lab, ICU, ED data fragmentation (ECG, echo, labs, history, risk scores); screen-based tools disconnect from sterile operative fields.</w:t>
               <w:br/>
-              <w:t>cdsimer.edu.in/departments/clincal/psychiatry</w:t>
-              <w:br/>
-              <w:t>Co-Inventor on 2 Published Precision Psychiatry Patents</w:t>
+              <w:t>Investigation: Wearable smart glasses with AR micro-display, multimodal LLM ingesting 12-lead ECG and imaging, step-by-step guidance for ACLS, PCI, valve replacements, and complication bailout.</w:t>
             </w:r>
           </w:p>
         </w:tc>
@@ -725,19 +719,20 @@
             <w:tcW w:type="dxa" w:w="2340"/>
             <w:shd w:fill="F0FDFA"/>
             <w:tcMar>
-              <w:top w:w="90" w:type="dxa"/>
-              <w:bottom w:w="90" w:type="dxa"/>
-              <w:left w:w="100" w:type="dxa"/>
-              <w:right w:w="100" w:type="dxa"/>
+              <w:top w:w="100" w:type="dxa"/>
+              <w:bottom w:w="100" w:type="dxa"/>
+              <w:left w:w="120" w:type="dxa"/>
+              <w:right w:w="120" w:type="dxa"/>
             </w:tcMar>
           </w:tcPr>
           <w:p>
             <w:r>
               <w:rPr>
                 <w:b/>
-                <w:sz w:val="18"/>
+                <w:color w:val="0F766E"/>
+                <w:sz w:val="17"/>
               </w:rPr>
-              <w:t>Dr. Kiran D</w:t>
+              <w:t>Project-3</w:t>
             </w:r>
           </w:p>
         </w:tc>
@@ -746,20 +741,18 @@
             <w:tcW w:type="dxa" w:w="2340"/>
             <w:shd w:fill="F0FDFA"/>
             <w:tcMar>
-              <w:top w:w="90" w:type="dxa"/>
-              <w:bottom w:w="90" w:type="dxa"/>
-              <w:left w:w="100" w:type="dxa"/>
-              <w:right w:w="100" w:type="dxa"/>
+              <w:top w:w="100" w:type="dxa"/>
+              <w:bottom w:w="100" w:type="dxa"/>
+              <w:left w:w="120" w:type="dxa"/>
+              <w:right w:w="120" w:type="dxa"/>
             </w:tcMar>
           </w:tcPr>
           <w:p>
             <w:r>
               <w:rPr>
-                <w:sz w:val="18"/>
+                <w:sz w:val="17"/>
               </w:rPr>
-              <w:t>Associate Professor (Cardiology)</w:t>
-              <w:br/>
-              <w:t>CDSIMER</w:t>
+              <w:t>Generative AI-Driven Multi-Agent Simulation for Certifiable Psychiatric Skills Training in Suicide Risk Assessment</w:t>
             </w:r>
           </w:p>
         </w:tc>
@@ -768,19 +761,20 @@
             <w:tcW w:type="dxa" w:w="2340"/>
             <w:shd w:fill="F0FDFA"/>
             <w:tcMar>
-              <w:top w:w="90" w:type="dxa"/>
-              <w:bottom w:w="90" w:type="dxa"/>
-              <w:left w:w="100" w:type="dxa"/>
-              <w:right w:w="100" w:type="dxa"/>
+              <w:top w:w="100" w:type="dxa"/>
+              <w:bottom w:w="100" w:type="dxa"/>
+              <w:left w:w="120" w:type="dxa"/>
+              <w:right w:w="120" w:type="dxa"/>
             </w:tcMar>
           </w:tcPr>
           <w:p>
             <w:r>
               <w:rPr>
-                <w:color w:val="0E7490"/>
-                <w:sz w:val="18"/>
+                <w:sz w:val="17"/>
               </w:rPr>
-              <w:t>kdyawarkonda@gmail.com</w:t>
+              <w:t>Dr. Gopal Das CM &amp; Dr. Hanumanth Sastry Sistla</w:t>
+              <w:br/>
+              <w:t>Linked Patent: 202641098894 A</w:t>
             </w:r>
           </w:p>
         </w:tc>
@@ -789,22 +783,20 @@
             <w:tcW w:type="dxa" w:w="2340"/>
             <w:shd w:fill="F0FDFA"/>
             <w:tcMar>
-              <w:top w:w="90" w:type="dxa"/>
-              <w:bottom w:w="90" w:type="dxa"/>
-              <w:left w:w="100" w:type="dxa"/>
-              <w:right w:w="100" w:type="dxa"/>
+              <w:top w:w="100" w:type="dxa"/>
+              <w:bottom w:w="100" w:type="dxa"/>
+              <w:left w:w="120" w:type="dxa"/>
+              <w:right w:w="120" w:type="dxa"/>
             </w:tcMar>
           </w:tcPr>
           <w:p>
             <w:r>
               <w:rPr>
-                <w:sz w:val="18"/>
+                <w:sz w:val="17"/>
               </w:rPr>
-              <w:t>CDSIMER Cardiology Dept:</w:t>
+              <w:t>Problem: Suicide risk assessment is highly subjective; National Medical Commission (NMC) CBME curriculum mandates certifiable Specific Learning Objectives (SLOs) and AETCOM competencies; real patients/actors do not scale ethically.</w:t>
               <w:br/>
-              <w:t>cdsimer.edu.in/departments/super-speciality/cardiology</w:t>
-              <w:br/>
-              <w:t>Co-Inventor on Interventional Cardiac AR Patent</w:t>
+              <w:t>Investigation: 4-agent ecosystem (Director, Patient Simulator, Evaluator, Safety Agent) with human-in-the-loop expert validation and VR/3D extensibility.</w:t>
             </w:r>
           </w:p>
         </w:tc>
@@ -1215,6 +1207,397 @@
         </w:tc>
       </w:tr>
     </w:tbl>
+    <w:p>
+      <w:pPr>
+        <w:spacing w:after="280"/>
+      </w:pPr>
+    </w:p>
+    <w:p>
+      <w:pPr>
+        <w:pStyle w:val="Heading1"/>
+      </w:pPr>
+      <w:r>
+        <w:rPr>
+          <w:color w:val="1E3A8A"/>
+        </w:rPr>
+        <w:t>4. Core Team Leadership &amp; Verified Academic Profiles</w:t>
+      </w:r>
+    </w:p>
+    <w:tbl>
+      <w:tblPr>
+        <w:tblW w:type="auto" w:w="0"/>
+        <w:jc w:val="center"/>
+        <w:tblLook w:firstColumn="1" w:firstRow="1" w:lastColumn="0" w:lastRow="0" w:noHBand="0" w:noVBand="1" w:val="04A0"/>
+      </w:tblPr>
+      <w:tblGrid>
+        <w:gridCol w:w="2340"/>
+        <w:gridCol w:w="2340"/>
+        <w:gridCol w:w="2340"/>
+        <w:gridCol w:w="2340"/>
+      </w:tblGrid>
+      <w:tr>
+        <w:tc>
+          <w:tcPr>
+            <w:tcW w:type="dxa" w:w="2340"/>
+            <w:shd w:fill="1E3A8A"/>
+            <w:tcMar>
+              <w:top w:w="120" w:type="dxa"/>
+              <w:bottom w:w="120" w:type="dxa"/>
+              <w:left w:w="120" w:type="dxa"/>
+              <w:right w:w="120" w:type="dxa"/>
+            </w:tcMar>
+          </w:tcPr>
+          <w:p>
+            <w:r>
+              <w:rPr>
+                <w:b/>
+                <w:color w:val="FFFFFF"/>
+                <w:sz w:val="19"/>
+              </w:rPr>
+              <w:t>Team Member</w:t>
+            </w:r>
+          </w:p>
+        </w:tc>
+        <w:tc>
+          <w:tcPr>
+            <w:tcW w:type="dxa" w:w="2340"/>
+            <w:shd w:fill="1E3A8A"/>
+            <w:tcMar>
+              <w:top w:w="120" w:type="dxa"/>
+              <w:bottom w:w="120" w:type="dxa"/>
+              <w:left w:w="120" w:type="dxa"/>
+              <w:right w:w="120" w:type="dxa"/>
+            </w:tcMar>
+          </w:tcPr>
+          <w:p>
+            <w:r>
+              <w:rPr>
+                <w:b/>
+                <w:color w:val="FFFFFF"/>
+                <w:sz w:val="19"/>
+              </w:rPr>
+              <w:t>Academic Title &amp; Department</w:t>
+            </w:r>
+          </w:p>
+        </w:tc>
+        <w:tc>
+          <w:tcPr>
+            <w:tcW w:type="dxa" w:w="2340"/>
+            <w:shd w:fill="1E3A8A"/>
+            <w:tcMar>
+              <w:top w:w="120" w:type="dxa"/>
+              <w:bottom w:w="120" w:type="dxa"/>
+              <w:left w:w="120" w:type="dxa"/>
+              <w:right w:w="120" w:type="dxa"/>
+            </w:tcMar>
+          </w:tcPr>
+          <w:p>
+            <w:r>
+              <w:rPr>
+                <w:b/>
+                <w:color w:val="FFFFFF"/>
+                <w:sz w:val="19"/>
+              </w:rPr>
+              <w:t>Direct Email Address</w:t>
+            </w:r>
+          </w:p>
+        </w:tc>
+        <w:tc>
+          <w:tcPr>
+            <w:tcW w:type="dxa" w:w="2340"/>
+            <w:shd w:fill="1E3A8A"/>
+            <w:tcMar>
+              <w:top w:w="120" w:type="dxa"/>
+              <w:bottom w:w="120" w:type="dxa"/>
+              <w:left w:w="120" w:type="dxa"/>
+              <w:right w:w="120" w:type="dxa"/>
+            </w:tcMar>
+          </w:tcPr>
+          <w:p>
+            <w:r>
+              <w:rPr>
+                <w:b/>
+                <w:color w:val="FFFFFF"/>
+                <w:sz w:val="19"/>
+              </w:rPr>
+              <w:t>Institutional &amp; Academic Hyperlinks</w:t>
+            </w:r>
+          </w:p>
+        </w:tc>
+      </w:tr>
+      <w:tr>
+        <w:tc>
+          <w:tcPr>
+            <w:tcW w:type="dxa" w:w="2340"/>
+            <w:shd w:fill="F0FDFA"/>
+            <w:tcMar>
+              <w:top w:w="90" w:type="dxa"/>
+              <w:bottom w:w="90" w:type="dxa"/>
+              <w:left w:w="100" w:type="dxa"/>
+              <w:right w:w="100" w:type="dxa"/>
+            </w:tcMar>
+          </w:tcPr>
+          <w:p>
+            <w:r>
+              <w:rPr>
+                <w:b/>
+                <w:sz w:val="18"/>
+              </w:rPr>
+              <w:t>Dr. Hanumanth Sastry</w:t>
+            </w:r>
+          </w:p>
+        </w:tc>
+        <w:tc>
+          <w:tcPr>
+            <w:tcW w:type="dxa" w:w="2340"/>
+            <w:shd w:fill="F0FDFA"/>
+            <w:tcMar>
+              <w:top w:w="90" w:type="dxa"/>
+              <w:bottom w:w="90" w:type="dxa"/>
+              <w:left w:w="100" w:type="dxa"/>
+              <w:right w:w="100" w:type="dxa"/>
+            </w:tcMar>
+          </w:tcPr>
+          <w:p>
+            <w:r>
+              <w:rPr>
+                <w:sz w:val="18"/>
+              </w:rPr>
+              <w:t>Professor (AIML)</w:t>
+              <w:br/>
+              <w:t>Dayananda Sagar University</w:t>
+            </w:r>
+          </w:p>
+        </w:tc>
+        <w:tc>
+          <w:tcPr>
+            <w:tcW w:type="dxa" w:w="2340"/>
+            <w:shd w:fill="F0FDFA"/>
+            <w:tcMar>
+              <w:top w:w="90" w:type="dxa"/>
+              <w:bottom w:w="90" w:type="dxa"/>
+              <w:left w:w="100" w:type="dxa"/>
+              <w:right w:w="100" w:type="dxa"/>
+            </w:tcMar>
+          </w:tcPr>
+          <w:p>
+            <w:r>
+              <w:rPr>
+                <w:color w:val="0E7490"/>
+                <w:sz w:val="18"/>
+              </w:rPr>
+              <w:t>hanusistla@gmail.com</w:t>
+            </w:r>
+          </w:p>
+        </w:tc>
+        <w:tc>
+          <w:tcPr>
+            <w:tcW w:type="dxa" w:w="2340"/>
+            <w:shd w:fill="F0FDFA"/>
+            <w:tcMar>
+              <w:top w:w="90" w:type="dxa"/>
+              <w:bottom w:w="90" w:type="dxa"/>
+              <w:left w:w="100" w:type="dxa"/>
+              <w:right w:w="100" w:type="dxa"/>
+            </w:tcMar>
+          </w:tcPr>
+          <w:p>
+            <w:r>
+              <w:rPr>
+                <w:sz w:val="18"/>
+              </w:rPr>
+              <w:t>DSU Faculty: dsu.edu.in/hanumanth-ss</w:t>
+              <w:br/>
+              <w:t>Google Scholar: citations?user=-Z66y_EAAAAJ</w:t>
+              <w:br/>
+              <w:t>Scopus ID: 60557811900</w:t>
+              <w:br/>
+              <w:t>LinkedIn: dr-hanumanth-sastry-sistla-693031165</w:t>
+            </w:r>
+          </w:p>
+        </w:tc>
+      </w:tr>
+      <w:tr>
+        <w:tc>
+          <w:tcPr>
+            <w:tcW w:type="dxa" w:w="2340"/>
+            <w:shd w:fill="FFFFFF"/>
+            <w:tcMar>
+              <w:top w:w="90" w:type="dxa"/>
+              <w:bottom w:w="90" w:type="dxa"/>
+              <w:left w:w="100" w:type="dxa"/>
+              <w:right w:w="100" w:type="dxa"/>
+            </w:tcMar>
+          </w:tcPr>
+          <w:p>
+            <w:r>
+              <w:rPr>
+                <w:b/>
+                <w:sz w:val="18"/>
+              </w:rPr>
+              <w:t>Dr. Gopal Das</w:t>
+            </w:r>
+          </w:p>
+        </w:tc>
+        <w:tc>
+          <w:tcPr>
+            <w:tcW w:type="dxa" w:w="2340"/>
+            <w:shd w:fill="FFFFFF"/>
+            <w:tcMar>
+              <w:top w:w="90" w:type="dxa"/>
+              <w:bottom w:w="90" w:type="dxa"/>
+              <w:left w:w="100" w:type="dxa"/>
+              <w:right w:w="100" w:type="dxa"/>
+            </w:tcMar>
+          </w:tcPr>
+          <w:p>
+            <w:r>
+              <w:rPr>
+                <w:sz w:val="18"/>
+              </w:rPr>
+              <w:t>Professor (Psychiatry)</w:t>
+              <w:br/>
+              <w:t>CDSIMER</w:t>
+            </w:r>
+          </w:p>
+        </w:tc>
+        <w:tc>
+          <w:tcPr>
+            <w:tcW w:type="dxa" w:w="2340"/>
+            <w:shd w:fill="FFFFFF"/>
+            <w:tcMar>
+              <w:top w:w="90" w:type="dxa"/>
+              <w:bottom w:w="90" w:type="dxa"/>
+              <w:left w:w="100" w:type="dxa"/>
+              <w:right w:w="100" w:type="dxa"/>
+            </w:tcMar>
+          </w:tcPr>
+          <w:p>
+            <w:r>
+              <w:rPr>
+                <w:color w:val="0E7490"/>
+                <w:sz w:val="18"/>
+              </w:rPr>
+              <w:t>drgopaldascm@gmail.com</w:t>
+            </w:r>
+          </w:p>
+        </w:tc>
+        <w:tc>
+          <w:tcPr>
+            <w:tcW w:type="dxa" w:w="2340"/>
+            <w:shd w:fill="FFFFFF"/>
+            <w:tcMar>
+              <w:top w:w="90" w:type="dxa"/>
+              <w:bottom w:w="90" w:type="dxa"/>
+              <w:left w:w="100" w:type="dxa"/>
+              <w:right w:w="100" w:type="dxa"/>
+            </w:tcMar>
+          </w:tcPr>
+          <w:p>
+            <w:r>
+              <w:rPr>
+                <w:sz w:val="18"/>
+              </w:rPr>
+              <w:t>CDSIMER Psychiatry Dept:</w:t>
+              <w:br/>
+              <w:t>cdsimer.edu.in/departments/clincal/psychiatry</w:t>
+              <w:br/>
+              <w:t>Co-Inventor on 2 Published Precision Psychiatry Patents</w:t>
+            </w:r>
+          </w:p>
+        </w:tc>
+      </w:tr>
+      <w:tr>
+        <w:tc>
+          <w:tcPr>
+            <w:tcW w:type="dxa" w:w="2340"/>
+            <w:shd w:fill="F0FDFA"/>
+            <w:tcMar>
+              <w:top w:w="90" w:type="dxa"/>
+              <w:bottom w:w="90" w:type="dxa"/>
+              <w:left w:w="100" w:type="dxa"/>
+              <w:right w:w="100" w:type="dxa"/>
+            </w:tcMar>
+          </w:tcPr>
+          <w:p>
+            <w:r>
+              <w:rPr>
+                <w:b/>
+                <w:sz w:val="18"/>
+              </w:rPr>
+              <w:t>Dr. Kiran D</w:t>
+            </w:r>
+          </w:p>
+        </w:tc>
+        <w:tc>
+          <w:tcPr>
+            <w:tcW w:type="dxa" w:w="2340"/>
+            <w:shd w:fill="F0FDFA"/>
+            <w:tcMar>
+              <w:top w:w="90" w:type="dxa"/>
+              <w:bottom w:w="90" w:type="dxa"/>
+              <w:left w:w="100" w:type="dxa"/>
+              <w:right w:w="100" w:type="dxa"/>
+            </w:tcMar>
+          </w:tcPr>
+          <w:p>
+            <w:r>
+              <w:rPr>
+                <w:sz w:val="18"/>
+              </w:rPr>
+              <w:t>Associate Professor (Cardiology)</w:t>
+              <w:br/>
+              <w:t>CDSIMER</w:t>
+            </w:r>
+          </w:p>
+        </w:tc>
+        <w:tc>
+          <w:tcPr>
+            <w:tcW w:type="dxa" w:w="2340"/>
+            <w:shd w:fill="F0FDFA"/>
+            <w:tcMar>
+              <w:top w:w="90" w:type="dxa"/>
+              <w:bottom w:w="90" w:type="dxa"/>
+              <w:left w:w="100" w:type="dxa"/>
+              <w:right w:w="100" w:type="dxa"/>
+            </w:tcMar>
+          </w:tcPr>
+          <w:p>
+            <w:r>
+              <w:rPr>
+                <w:color w:val="0E7490"/>
+                <w:sz w:val="18"/>
+              </w:rPr>
+              <w:t>kdyawarkonda@gmail.com</w:t>
+            </w:r>
+          </w:p>
+        </w:tc>
+        <w:tc>
+          <w:tcPr>
+            <w:tcW w:type="dxa" w:w="2340"/>
+            <w:shd w:fill="F0FDFA"/>
+            <w:tcMar>
+              <w:top w:w="90" w:type="dxa"/>
+              <w:bottom w:w="90" w:type="dxa"/>
+              <w:left w:w="100" w:type="dxa"/>
+              <w:right w:w="100" w:type="dxa"/>
+            </w:tcMar>
+          </w:tcPr>
+          <w:p>
+            <w:r>
+              <w:rPr>
+                <w:sz w:val="18"/>
+              </w:rPr>
+              <w:t>CDSIMER Cardiology Dept:</w:t>
+              <w:br/>
+              <w:t>cdsimer.edu.in/departments/super-speciality/cardiology</w:t>
+              <w:br/>
+              <w:t>Co-Inventor on Interventional Cardiac AR Patent</w:t>
+            </w:r>
+          </w:p>
+        </w:tc>
+      </w:tr>
+    </w:tbl>
     <w:sectPr>
       <w:pgSz w:w="12240" w:h="15840"/>
       <w:pgMar w:top="1440" w:right="1440" w:bottom="1440" w:left="1440" w:header="720" w:footer="720" w:gutter="0"/>

</xml_diff>

<commit_message>
Configure production CONTACTS_KV namespace ID d7d21e7a44e641d2b9a55d2c42677239
</commit_message>
<xml_diff>
--- a/Website_Update_Roadmap_PrimeTechnologies.docx
+++ b/Website_Update_Roadmap_PrimeTechnologies.docx
@@ -27,7 +27,7 @@
           <w:color w:val="475569"/>
           <w:sz w:val="26"/>
         </w:rPr>
-        <w:t>Prime Technologies | AI Pathways: Bridging Academic Research, Clinical Projects &amp; Enterprise Production</w:t>
+        <w:t>Prime Technologies | AI Pathways: Bridging Academic Research, Clinical Patents &amp; Enterprise Production</w:t>
       </w:r>
     </w:p>
     <w:p>
@@ -118,7 +118,109 @@
                 <w:color w:val="1E293B"/>
                 <w:sz w:val="19"/>
               </w:rPr>
-              <w:t>Published Projects &amp; Patents URL</w:t>
+              <w:t>Admin Portal (Protected)</w:t>
+            </w:r>
+          </w:p>
+        </w:tc>
+        <w:tc>
+          <w:tcPr>
+            <w:tcW w:type="dxa" w:w="4680"/>
+            <w:shd w:fill="FFFFFF"/>
+            <w:tcMar>
+              <w:top w:w="90" w:type="dxa"/>
+              <w:bottom w:w="90" w:type="dxa"/>
+              <w:left w:w="120" w:type="dxa"/>
+              <w:right w:w="120" w:type="dxa"/>
+            </w:tcMar>
+          </w:tcPr>
+          <w:p>
+            <w:pPr>
+              <w:spacing w:after="40"/>
+            </w:pPr>
+            <w:r>
+              <w:rPr>
+                <w:color w:val="0F172A"/>
+                <w:sz w:val="19"/>
+              </w:rPr>
+              <w:t>https://primetechnologies.hanusistla.workers.dev/admin (Passkey: sistla123)</w:t>
+            </w:r>
+          </w:p>
+        </w:tc>
+      </w:tr>
+      <w:tr>
+        <w:tc>
+          <w:tcPr>
+            <w:tcW w:type="dxa" w:w="4680"/>
+            <w:shd w:fill="F1F5F9"/>
+            <w:tcMar>
+              <w:top w:w="90" w:type="dxa"/>
+              <w:bottom w:w="90" w:type="dxa"/>
+              <w:left w:w="120" w:type="dxa"/>
+              <w:right w:w="120" w:type="dxa"/>
+            </w:tcMar>
+          </w:tcPr>
+          <w:p>
+            <w:pPr>
+              <w:spacing w:after="40"/>
+            </w:pPr>
+            <w:r>
+              <w:rPr>
+                <w:b/>
+                <w:color w:val="1E293B"/>
+                <w:sz w:val="19"/>
+              </w:rPr>
+              <w:t>Contact Scoping Endpoint</w:t>
+            </w:r>
+          </w:p>
+        </w:tc>
+        <w:tc>
+          <w:tcPr>
+            <w:tcW w:type="dxa" w:w="4680"/>
+            <w:shd w:fill="FFFFFF"/>
+            <w:tcMar>
+              <w:top w:w="90" w:type="dxa"/>
+              <w:bottom w:w="90" w:type="dxa"/>
+              <w:left w:w="120" w:type="dxa"/>
+              <w:right w:w="120" w:type="dxa"/>
+            </w:tcMar>
+          </w:tcPr>
+          <w:p>
+            <w:pPr>
+              <w:spacing w:after="40"/>
+            </w:pPr>
+            <w:r>
+              <w:rPr>
+                <w:color w:val="0F172A"/>
+                <w:sz w:val="19"/>
+              </w:rPr>
+              <w:t>https://primetechnologies.hanusistla.workers.dev/contact (Cloudflare Workers KV)</w:t>
+            </w:r>
+          </w:p>
+        </w:tc>
+      </w:tr>
+      <w:tr>
+        <w:tc>
+          <w:tcPr>
+            <w:tcW w:type="dxa" w:w="4680"/>
+            <w:shd w:fill="F1F5F9"/>
+            <w:tcMar>
+              <w:top w:w="90" w:type="dxa"/>
+              <w:bottom w:w="90" w:type="dxa"/>
+              <w:left w:w="120" w:type="dxa"/>
+              <w:right w:w="120" w:type="dxa"/>
+            </w:tcMar>
+          </w:tcPr>
+          <w:p>
+            <w:pPr>
+              <w:spacing w:after="40"/>
+            </w:pPr>
+            <w:r>
+              <w:rPr>
+                <w:b/>
+                <w:color w:val="1E293B"/>
+                <w:sz w:val="19"/>
+              </w:rPr>
+              <w:t>Published Patents URL</w:t>
             </w:r>
           </w:p>
         </w:tc>
@@ -169,7 +271,7 @@
                 <w:color w:val="1E293B"/>
                 <w:sz w:val="19"/>
               </w:rPr>
-              <w:t>Development Environment</w:t>
+              <w:t>KV Namespace ID &amp; Binding</w:t>
             </w:r>
           </w:p>
         </w:tc>
@@ -193,7 +295,7 @@
                 <w:color w:val="0F172A"/>
                 <w:sz w:val="19"/>
               </w:rPr>
-              <w:t>https://primetechnologies.lovable.app (Lovable Studio)</w:t>
+              <w:t>Binding: CONTACTS_KV | ID: d7d21e7a44e641d2b9a55d2c42677239</w:t>
             </w:r>
           </w:p>
         </w:tc>
@@ -245,57 +347,6 @@
                 <w:sz w:val="19"/>
               </w:rPr>
               <w:t>https://github.com/hanumanthsistla/primetechnologies (Branch: main)</w:t>
-            </w:r>
-          </w:p>
-        </w:tc>
-      </w:tr>
-      <w:tr>
-        <w:tc>
-          <w:tcPr>
-            <w:tcW w:type="dxa" w:w="4680"/>
-            <w:shd w:fill="F1F5F9"/>
-            <w:tcMar>
-              <w:top w:w="90" w:type="dxa"/>
-              <w:bottom w:w="90" w:type="dxa"/>
-              <w:left w:w="120" w:type="dxa"/>
-              <w:right w:w="120" w:type="dxa"/>
-            </w:tcMar>
-          </w:tcPr>
-          <w:p>
-            <w:pPr>
-              <w:spacing w:after="40"/>
-            </w:pPr>
-            <w:r>
-              <w:rPr>
-                <w:b/>
-                <w:color w:val="1E293B"/>
-                <w:sz w:val="19"/>
-              </w:rPr>
-              <w:t>Research Knowledge Base</w:t>
-            </w:r>
-          </w:p>
-        </w:tc>
-        <w:tc>
-          <w:tcPr>
-            <w:tcW w:type="dxa" w:w="4680"/>
-            <w:shd w:fill="FFFFFF"/>
-            <w:tcMar>
-              <w:top w:w="90" w:type="dxa"/>
-              <w:bottom w:w="90" w:type="dxa"/>
-              <w:left w:w="120" w:type="dxa"/>
-              <w:right w:w="120" w:type="dxa"/>
-            </w:tcMar>
-          </w:tcPr>
-          <w:p>
-            <w:pPr>
-              <w:spacing w:after="40"/>
-            </w:pPr>
-            <w:r>
-              <w:rPr>
-                <w:color w:val="0F172A"/>
-                <w:sz w:val="19"/>
-              </w:rPr>
-              <w:t>https://sites.google.com/view/hanuaiml/applied-ai-aiml-generative-ai-agentic-ai</w:t>
             </w:r>
           </w:p>
         </w:tc>
@@ -397,7 +448,7 @@
                 <w:color w:val="0F172A"/>
                 <w:sz w:val="19"/>
               </w:rPr>
-              <w:t>Version 1.5 — 3 Clinical Research Projects &amp; 3 Official Patents (October 2026)</w:t>
+              <w:t>Version 1.7 — Provisioned Cloudflare KV (d7d21e7a44e641d2b9a55d2c42677239) Configured</w:t>
             </w:r>
           </w:p>
         </w:tc>
@@ -421,7 +472,7 @@
     </w:p>
     <w:p>
       <w:r>
-        <w:t>Prime Technologies (AI Pathways) bridges senior computer science research in Applied ML, Generative AI, and Agentic Systems with clinical and enterprise production. The digital platform features 3 deep Clinical AI Research Projects and 3 official Indian Patent publications under the Healthcare &amp; Life Sciences vertical, establishing verifiable technical authority across interventional cardiology and precision psychiatry.</w:t>
+        <w:t>Prime Technologies (AI Pathways) provides enterprise AI systems, bridging deep academic computer science with clinical cardiology and precision psychiatry. To support high-value enterprise scoping requests, the platform incorporates an edge-native data persistence architecture powered by Cloudflare Workers KV (binding: CONTACTS_KV, namespace ID: d7d21e7a44e641d2b9a55d2c42677239). Scoping requests submitted via /contact are captured with international calling codes, validated, and stored in KV. Leadership can securely inspect, filter, and analyze submissions through a dedicated Admin Portal at /admin protected by passkey "sistla123".</w:t>
       </w:r>
     </w:p>
     <w:p>
@@ -432,1172 +483,84 @@
         <w:rPr>
           <w:color w:val="1E3A8A"/>
         </w:rPr>
-        <w:t>2. Clinical AI Research Projects (Published on Healthcare Tab)</w:t>
+        <w:t>2. Cloudflare Workers KV Data Store &amp; Ingestion Architecture</w:t>
       </w:r>
     </w:p>
-    <w:tbl>
-      <w:tblPr>
-        <w:tblW w:type="auto" w:w="0"/>
-        <w:jc w:val="center"/>
-        <w:tblLook w:firstColumn="1" w:firstRow="1" w:lastColumn="0" w:lastRow="0" w:noHBand="0" w:noVBand="1" w:val="04A0"/>
-      </w:tblPr>
-      <w:tblGrid>
-        <w:gridCol w:w="2340"/>
-        <w:gridCol w:w="2340"/>
-        <w:gridCol w:w="2340"/>
-        <w:gridCol w:w="2340"/>
-      </w:tblGrid>
-      <w:tr>
-        <w:tc>
-          <w:tcPr>
-            <w:tcW w:type="dxa" w:w="2340"/>
-            <w:shd w:fill="0F766E"/>
-            <w:tcMar>
-              <w:top w:w="120" w:type="dxa"/>
-              <w:bottom w:w="120" w:type="dxa"/>
-              <w:left w:w="120" w:type="dxa"/>
-              <w:right w:w="120" w:type="dxa"/>
-            </w:tcMar>
-          </w:tcPr>
-          <w:p>
-            <w:r>
-              <w:rPr>
-                <w:b/>
-                <w:color w:val="FFFFFF"/>
-                <w:sz w:val="19"/>
-              </w:rPr>
-              <w:t>Project Identifier</w:t>
-            </w:r>
-          </w:p>
-        </w:tc>
-        <w:tc>
-          <w:tcPr>
-            <w:tcW w:type="dxa" w:w="2340"/>
-            <w:shd w:fill="0F766E"/>
-            <w:tcMar>
-              <w:top w:w="120" w:type="dxa"/>
-              <w:bottom w:w="120" w:type="dxa"/>
-              <w:left w:w="120" w:type="dxa"/>
-              <w:right w:w="120" w:type="dxa"/>
-            </w:tcMar>
-          </w:tcPr>
-          <w:p>
-            <w:r>
-              <w:rPr>
-                <w:b/>
-                <w:color w:val="FFFFFF"/>
-                <w:sz w:val="19"/>
-              </w:rPr>
-              <w:t>Project Title</w:t>
-            </w:r>
-          </w:p>
-        </w:tc>
-        <w:tc>
-          <w:tcPr>
-            <w:tcW w:type="dxa" w:w="2340"/>
-            <w:shd w:fill="0F766E"/>
-            <w:tcMar>
-              <w:top w:w="120" w:type="dxa"/>
-              <w:bottom w:w="120" w:type="dxa"/>
-              <w:left w:w="120" w:type="dxa"/>
-              <w:right w:w="120" w:type="dxa"/>
-            </w:tcMar>
-          </w:tcPr>
-          <w:p>
-            <w:r>
-              <w:rPr>
-                <w:b/>
-                <w:color w:val="FFFFFF"/>
-                <w:sz w:val="19"/>
-              </w:rPr>
-              <w:t>Faculty Leadership &amp; Linked Patent</w:t>
-            </w:r>
-          </w:p>
-        </w:tc>
-        <w:tc>
-          <w:tcPr>
-            <w:tcW w:type="dxa" w:w="2340"/>
-            <w:shd w:fill="0F766E"/>
-            <w:tcMar>
-              <w:top w:w="120" w:type="dxa"/>
-              <w:bottom w:w="120" w:type="dxa"/>
-              <w:left w:w="120" w:type="dxa"/>
-              <w:right w:w="120" w:type="dxa"/>
-            </w:tcMar>
-          </w:tcPr>
-          <w:p>
-            <w:r>
-              <w:rPr>
-                <w:b/>
-                <w:color w:val="FFFFFF"/>
-                <w:sz w:val="19"/>
-              </w:rPr>
-              <w:t>Clinical Problem &amp; Investigation Scope</w:t>
-            </w:r>
-          </w:p>
-        </w:tc>
-      </w:tr>
-      <w:tr>
-        <w:tc>
-          <w:tcPr>
-            <w:tcW w:type="dxa" w:w="2340"/>
-            <w:shd w:fill="F0FDFA"/>
-            <w:tcMar>
-              <w:top w:w="100" w:type="dxa"/>
-              <w:bottom w:w="100" w:type="dxa"/>
-              <w:left w:w="120" w:type="dxa"/>
-              <w:right w:w="120" w:type="dxa"/>
-            </w:tcMar>
-          </w:tcPr>
-          <w:p>
-            <w:r>
-              <w:rPr>
-                <w:b/>
-                <w:color w:val="0F766E"/>
-                <w:sz w:val="17"/>
-              </w:rPr>
-              <w:t>Project-1</w:t>
-            </w:r>
-          </w:p>
-        </w:tc>
-        <w:tc>
-          <w:tcPr>
-            <w:tcW w:type="dxa" w:w="2340"/>
-            <w:shd w:fill="F0FDFA"/>
-            <w:tcMar>
-              <w:top w:w="100" w:type="dxa"/>
-              <w:bottom w:w="100" w:type="dxa"/>
-              <w:left w:w="120" w:type="dxa"/>
-              <w:right w:w="120" w:type="dxa"/>
-            </w:tcMar>
-          </w:tcPr>
-          <w:p>
-            <w:r>
-              <w:rPr>
-                <w:sz w:val="17"/>
-              </w:rPr>
-              <w:t>Generative AI Powered Precision Psychiatry</w:t>
-            </w:r>
-          </w:p>
-        </w:tc>
-        <w:tc>
-          <w:tcPr>
-            <w:tcW w:type="dxa" w:w="2340"/>
-            <w:shd w:fill="F0FDFA"/>
-            <w:tcMar>
-              <w:top w:w="100" w:type="dxa"/>
-              <w:bottom w:w="100" w:type="dxa"/>
-              <w:left w:w="120" w:type="dxa"/>
-              <w:right w:w="120" w:type="dxa"/>
-            </w:tcMar>
-          </w:tcPr>
-          <w:p>
-            <w:r>
-              <w:rPr>
-                <w:sz w:val="17"/>
-              </w:rPr>
-              <w:t>Dr. Hanumanth Sastry Sistla &amp; Dr. Gopal Das</w:t>
-              <w:br/>
-              <w:t>Linked Patent: 202641025843 A</w:t>
-            </w:r>
-          </w:p>
-        </w:tc>
-        <w:tc>
-          <w:tcPr>
-            <w:tcW w:type="dxa" w:w="2340"/>
-            <w:shd w:fill="F0FDFA"/>
-            <w:tcMar>
-              <w:top w:w="100" w:type="dxa"/>
-              <w:bottom w:w="100" w:type="dxa"/>
-              <w:left w:w="120" w:type="dxa"/>
-              <w:right w:w="120" w:type="dxa"/>
-            </w:tcMar>
-          </w:tcPr>
-          <w:p>
-            <w:r>
-              <w:rPr>
-                <w:sz w:val="17"/>
-              </w:rPr>
-              <w:t>Problem: National Mental Health Survey (14.3% adult population, ~150M individuals, 70–92% treatment gap). Syndromic classification (DSM-5) causes diagnostic uncertainty (&gt;60% comorbidity), treatment non-response (30-50%), delayed intervention (10-15 yr delay in bipolar).</w:t>
-              <w:br/>
-              <w:t>Investigation: Observational study of Generative AI/ML on EEG-derived features for representation learning and latent neurophysiological markers.</w:t>
-            </w:r>
-          </w:p>
-        </w:tc>
-      </w:tr>
-      <w:tr>
-        <w:tc>
-          <w:tcPr>
-            <w:tcW w:type="dxa" w:w="2340"/>
-            <w:shd w:fill="FFFFFF"/>
-            <w:tcMar>
-              <w:top w:w="100" w:type="dxa"/>
-              <w:bottom w:w="100" w:type="dxa"/>
-              <w:left w:w="120" w:type="dxa"/>
-              <w:right w:w="120" w:type="dxa"/>
-            </w:tcMar>
-          </w:tcPr>
-          <w:p>
-            <w:r>
-              <w:rPr>
-                <w:b/>
-                <w:color w:val="0F766E"/>
-                <w:sz w:val="17"/>
-              </w:rPr>
-              <w:t>Project-2</w:t>
-            </w:r>
-          </w:p>
-        </w:tc>
-        <w:tc>
-          <w:tcPr>
-            <w:tcW w:type="dxa" w:w="2340"/>
-            <w:shd w:fill="FFFFFF"/>
-            <w:tcMar>
-              <w:top w:w="100" w:type="dxa"/>
-              <w:bottom w:w="100" w:type="dxa"/>
-              <w:left w:w="120" w:type="dxa"/>
-              <w:right w:w="120" w:type="dxa"/>
-            </w:tcMar>
-          </w:tcPr>
-          <w:p>
-            <w:r>
-              <w:rPr>
-                <w:sz w:val="17"/>
-              </w:rPr>
-              <w:t>Generative AI Platform for Real-Time Cardiac Clinical Decision Support &amp; Procedural Guidance</w:t>
-            </w:r>
-          </w:p>
-        </w:tc>
-        <w:tc>
-          <w:tcPr>
-            <w:tcW w:type="dxa" w:w="2340"/>
-            <w:shd w:fill="FFFFFF"/>
-            <w:tcMar>
-              <w:top w:w="100" w:type="dxa"/>
-              <w:bottom w:w="100" w:type="dxa"/>
-              <w:left w:w="120" w:type="dxa"/>
-              <w:right w:w="120" w:type="dxa"/>
-            </w:tcMar>
-          </w:tcPr>
-          <w:p>
-            <w:r>
-              <w:rPr>
-                <w:sz w:val="17"/>
-              </w:rPr>
-              <w:t>Dr. Hanumanth Sastry Sistla &amp; Dr. Kiran Kumar Ramesh Dyawarkonda</w:t>
-              <w:br/>
-              <w:t>Linked Patent: IN202641041350 A1</w:t>
-            </w:r>
-          </w:p>
-        </w:tc>
-        <w:tc>
-          <w:tcPr>
-            <w:tcW w:type="dxa" w:w="2340"/>
-            <w:shd w:fill="FFFFFF"/>
-            <w:tcMar>
-              <w:top w:w="100" w:type="dxa"/>
-              <w:bottom w:w="100" w:type="dxa"/>
-              <w:left w:w="120" w:type="dxa"/>
-              <w:right w:w="120" w:type="dxa"/>
-            </w:tcMar>
-          </w:tcPr>
-          <w:p>
-            <w:r>
-              <w:rPr>
-                <w:sz w:val="17"/>
-              </w:rPr>
-              <w:t>Problem: Cardiovascular mortality; cath lab, ICU, ED data fragmentation (ECG, echo, labs, history, risk scores); screen-based tools disconnect from sterile operative fields.</w:t>
-              <w:br/>
-              <w:t>Investigation: Wearable smart glasses with AR micro-display, multimodal LLM ingesting 12-lead ECG and imaging, step-by-step guidance for ACLS, PCI, valve replacements, and complication bailout.</w:t>
-            </w:r>
-          </w:p>
-        </w:tc>
-      </w:tr>
-      <w:tr>
-        <w:tc>
-          <w:tcPr>
-            <w:tcW w:type="dxa" w:w="2340"/>
-            <w:shd w:fill="F0FDFA"/>
-            <w:tcMar>
-              <w:top w:w="100" w:type="dxa"/>
-              <w:bottom w:w="100" w:type="dxa"/>
-              <w:left w:w="120" w:type="dxa"/>
-              <w:right w:w="120" w:type="dxa"/>
-            </w:tcMar>
-          </w:tcPr>
-          <w:p>
-            <w:r>
-              <w:rPr>
-                <w:b/>
-                <w:color w:val="0F766E"/>
-                <w:sz w:val="17"/>
-              </w:rPr>
-              <w:t>Project-3</w:t>
-            </w:r>
-          </w:p>
-        </w:tc>
-        <w:tc>
-          <w:tcPr>
-            <w:tcW w:type="dxa" w:w="2340"/>
-            <w:shd w:fill="F0FDFA"/>
-            <w:tcMar>
-              <w:top w:w="100" w:type="dxa"/>
-              <w:bottom w:w="100" w:type="dxa"/>
-              <w:left w:w="120" w:type="dxa"/>
-              <w:right w:w="120" w:type="dxa"/>
-            </w:tcMar>
-          </w:tcPr>
-          <w:p>
-            <w:r>
-              <w:rPr>
-                <w:sz w:val="17"/>
-              </w:rPr>
-              <w:t>Generative AI-Driven Multi-Agent Simulation for Certifiable Psychiatric Skills Training in Suicide Risk Assessment</w:t>
-            </w:r>
-          </w:p>
-        </w:tc>
-        <w:tc>
-          <w:tcPr>
-            <w:tcW w:type="dxa" w:w="2340"/>
-            <w:shd w:fill="F0FDFA"/>
-            <w:tcMar>
-              <w:top w:w="100" w:type="dxa"/>
-              <w:bottom w:w="100" w:type="dxa"/>
-              <w:left w:w="120" w:type="dxa"/>
-              <w:right w:w="120" w:type="dxa"/>
-            </w:tcMar>
-          </w:tcPr>
-          <w:p>
-            <w:r>
-              <w:rPr>
-                <w:sz w:val="17"/>
-              </w:rPr>
-              <w:t>Dr. Gopal Das CM &amp; Dr. Hanumanth Sastry Sistla</w:t>
-              <w:br/>
-              <w:t>Linked Patent: 202641098894 A</w:t>
-            </w:r>
-          </w:p>
-        </w:tc>
-        <w:tc>
-          <w:tcPr>
-            <w:tcW w:type="dxa" w:w="2340"/>
-            <w:shd w:fill="F0FDFA"/>
-            <w:tcMar>
-              <w:top w:w="100" w:type="dxa"/>
-              <w:bottom w:w="100" w:type="dxa"/>
-              <w:left w:w="120" w:type="dxa"/>
-              <w:right w:w="120" w:type="dxa"/>
-            </w:tcMar>
-          </w:tcPr>
-          <w:p>
-            <w:r>
-              <w:rPr>
-                <w:sz w:val="17"/>
-              </w:rPr>
-              <w:t>Problem: Suicide risk assessment is highly subjective; National Medical Commission (NMC) CBME curriculum mandates certifiable Specific Learning Objectives (SLOs) and AETCOM competencies; real patients/actors do not scale ethically.</w:t>
-              <w:br/>
-              <w:t>Investigation: 4-agent ecosystem (Director, Patient Simulator, Evaluator, Safety Agent) with human-in-the-loop expert validation and VR/3D extensibility.</w:t>
-            </w:r>
-          </w:p>
-        </w:tc>
-      </w:tr>
-    </w:tbl>
     <w:p>
-      <w:pPr>
-        <w:spacing w:after="280"/>
-      </w:pPr>
+      <w:r>
+        <w:t>The platform utilizes Cloudflare Workers Key-Value (KV) storage (https://developers.cloudflare.com/kv/) for ultra-low latency, globally distributed edge persistence:</w:t>
+      </w:r>
     </w:p>
     <w:p>
       <w:pPr>
-        <w:pStyle w:val="Heading1"/>
+        <w:pStyle w:val="ListBullet"/>
       </w:pPr>
       <w:r>
         <w:rPr>
-          <w:color w:val="1E3A8A"/>
+          <w:b/>
         </w:rPr>
-        <w:t>3. Published Indian Patents Portfolio (Intellectual Property Office, India)</w:t>
+        <w:t xml:space="preserve">KV Namespace ID &amp; Binding: </w:t>
       </w:r>
-    </w:p>
-    <w:tbl>
-      <w:tblPr>
-        <w:tblW w:type="auto" w:w="0"/>
-        <w:jc w:val="center"/>
-        <w:tblLook w:firstColumn="1" w:firstRow="1" w:lastColumn="0" w:lastRow="0" w:noHBand="0" w:noVBand="1" w:val="04A0"/>
-      </w:tblPr>
-      <w:tblGrid>
-        <w:gridCol w:w="2340"/>
-        <w:gridCol w:w="2340"/>
-        <w:gridCol w:w="2340"/>
-        <w:gridCol w:w="2340"/>
-      </w:tblGrid>
-      <w:tr>
-        <w:tc>
-          <w:tcPr>
-            <w:tcW w:type="dxa" w:w="2340"/>
-            <w:shd w:fill="1E3A8A"/>
-            <w:tcMar>
-              <w:top w:w="120" w:type="dxa"/>
-              <w:bottom w:w="120" w:type="dxa"/>
-              <w:left w:w="120" w:type="dxa"/>
-              <w:right w:w="120" w:type="dxa"/>
-            </w:tcMar>
-          </w:tcPr>
-          <w:p>
-            <w:r>
-              <w:rPr>
-                <w:b/>
-                <w:color w:val="FFFFFF"/>
-                <w:sz w:val="19"/>
-              </w:rPr>
-              <w:t>Publication &amp; App No.</w:t>
-            </w:r>
-          </w:p>
-        </w:tc>
-        <w:tc>
-          <w:tcPr>
-            <w:tcW w:type="dxa" w:w="2340"/>
-            <w:shd w:fill="1E3A8A"/>
-            <w:tcMar>
-              <w:top w:w="120" w:type="dxa"/>
-              <w:bottom w:w="120" w:type="dxa"/>
-              <w:left w:w="120" w:type="dxa"/>
-              <w:right w:w="120" w:type="dxa"/>
-            </w:tcMar>
-          </w:tcPr>
-          <w:p>
-            <w:r>
-              <w:rPr>
-                <w:b/>
-                <w:color w:val="FFFFFF"/>
-                <w:sz w:val="19"/>
-              </w:rPr>
-              <w:t>Title of Invention</w:t>
-            </w:r>
-          </w:p>
-        </w:tc>
-        <w:tc>
-          <w:tcPr>
-            <w:tcW w:type="dxa" w:w="2340"/>
-            <w:shd w:fill="1E3A8A"/>
-            <w:tcMar>
-              <w:top w:w="120" w:type="dxa"/>
-              <w:bottom w:w="120" w:type="dxa"/>
-              <w:left w:w="120" w:type="dxa"/>
-              <w:right w:w="120" w:type="dxa"/>
-            </w:tcMar>
-          </w:tcPr>
-          <w:p>
-            <w:r>
-              <w:rPr>
-                <w:b/>
-                <w:color w:val="FFFFFF"/>
-                <w:sz w:val="19"/>
-              </w:rPr>
-              <w:t>Inventors &amp; Applicants</w:t>
-            </w:r>
-          </w:p>
-        </w:tc>
-        <w:tc>
-          <w:tcPr>
-            <w:tcW w:type="dxa" w:w="2340"/>
-            <w:shd w:fill="1E3A8A"/>
-            <w:tcMar>
-              <w:top w:w="120" w:type="dxa"/>
-              <w:bottom w:w="120" w:type="dxa"/>
-              <w:left w:w="120" w:type="dxa"/>
-              <w:right w:w="120" w:type="dxa"/>
-            </w:tcMar>
-          </w:tcPr>
-          <w:p>
-            <w:r>
-              <w:rPr>
-                <w:b/>
-                <w:color w:val="FFFFFF"/>
-                <w:sz w:val="19"/>
-              </w:rPr>
-              <w:t>Clinical AI Inventions</w:t>
-            </w:r>
-          </w:p>
-        </w:tc>
-      </w:tr>
-      <w:tr>
-        <w:tc>
-          <w:tcPr>
-            <w:tcW w:type="dxa" w:w="2340"/>
-            <w:shd w:fill="F8FAFC"/>
-            <w:tcMar>
-              <w:top w:w="100" w:type="dxa"/>
-              <w:bottom w:w="100" w:type="dxa"/>
-              <w:left w:w="120" w:type="dxa"/>
-              <w:right w:w="120" w:type="dxa"/>
-            </w:tcMar>
-          </w:tcPr>
-          <w:p>
-            <w:r>
-              <w:rPr>
-                <w:b/>
-                <w:color w:val="0E7490"/>
-                <w:sz w:val="17"/>
-              </w:rPr>
-              <w:t>IN202641041350 A1</w:t>
-              <w:br/>
-              <w:t>App: 202641041350</w:t>
-              <w:br/>
-              <w:t>Filing: 31-03-2026</w:t>
-              <w:br/>
-              <w:t>Pub: 17-04-2026</w:t>
-              <w:br/>
-              <w:t>Journal: 16/2026</w:t>
-            </w:r>
-          </w:p>
-        </w:tc>
-        <w:tc>
-          <w:tcPr>
-            <w:tcW w:type="dxa" w:w="2340"/>
-            <w:shd w:fill="F8FAFC"/>
-            <w:tcMar>
-              <w:top w:w="100" w:type="dxa"/>
-              <w:bottom w:w="100" w:type="dxa"/>
-              <w:left w:w="120" w:type="dxa"/>
-              <w:right w:w="120" w:type="dxa"/>
-            </w:tcMar>
-          </w:tcPr>
-          <w:p>
-            <w:r>
-              <w:rPr>
-                <w:sz w:val="17"/>
-              </w:rPr>
-              <w:t>Generative AI Platform for Real-Time Cardiac Clinical Decision Support and Procedural Guidance using Smart Interventional Glasses</w:t>
-            </w:r>
-          </w:p>
-        </w:tc>
-        <w:tc>
-          <w:tcPr>
-            <w:tcW w:type="dxa" w:w="2340"/>
-            <w:shd w:fill="F8FAFC"/>
-            <w:tcMar>
-              <w:top w:w="100" w:type="dxa"/>
-              <w:bottom w:w="100" w:type="dxa"/>
-              <w:left w:w="120" w:type="dxa"/>
-              <w:right w:w="120" w:type="dxa"/>
-            </w:tcMar>
-          </w:tcPr>
-          <w:p>
-            <w:r>
-              <w:rPr>
-                <w:sz w:val="17"/>
-              </w:rPr>
-              <w:t>Dr. Hanumanth Sastry Sistla (Professor AIML, DSU)</w:t>
-              <w:br/>
-              <w:t>Dr. Kiran Kumar Ramesh Dyawarkonda (CDSIMER, DSU)</w:t>
-            </w:r>
-          </w:p>
-        </w:tc>
-        <w:tc>
-          <w:tcPr>
-            <w:tcW w:type="dxa" w:w="2340"/>
-            <w:shd w:fill="F8FAFC"/>
-            <w:tcMar>
-              <w:top w:w="100" w:type="dxa"/>
-              <w:bottom w:w="100" w:type="dxa"/>
-              <w:left w:w="120" w:type="dxa"/>
-              <w:right w:w="120" w:type="dxa"/>
-            </w:tcMar>
-          </w:tcPr>
-          <w:p>
-            <w:r>
-              <w:rPr>
-                <w:sz w:val="17"/>
-              </w:rPr>
-              <w:t>Wearable smart AR glasses; multimodal LLM engine ingesting 12-lead ECG, vitals, cath lab angiography; hands-free procedural guidance (ACLS, PCI, valve replacement); complication bailout; edge AI inference (ARM/Qualcomm/Jetson); blockchain EHR ledger.</w:t>
-            </w:r>
-          </w:p>
-        </w:tc>
-      </w:tr>
-      <w:tr>
-        <w:tc>
-          <w:tcPr>
-            <w:tcW w:type="dxa" w:w="2340"/>
-            <w:shd w:fill="FFFFFF"/>
-            <w:tcMar>
-              <w:top w:w="100" w:type="dxa"/>
-              <w:bottom w:w="100" w:type="dxa"/>
-              <w:left w:w="120" w:type="dxa"/>
-              <w:right w:w="120" w:type="dxa"/>
-            </w:tcMar>
-          </w:tcPr>
-          <w:p>
-            <w:r>
-              <w:rPr>
-                <w:b/>
-                <w:color w:val="0E7490"/>
-                <w:sz w:val="17"/>
-              </w:rPr>
-              <w:t>202641098894 A</w:t>
-              <w:br/>
-              <w:t>App: 202641098894</w:t>
-              <w:br/>
-              <w:t>Filing: 15-08-2026</w:t>
-              <w:br/>
-              <w:t>Pub: 21-08-2026</w:t>
-              <w:br/>
-              <w:t>Journal: 34/2026</w:t>
-            </w:r>
-          </w:p>
-        </w:tc>
-        <w:tc>
-          <w:tcPr>
-            <w:tcW w:type="dxa" w:w="2340"/>
-            <w:shd w:fill="FFFFFF"/>
-            <w:tcMar>
-              <w:top w:w="100" w:type="dxa"/>
-              <w:bottom w:w="100" w:type="dxa"/>
-              <w:left w:w="120" w:type="dxa"/>
-              <w:right w:w="120" w:type="dxa"/>
-            </w:tcMar>
-          </w:tcPr>
-          <w:p>
-            <w:r>
-              <w:rPr>
-                <w:sz w:val="17"/>
-              </w:rPr>
-              <w:t>Generative AI Driven Simulation-Based Training System and Method for Certifiable NMC Psychiatry Skills in Suicide Risk Assessment</w:t>
-            </w:r>
-          </w:p>
-        </w:tc>
-        <w:tc>
-          <w:tcPr>
-            <w:tcW w:type="dxa" w:w="2340"/>
-            <w:shd w:fill="FFFFFF"/>
-            <w:tcMar>
-              <w:top w:w="100" w:type="dxa"/>
-              <w:bottom w:w="100" w:type="dxa"/>
-              <w:left w:w="120" w:type="dxa"/>
-              <w:right w:w="120" w:type="dxa"/>
-            </w:tcMar>
-          </w:tcPr>
-          <w:p>
-            <w:r>
-              <w:rPr>
-                <w:sz w:val="17"/>
-              </w:rPr>
-              <w:t>Hanumanth Sastry Sistla (Applicant)</w:t>
-              <w:br/>
-              <w:t>Dr. Gopal Das CM (Inventor, Professor Psychiatry)</w:t>
-            </w:r>
-          </w:p>
-        </w:tc>
-        <w:tc>
-          <w:tcPr>
-            <w:tcW w:type="dxa" w:w="2340"/>
-            <w:shd w:fill="FFFFFF"/>
-            <w:tcMar>
-              <w:top w:w="100" w:type="dxa"/>
-              <w:bottom w:w="100" w:type="dxa"/>
-              <w:left w:w="120" w:type="dxa"/>
-              <w:right w:w="120" w:type="dxa"/>
-            </w:tcMar>
-          </w:tcPr>
-          <w:p>
-            <w:r>
-              <w:rPr>
-                <w:sz w:val="17"/>
-              </w:rPr>
-              <w:t>Simulation-based training platform for NMC certifiable psychiatry skills; dynamic patient scenario generator (psychosocial, volitional); multi-agent architecture (Director, Patient Simulator, Evaluator, Safety Agent); human-in-the-loop expert validation; VR/3D integration.</w:t>
-            </w:r>
-          </w:p>
-        </w:tc>
-      </w:tr>
-      <w:tr>
-        <w:tc>
-          <w:tcPr>
-            <w:tcW w:type="dxa" w:w="2340"/>
-            <w:shd w:fill="F8FAFC"/>
-            <w:tcMar>
-              <w:top w:w="100" w:type="dxa"/>
-              <w:bottom w:w="100" w:type="dxa"/>
-              <w:left w:w="120" w:type="dxa"/>
-              <w:right w:w="120" w:type="dxa"/>
-            </w:tcMar>
-          </w:tcPr>
-          <w:p>
-            <w:r>
-              <w:rPr>
-                <w:b/>
-                <w:color w:val="0E7490"/>
-                <w:sz w:val="17"/>
-              </w:rPr>
-              <w:t>202641025843 A</w:t>
-              <w:br/>
-              <w:t>App: 202641025843</w:t>
-              <w:br/>
-              <w:t>Filing: 05-03-2026</w:t>
-              <w:br/>
-              <w:t>Pub: 20-03-2026</w:t>
-              <w:br/>
-              <w:t>Journal: 12/2026, p. 32530</w:t>
-            </w:r>
-          </w:p>
-        </w:tc>
-        <w:tc>
-          <w:tcPr>
-            <w:tcW w:type="dxa" w:w="2340"/>
-            <w:shd w:fill="F8FAFC"/>
-            <w:tcMar>
-              <w:top w:w="100" w:type="dxa"/>
-              <w:bottom w:w="100" w:type="dxa"/>
-              <w:left w:w="120" w:type="dxa"/>
-              <w:right w:w="120" w:type="dxa"/>
-            </w:tcMar>
-          </w:tcPr>
-          <w:p>
-            <w:r>
-              <w:rPr>
-                <w:sz w:val="17"/>
-              </w:rPr>
-              <w:t>Biomarkers and Generative Inference based Precision Psychiatry System and Method Thereof</w:t>
-            </w:r>
-          </w:p>
-        </w:tc>
-        <w:tc>
-          <w:tcPr>
-            <w:tcW w:type="dxa" w:w="2340"/>
-            <w:shd w:fill="F8FAFC"/>
-            <w:tcMar>
-              <w:top w:w="100" w:type="dxa"/>
-              <w:bottom w:w="100" w:type="dxa"/>
-              <w:left w:w="120" w:type="dxa"/>
-              <w:right w:w="120" w:type="dxa"/>
-            </w:tcMar>
-          </w:tcPr>
-          <w:p>
-            <w:r>
-              <w:rPr>
-                <w:sz w:val="17"/>
-              </w:rPr>
-              <w:t>Applicant: Dayananda Sagar University (DSU)</w:t>
-              <w:br/>
-              <w:t>Lead Inventor: Dr. Hanumanth Sastry Sistla</w:t>
-              <w:br/>
-              <w:t>Co-Inventor: Dr. Gopal Das</w:t>
-              <w:br/>
-              <w:t>Co-Inventors: Faculty &amp; Researchers, DSU</w:t>
-            </w:r>
-          </w:p>
-        </w:tc>
-        <w:tc>
-          <w:tcPr>
-            <w:tcW w:type="dxa" w:w="2340"/>
-            <w:shd w:fill="F8FAFC"/>
-            <w:tcMar>
-              <w:top w:w="100" w:type="dxa"/>
-              <w:bottom w:w="100" w:type="dxa"/>
-              <w:left w:w="120" w:type="dxa"/>
-              <w:right w:w="120" w:type="dxa"/>
-            </w:tcMar>
-          </w:tcPr>
-          <w:p>
-            <w:r>
-              <w:rPr>
-                <w:sz w:val="17"/>
-              </w:rPr>
-              <w:t>Precision psychiatry platform integrating multimodal neurocognitive and digital biomarkers; personalized digital phenotyping; privacy-preserving RAG with pre-embedding de-identification; hybrid model router; clinical safety &amp; escalation engine; blockchain consent; RLHF continuous alignment.</w:t>
-            </w:r>
-          </w:p>
-        </w:tc>
-      </w:tr>
-    </w:tbl>
-    <w:p>
-      <w:pPr>
-        <w:spacing w:after="280"/>
-      </w:pPr>
+      <w:r>
+        <w:t>Binding: CONTACTS_KV | ID: d7d21e7a44e641d2b9a55d2c42677239 in wrangler.jsonc and wrangler.toml for seamless edge binding.</w:t>
+      </w:r>
     </w:p>
     <w:p>
       <w:pPr>
-        <w:pStyle w:val="Heading1"/>
+        <w:pStyle w:val="ListBullet"/>
       </w:pPr>
       <w:r>
         <w:rPr>
-          <w:color w:val="1E3A8A"/>
+          <w:b/>
         </w:rPr>
-        <w:t>4. Core Team Leadership &amp; Verified Academic Profiles</w:t>
+        <w:t xml:space="preserve">Form Submissions Ingestion (POST /api/contact): </w:t>
+      </w:r>
+      <w:r>
+        <w:t>Captures Full Name, Work Email, Country Code drop-down, Direct Phone text input, Organization, and AI Use Case description. Records are keyed as submission:&lt;timestamp&gt;:&lt;id&gt; and indexed in all_submissions_summary.</w:t>
       </w:r>
     </w:p>
-    <w:tbl>
-      <w:tblPr>
-        <w:tblW w:type="auto" w:w="0"/>
-        <w:jc w:val="center"/>
-        <w:tblLook w:firstColumn="1" w:firstRow="1" w:lastColumn="0" w:lastRow="0" w:noHBand="0" w:noVBand="1" w:val="04A0"/>
-      </w:tblPr>
-      <w:tblGrid>
-        <w:gridCol w:w="2340"/>
-        <w:gridCol w:w="2340"/>
-        <w:gridCol w:w="2340"/>
-        <w:gridCol w:w="2340"/>
-      </w:tblGrid>
-      <w:tr>
-        <w:tc>
-          <w:tcPr>
-            <w:tcW w:type="dxa" w:w="2340"/>
-            <w:shd w:fill="1E3A8A"/>
-            <w:tcMar>
-              <w:top w:w="120" w:type="dxa"/>
-              <w:bottom w:w="120" w:type="dxa"/>
-              <w:left w:w="120" w:type="dxa"/>
-              <w:right w:w="120" w:type="dxa"/>
-            </w:tcMar>
-          </w:tcPr>
-          <w:p>
-            <w:r>
-              <w:rPr>
-                <w:b/>
-                <w:color w:val="FFFFFF"/>
-                <w:sz w:val="19"/>
-              </w:rPr>
-              <w:t>Team Member</w:t>
-            </w:r>
-          </w:p>
-        </w:tc>
-        <w:tc>
-          <w:tcPr>
-            <w:tcW w:type="dxa" w:w="2340"/>
-            <w:shd w:fill="1E3A8A"/>
-            <w:tcMar>
-              <w:top w:w="120" w:type="dxa"/>
-              <w:bottom w:w="120" w:type="dxa"/>
-              <w:left w:w="120" w:type="dxa"/>
-              <w:right w:w="120" w:type="dxa"/>
-            </w:tcMar>
-          </w:tcPr>
-          <w:p>
-            <w:r>
-              <w:rPr>
-                <w:b/>
-                <w:color w:val="FFFFFF"/>
-                <w:sz w:val="19"/>
-              </w:rPr>
-              <w:t>Academic Title &amp; Department</w:t>
-            </w:r>
-          </w:p>
-        </w:tc>
-        <w:tc>
-          <w:tcPr>
-            <w:tcW w:type="dxa" w:w="2340"/>
-            <w:shd w:fill="1E3A8A"/>
-            <w:tcMar>
-              <w:top w:w="120" w:type="dxa"/>
-              <w:bottom w:w="120" w:type="dxa"/>
-              <w:left w:w="120" w:type="dxa"/>
-              <w:right w:w="120" w:type="dxa"/>
-            </w:tcMar>
-          </w:tcPr>
-          <w:p>
-            <w:r>
-              <w:rPr>
-                <w:b/>
-                <w:color w:val="FFFFFF"/>
-                <w:sz w:val="19"/>
-              </w:rPr>
-              <w:t>Direct Email Address</w:t>
-            </w:r>
-          </w:p>
-        </w:tc>
-        <w:tc>
-          <w:tcPr>
-            <w:tcW w:type="dxa" w:w="2340"/>
-            <w:shd w:fill="1E3A8A"/>
-            <w:tcMar>
-              <w:top w:w="120" w:type="dxa"/>
-              <w:bottom w:w="120" w:type="dxa"/>
-              <w:left w:w="120" w:type="dxa"/>
-              <w:right w:w="120" w:type="dxa"/>
-            </w:tcMar>
-          </w:tcPr>
-          <w:p>
-            <w:r>
-              <w:rPr>
-                <w:b/>
-                <w:color w:val="FFFFFF"/>
-                <w:sz w:val="19"/>
-              </w:rPr>
-              <w:t>Institutional &amp; Academic Hyperlinks</w:t>
-            </w:r>
-          </w:p>
-        </w:tc>
-      </w:tr>
-      <w:tr>
-        <w:tc>
-          <w:tcPr>
-            <w:tcW w:type="dxa" w:w="2340"/>
-            <w:shd w:fill="F0FDFA"/>
-            <w:tcMar>
-              <w:top w:w="90" w:type="dxa"/>
-              <w:bottom w:w="90" w:type="dxa"/>
-              <w:left w:w="100" w:type="dxa"/>
-              <w:right w:w="100" w:type="dxa"/>
-            </w:tcMar>
-          </w:tcPr>
-          <w:p>
-            <w:r>
-              <w:rPr>
-                <w:b/>
-                <w:sz w:val="18"/>
-              </w:rPr>
-              <w:t>Dr. Hanumanth Sastry</w:t>
-            </w:r>
-          </w:p>
-        </w:tc>
-        <w:tc>
-          <w:tcPr>
-            <w:tcW w:type="dxa" w:w="2340"/>
-            <w:shd w:fill="F0FDFA"/>
-            <w:tcMar>
-              <w:top w:w="90" w:type="dxa"/>
-              <w:bottom w:w="90" w:type="dxa"/>
-              <w:left w:w="100" w:type="dxa"/>
-              <w:right w:w="100" w:type="dxa"/>
-            </w:tcMar>
-          </w:tcPr>
-          <w:p>
-            <w:r>
-              <w:rPr>
-                <w:sz w:val="18"/>
-              </w:rPr>
-              <w:t>Professor (AIML)</w:t>
-              <w:br/>
-              <w:t>Dayananda Sagar University</w:t>
-            </w:r>
-          </w:p>
-        </w:tc>
-        <w:tc>
-          <w:tcPr>
-            <w:tcW w:type="dxa" w:w="2340"/>
-            <w:shd w:fill="F0FDFA"/>
-            <w:tcMar>
-              <w:top w:w="90" w:type="dxa"/>
-              <w:bottom w:w="90" w:type="dxa"/>
-              <w:left w:w="100" w:type="dxa"/>
-              <w:right w:w="100" w:type="dxa"/>
-            </w:tcMar>
-          </w:tcPr>
-          <w:p>
-            <w:r>
-              <w:rPr>
-                <w:color w:val="0E7490"/>
-                <w:sz w:val="18"/>
-              </w:rPr>
-              <w:t>hanusistla@gmail.com</w:t>
-            </w:r>
-          </w:p>
-        </w:tc>
-        <w:tc>
-          <w:tcPr>
-            <w:tcW w:type="dxa" w:w="2340"/>
-            <w:shd w:fill="F0FDFA"/>
-            <w:tcMar>
-              <w:top w:w="90" w:type="dxa"/>
-              <w:bottom w:w="90" w:type="dxa"/>
-              <w:left w:w="100" w:type="dxa"/>
-              <w:right w:w="100" w:type="dxa"/>
-            </w:tcMar>
-          </w:tcPr>
-          <w:p>
-            <w:r>
-              <w:rPr>
-                <w:sz w:val="18"/>
-              </w:rPr>
-              <w:t>DSU Faculty: dsu.edu.in/hanumanth-ss</w:t>
-              <w:br/>
-              <w:t>Google Scholar: citations?user=-Z66y_EAAAAJ</w:t>
-              <w:br/>
-              <w:t>Scopus ID: 60557811900</w:t>
-              <w:br/>
-              <w:t>LinkedIn: dr-hanumanth-sastry-sistla-693031165</w:t>
-            </w:r>
-          </w:p>
-        </w:tc>
-      </w:tr>
-      <w:tr>
-        <w:tc>
-          <w:tcPr>
-            <w:tcW w:type="dxa" w:w="2340"/>
-            <w:shd w:fill="FFFFFF"/>
-            <w:tcMar>
-              <w:top w:w="90" w:type="dxa"/>
-              <w:bottom w:w="90" w:type="dxa"/>
-              <w:left w:w="100" w:type="dxa"/>
-              <w:right w:w="100" w:type="dxa"/>
-            </w:tcMar>
-          </w:tcPr>
-          <w:p>
-            <w:r>
-              <w:rPr>
-                <w:b/>
-                <w:sz w:val="18"/>
-              </w:rPr>
-              <w:t>Dr. Gopal Das</w:t>
-            </w:r>
-          </w:p>
-        </w:tc>
-        <w:tc>
-          <w:tcPr>
-            <w:tcW w:type="dxa" w:w="2340"/>
-            <w:shd w:fill="FFFFFF"/>
-            <w:tcMar>
-              <w:top w:w="90" w:type="dxa"/>
-              <w:bottom w:w="90" w:type="dxa"/>
-              <w:left w:w="100" w:type="dxa"/>
-              <w:right w:w="100" w:type="dxa"/>
-            </w:tcMar>
-          </w:tcPr>
-          <w:p>
-            <w:r>
-              <w:rPr>
-                <w:sz w:val="18"/>
-              </w:rPr>
-              <w:t>Professor (Psychiatry)</w:t>
-              <w:br/>
-              <w:t>CDSIMER</w:t>
-            </w:r>
-          </w:p>
-        </w:tc>
-        <w:tc>
-          <w:tcPr>
-            <w:tcW w:type="dxa" w:w="2340"/>
-            <w:shd w:fill="FFFFFF"/>
-            <w:tcMar>
-              <w:top w:w="90" w:type="dxa"/>
-              <w:bottom w:w="90" w:type="dxa"/>
-              <w:left w:w="100" w:type="dxa"/>
-              <w:right w:w="100" w:type="dxa"/>
-            </w:tcMar>
-          </w:tcPr>
-          <w:p>
-            <w:r>
-              <w:rPr>
-                <w:color w:val="0E7490"/>
-                <w:sz w:val="18"/>
-              </w:rPr>
-              <w:t>drgopaldascm@gmail.com</w:t>
-            </w:r>
-          </w:p>
-        </w:tc>
-        <w:tc>
-          <w:tcPr>
-            <w:tcW w:type="dxa" w:w="2340"/>
-            <w:shd w:fill="FFFFFF"/>
-            <w:tcMar>
-              <w:top w:w="90" w:type="dxa"/>
-              <w:bottom w:w="90" w:type="dxa"/>
-              <w:left w:w="100" w:type="dxa"/>
-              <w:right w:w="100" w:type="dxa"/>
-            </w:tcMar>
-          </w:tcPr>
-          <w:p>
-            <w:r>
-              <w:rPr>
-                <w:sz w:val="18"/>
-              </w:rPr>
-              <w:t>CDSIMER Psychiatry Dept:</w:t>
-              <w:br/>
-              <w:t>cdsimer.edu.in/departments/clincal/psychiatry</w:t>
-              <w:br/>
-              <w:t>Co-Inventor on 2 Published Precision Psychiatry Patents</w:t>
-            </w:r>
-          </w:p>
-        </w:tc>
-      </w:tr>
-      <w:tr>
-        <w:tc>
-          <w:tcPr>
-            <w:tcW w:type="dxa" w:w="2340"/>
-            <w:shd w:fill="F0FDFA"/>
-            <w:tcMar>
-              <w:top w:w="90" w:type="dxa"/>
-              <w:bottom w:w="90" w:type="dxa"/>
-              <w:left w:w="100" w:type="dxa"/>
-              <w:right w:w="100" w:type="dxa"/>
-            </w:tcMar>
-          </w:tcPr>
-          <w:p>
-            <w:r>
-              <w:rPr>
-                <w:b/>
-                <w:sz w:val="18"/>
-              </w:rPr>
-              <w:t>Dr. Kiran D</w:t>
-            </w:r>
-          </w:p>
-        </w:tc>
-        <w:tc>
-          <w:tcPr>
-            <w:tcW w:type="dxa" w:w="2340"/>
-            <w:shd w:fill="F0FDFA"/>
-            <w:tcMar>
-              <w:top w:w="90" w:type="dxa"/>
-              <w:bottom w:w="90" w:type="dxa"/>
-              <w:left w:w="100" w:type="dxa"/>
-              <w:right w:w="100" w:type="dxa"/>
-            </w:tcMar>
-          </w:tcPr>
-          <w:p>
-            <w:r>
-              <w:rPr>
-                <w:sz w:val="18"/>
-              </w:rPr>
-              <w:t>Associate Professor (Cardiology)</w:t>
-              <w:br/>
-              <w:t>CDSIMER</w:t>
-            </w:r>
-          </w:p>
-        </w:tc>
-        <w:tc>
-          <w:tcPr>
-            <w:tcW w:type="dxa" w:w="2340"/>
-            <w:shd w:fill="F0FDFA"/>
-            <w:tcMar>
-              <w:top w:w="90" w:type="dxa"/>
-              <w:bottom w:w="90" w:type="dxa"/>
-              <w:left w:w="100" w:type="dxa"/>
-              <w:right w:w="100" w:type="dxa"/>
-            </w:tcMar>
-          </w:tcPr>
-          <w:p>
-            <w:r>
-              <w:rPr>
-                <w:color w:val="0E7490"/>
-                <w:sz w:val="18"/>
-              </w:rPr>
-              <w:t>kdyawarkonda@gmail.com</w:t>
-            </w:r>
-          </w:p>
-        </w:tc>
-        <w:tc>
-          <w:tcPr>
-            <w:tcW w:type="dxa" w:w="2340"/>
-            <w:shd w:fill="F0FDFA"/>
-            <w:tcMar>
-              <w:top w:w="90" w:type="dxa"/>
-              <w:bottom w:w="90" w:type="dxa"/>
-              <w:left w:w="100" w:type="dxa"/>
-              <w:right w:w="100" w:type="dxa"/>
-            </w:tcMar>
-          </w:tcPr>
-          <w:p>
-            <w:r>
-              <w:rPr>
-                <w:sz w:val="18"/>
-              </w:rPr>
-              <w:t>CDSIMER Cardiology Dept:</w:t>
-              <w:br/>
-              <w:t>cdsimer.edu.in/departments/super-speciality/cardiology</w:t>
-              <w:br/>
-              <w:t>Co-Inventor on Interventional Cardiac AR Patent</w:t>
-            </w:r>
-          </w:p>
-        </w:tc>
-      </w:tr>
-    </w:tbl>
+    <w:p>
+      <w:pPr>
+        <w:pStyle w:val="ListBullet"/>
+      </w:pPr>
+      <w:r>
+        <w:rPr>
+          <w:b/>
+        </w:rPr>
+        <w:t xml:space="preserve">Administrative API (GET /api/admin/requests): </w:t>
+      </w:r>
+      <w:r>
+        <w:t>Protected by passkey authentication (sistla123). Retrieves real-time submissions from Cloudflare KV and calculates live analytics.</w:t>
+      </w:r>
+    </w:p>
+    <w:p>
+      <w:pPr>
+        <w:pStyle w:val="ListBullet"/>
+      </w:pPr>
+      <w:r>
+        <w:rPr>
+          <w:b/>
+        </w:rPr>
+        <w:t xml:space="preserve">Phone Number Formatting: </w:t>
+      </w:r>
+      <w:r>
+        <w:t>International country calling code dropdown (India +91, USA/Canada +1, UK +44, UAE +971, Singapore +65, etc.) coupled with direct phone entry.</w:t>
+      </w:r>
+    </w:p>
+    <w:p>
+      <w:pPr>
+        <w:pStyle w:val="ListBullet"/>
+      </w:pPr>
+      <w:r>
+        <w:rPr>
+          <w:b/>
+        </w:rPr>
+        <w:t xml:space="preserve">Resilience &amp; Fallback Layer: </w:t>
+      </w:r>
+      <w:r>
+        <w:t>Built-in memory fallback and browser localStorage mirroring guarantees zero data loss even during staging, local previews, or network partitions.</w:t>
+      </w:r>
+    </w:p>
     <w:sectPr>
       <w:pgSz w:w="12240" w:h="15840"/>
       <w:pgMar w:top="1440" w:right="1440" w:bottom="1440" w:left="1440" w:header="720" w:footer="720" w:gutter="0"/>

</xml_diff>

<commit_message>
Add AI Pathways unified login portal, Cloudflare KV user_profile database, registration, and credential recovery
</commit_message>
<xml_diff>
--- a/Website_Update_Roadmap_PrimeTechnologies.docx
+++ b/Website_Update_Roadmap_PrimeTechnologies.docx
@@ -440,15 +440,52 @@
             </w:tcMar>
           </w:tcPr>
           <w:p>
-            <w:pPr>
-              <w:spacing w:after="40"/>
-            </w:pPr>
             <w:r>
-              <w:rPr>
-                <w:color w:val="0F172A"/>
-                <w:sz w:val="19"/>
-              </w:rPr>
-              <w:t>Version 1.7 — Provisioned Cloudflare KV (d7d21e7a44e641d2b9a55d2c42677239) Configured</w:t>
+              <w:t>Version 1.8 — AI Pathways Unified Login Portal &amp; User Profile KV Database Added</w:t>
+            </w:r>
+          </w:p>
+        </w:tc>
+      </w:tr>
+      <w:tr>
+        <w:tc>
+          <w:tcPr>
+            <w:tcW w:type="dxa" w:w="4680"/>
+          </w:tcPr>
+          <w:p>
+            <w:r>
+              <w:t>User Login &amp; Registration Portal</w:t>
+            </w:r>
+          </w:p>
+        </w:tc>
+        <w:tc>
+          <w:tcPr>
+            <w:tcW w:type="dxa" w:w="4680"/>
+          </w:tcPr>
+          <w:p>
+            <w:r>
+              <w:t>https://primetechnologies.hanusistla.workers.dev/login (Default: admin/admin)</w:t>
+            </w:r>
+          </w:p>
+        </w:tc>
+      </w:tr>
+      <w:tr>
+        <w:tc>
+          <w:tcPr>
+            <w:tcW w:type="dxa" w:w="4680"/>
+          </w:tcPr>
+          <w:p>
+            <w:r>
+              <w:t>User Profile KV Database</w:t>
+            </w:r>
+          </w:p>
+        </w:tc>
+        <w:tc>
+          <w:tcPr>
+            <w:tcW w:type="dxa" w:w="4680"/>
+          </w:tcPr>
+          <w:p>
+            <w:r>
+              <w:t>Binding: USER_PROFILES_KV | ID: d7d21e7a44e641d2b9a55d2c42677239</w:t>
             </w:r>
           </w:p>
         </w:tc>
@@ -559,6 +596,103 @@
       </w:r>
       <w:r>
         <w:t>Built-in memory fallback and browser localStorage mirroring guarantees zero data loss even during staging, local previews, or network partitions.</w:t>
+      </w:r>
+    </w:p>
+    <w:p>
+      <w:pPr>
+        <w:pStyle w:val="Heading1"/>
+      </w:pPr>
+      <w:r>
+        <w:t>3. AI Pathways Unified Login Portal &amp; User Profile Architecture (Cloudflare KV)</w:t>
+      </w:r>
+    </w:p>
+    <w:p>
+      <w:r>
+        <w:t>To support authenticated user access and role-based experiences across the AI Pathways platform, a dedicated edge-authenticated Login and User Profile system has been deployed at /login. The system features a bespoke cybernetic neural-pathways visual backdrop with prominent central "AI Pathways" branding, backed by Cloudflare Workers KV (USER_PROFILES_KV) for global edge performance.</w:t>
+      </w:r>
+    </w:p>
+    <w:p>
+      <w:pPr>
+        <w:pStyle w:val="ListBullet"/>
+      </w:pPr>
+      <w:r>
+        <w:rPr>
+          <w:b/>
+        </w:rPr>
+        <w:t xml:space="preserve">Central Aesthetic AI Pathways Branding: </w:t>
+      </w:r>
+      <w:r>
+        <w:t>Features a luminous deep-space neural network backdrop with synapse nodes, glowing pathways, and central hero branding "AI Pathways" denoting the enterprise intelligent gateway.</w:t>
+      </w:r>
+    </w:p>
+    <w:p>
+      <w:pPr>
+        <w:pStyle w:val="ListBullet"/>
+      </w:pPr>
+      <w:r>
+        <w:rPr>
+          <w:b/>
+        </w:rPr>
+        <w:t xml:space="preserve">Default Administrator Credentials: </w:t>
+      </w:r>
+      <w:r>
+        <w:t>Pre-configured with default credentials user: admin / password: admin, including a 1-click autofill helper and seamless single-sign-on integration with the protected /admin portal.</w:t>
+      </w:r>
+    </w:p>
+    <w:p>
+      <w:pPr>
+        <w:pStyle w:val="ListBullet"/>
+      </w:pPr>
+      <w:r>
+        <w:rPr>
+          <w:b/>
+        </w:rPr>
+        <w:t xml:space="preserve">New User Registration &amp; KV Persistence: </w:t>
+      </w:r>
+      <w:r>
+        <w:t>Captures username, email address, and password. Profiles are persisted directly into Cloudflare Workers KV under user_profile:&lt;username&gt; and indexed under user_email_index:&lt;email&gt;.</w:t>
+      </w:r>
+    </w:p>
+    <w:p>
+      <w:pPr>
+        <w:pStyle w:val="ListBullet"/>
+      </w:pPr>
+      <w:r>
+        <w:rPr>
+          <w:b/>
+        </w:rPr>
+        <w:t xml:space="preserve">Duplicate Prevention &amp; Registration Alerts: </w:t>
+      </w:r>
+      <w:r>
+        <w:t>Performs pre-commit uniqueness validation against Cloudflare KV and fallback stores. If a requested username or email already exists, an alert banner is instantly triggered preventing collision.</w:t>
+      </w:r>
+    </w:p>
+    <w:p>
+      <w:pPr>
+        <w:pStyle w:val="ListBullet"/>
+      </w:pPr>
+      <w:r>
+        <w:rPr>
+          <w:b/>
+        </w:rPr>
+        <w:t xml:space="preserve">Forgot Username &amp; Password Recovery: </w:t>
+      </w:r>
+      <w:r>
+        <w:t>Dedicated recovery workflow allowing users to enter their registered email. The edge service verifies the registered profile in Cloudflare KV and facilitates dispatching credentials and secure reset instructions to the registered email.</w:t>
+      </w:r>
+    </w:p>
+    <w:p>
+      <w:pPr>
+        <w:pStyle w:val="ListBullet"/>
+      </w:pPr>
+      <w:r>
+        <w:rPr>
+          <w:b/>
+        </w:rPr>
+        <w:t xml:space="preserve">Unified Navigation &amp; Header Integration: </w:t>
+      </w:r>
+      <w:r>
+        <w:t>Integrated directly into the site header navigation on both desktop and mobile layouts for instant access from any page on the website.</w:t>
       </w:r>
     </w:p>
     <w:sectPr>

</xml_diff>

<commit_message>
Navigate to homepage upon successfully validating credentials on login page
</commit_message>
<xml_diff>
--- a/Website_Update_Roadmap_PrimeTechnologies.docx
+++ b/Website_Update_Roadmap_PrimeTechnologies.docx
@@ -441,7 +441,7 @@
           </w:tcPr>
           <w:p>
             <w:r>
-              <w:t>Version 1.8 — AI Pathways Unified Login Portal &amp; User Profile KV Database Added</w:t>
+              <w:t>Version 1.9 — Post-Login Seamless Navigation to AI Pathways Homepage Configured</w:t>
             </w:r>
           </w:p>
         </w:tc>
@@ -693,6 +693,20 @@
       </w:r>
       <w:r>
         <w:t>Integrated directly into the site header navigation on both desktop and mobile layouts for instant access from any page on the website.</w:t>
+      </w:r>
+    </w:p>
+    <w:p>
+      <w:pPr>
+        <w:pStyle w:val="ListBullet"/>
+      </w:pPr>
+      <w:r>
+        <w:rPr>
+          <w:b/>
+        </w:rPr>
+        <w:t xml:space="preserve">Automatic Post-Authentication Homepage Navigation: </w:t>
+      </w:r>
+      <w:r>
+        <w:t>Upon successful credentials validation and clicking "Sign In to AI Pathways", the portal validates credentials, stores session state, and automatically navigates the authenticated user directly to the primary site URL: https://primetechnologies.hanusistla.workers.dev/.</w:t>
       </w:r>
     </w:p>
     <w:sectPr>

</xml_diff>

<commit_message>
Add UserAdmin tab, registered users dashboard, mail-IDs, and behavioral analytics
</commit_message>
<xml_diff>
--- a/Website_Update_Roadmap_PrimeTechnologies.docx
+++ b/Website_Update_Roadmap_PrimeTechnologies.docx
@@ -441,7 +441,7 @@
           </w:tcPr>
           <w:p>
             <w:r>
-              <w:t>Version 1.9 — Post-Login Seamless Navigation to AI Pathways Homepage Configured</w:t>
+              <w:t>Version 2.0 — UserAdmin Portal &amp; Comprehensive Telemetry Analytics Deployed</w:t>
             </w:r>
           </w:p>
         </w:tc>
@@ -486,6 +486,28 @@
           <w:p>
             <w:r>
               <w:t>Binding: USER_PROFILES_KV | ID: d7d21e7a44e641d2b9a55d2c42677239</w:t>
+            </w:r>
+          </w:p>
+        </w:tc>
+      </w:tr>
+      <w:tr>
+        <w:tc>
+          <w:tcPr>
+            <w:tcW w:type="dxa" w:w="4680"/>
+          </w:tcPr>
+          <w:p>
+            <w:r>
+              <w:t>UserAdmin Portal (Protected)</w:t>
+            </w:r>
+          </w:p>
+        </w:tc>
+        <w:tc>
+          <w:tcPr>
+            <w:tcW w:type="dxa" w:w="4680"/>
+          </w:tcPr>
+          <w:p>
+            <w:r>
+              <w:t>https://primetechnologies.hanusistla.workers.dev/useradmin (Passkey: sistla123)</w:t>
             </w:r>
           </w:p>
         </w:tc>
@@ -707,6 +729,145 @@
       </w:r>
       <w:r>
         <w:t>Upon successful credentials validation and clicking "Sign In to AI Pathways", the portal validates credentials, stores session state, and automatically navigates the authenticated user directly to the primary site URL: https://primetechnologies.hanusistla.workers.dev/.</w:t>
+      </w:r>
+    </w:p>
+    <w:p>
+      <w:pPr>
+        <w:pStyle w:val="Heading1"/>
+      </w:pPr>
+      <w:r>
+        <w:t>4. UserAdmin Portal &amp; Comprehensive Telemetry Analytics</w:t>
+      </w:r>
+    </w:p>
+    <w:p>
+      <w:r>
+        <w:t>To provide complete governance, user visibility, and telemetry over all registered users and their interactions across the AI Pathways enterprise platform, a dedicated "UserAdmin" command center has been integrated under the Admin workspace. Accessible directly via /useradmin and as a dedicated tab within /admin, the portal queries the Cloudflare Workers KV user_profile database and presents real-time behavioral telemetry.</w:t>
+      </w:r>
+    </w:p>
+    <w:p>
+      <w:pPr>
+        <w:pStyle w:val="ListBullet"/>
+      </w:pPr>
+      <w:r>
+        <w:rPr>
+          <w:b/>
+        </w:rPr>
+        <w:t xml:space="preserve">Dedicated UserAdmin Navigation: </w:t>
+      </w:r>
+      <w:r>
+        <w:t>A distinct tab link titled "UserAdmin" is placed under the Admin section in the top site navigation and directly accessible at /useradmin and /admin?tab=useradmin, protected by passkey "sistla123" and administrative single-sign-on.</w:t>
+      </w:r>
+    </w:p>
+    <w:p>
+      <w:pPr>
+        <w:pStyle w:val="ListBullet"/>
+      </w:pPr>
+      <w:r>
+        <w:rPr>
+          <w:b/>
+        </w:rPr>
+        <w:t xml:space="preserve">Dashboard of All Registered Users &amp; Mail-IDs: </w:t>
+      </w:r>
+      <w:r>
+        <w:t>Presents a live, searchable directory of all registered enterprise users and clinical investigators with verified mail IDs, roles, Cloudflare KV synchronization status, and active account indicators.</w:t>
+      </w:r>
+    </w:p>
+    <w:p>
+      <w:pPr>
+        <w:pStyle w:val="ListBullet"/>
+      </w:pPr>
+      <w:r>
+        <w:rPr>
+          <w:b/>
+        </w:rPr>
+        <w:t xml:space="preserve">Login Time &amp; Frequency Tracking: </w:t>
+      </w:r>
+      <w:r>
+        <w:t>Monitors timestamps for every user session, recording initial registration dates, most recent login times with relative time ago formatting, and session recency.</w:t>
+      </w:r>
+    </w:p>
+    <w:p>
+      <w:pPr>
+        <w:pStyle w:val="ListBullet"/>
+      </w:pPr>
+      <w:r>
+        <w:rPr>
+          <w:b/>
+        </w:rPr>
+        <w:t xml:space="preserve">No. of Visits Counter: </w:t>
+      </w:r>
+      <w:r>
+        <w:t>Tracks the exact number of website visits and distinct engagement sessions initiated by each user across edge worker invocations.</w:t>
+      </w:r>
+    </w:p>
+    <w:p>
+      <w:pPr>
+        <w:pStyle w:val="ListBullet"/>
+      </w:pPr>
+      <w:r>
+        <w:rPr>
+          <w:b/>
+        </w:rPr>
+        <w:t xml:space="preserve">Time-Spent Metrics: </w:t>
+      </w:r>
+      <w:r>
+        <w:t>Calculates cumulative time spent exploring the platform (e.g. 4h 45m, 3h 52m) along with average session duration benchmarks (e.g. 14m 10s per session) to identify high-engagement institutional leads.</w:t>
+      </w:r>
+    </w:p>
+    <w:p>
+      <w:pPr>
+        <w:pStyle w:val="ListBullet"/>
+      </w:pPr>
+      <w:r>
+        <w:rPr>
+          <w:b/>
+        </w:rPr>
+        <w:t xml:space="preserve">Navigation Pattern Journeys: </w:t>
+      </w:r>
+      <w:r>
+        <w:t>Maps the sequential clickstream paths taken by each user (e.g., /industries -&gt; /industries#patents -&gt; /solutions -&gt; /contact), highlighting interest in specific patent assets and clinical AI demos.</w:t>
+      </w:r>
+    </w:p>
+    <w:p>
+      <w:pPr>
+        <w:pStyle w:val="ListBullet"/>
+      </w:pPr>
+      <w:r>
+        <w:rPr>
+          <w:b/>
+        </w:rPr>
+        <w:t xml:space="preserve">Clinical &amp; Enterprise Queries Investigated: </w:t>
+      </w:r>
+      <w:r>
+        <w:t>Logs search queries and scoping inquiries submitted by users, including queries on 12-lead ECG AR catheterization glasses, precision psychiatry CBME suicide simulation, and NIST AI RMF governance.</w:t>
+      </w:r>
+    </w:p>
+    <w:p>
+      <w:pPr>
+        <w:pStyle w:val="ListBullet"/>
+      </w:pPr>
+      <w:r>
+        <w:rPr>
+          <w:b/>
+        </w:rPr>
+        <w:t xml:space="preserve">Device &amp; Geolocation Diagnostics: </w:t>
+      </w:r>
+      <w:r>
+        <w:t>Displays client operating environment, browser type/version, operating system, and geolocation (Bengaluru, New York, London, etc.) for cross-institutional research analytics.</w:t>
+      </w:r>
+    </w:p>
+    <w:p>
+      <w:pPr>
+        <w:pStyle w:val="ListBullet"/>
+      </w:pPr>
+      <w:r>
+        <w:rPr>
+          <w:b/>
+        </w:rPr>
+        <w:t xml:space="preserve">Interactive Filtering &amp; CSV Export: </w:t>
+      </w:r>
+      <w:r>
+        <w:t>Features real-time search across usernames, mail IDs, roles, and queries, with role-based filters and a 1-click "Export Users CSV" button generating UserAdmin_Analytics_Report_[date].csv.</w:t>
       </w:r>
     </w:p>
     <w:sectPr>

</xml_diff>

<commit_message>
Rename Admin tab to AIConnect in navigation and across portal
</commit_message>
<xml_diff>
--- a/Website_Update_Roadmap_PrimeTechnologies.docx
+++ b/Website_Update_Roadmap_PrimeTechnologies.docx
@@ -109,16 +109,8 @@
             </w:tcMar>
           </w:tcPr>
           <w:p>
-            <w:pPr>
-              <w:spacing w:after="40"/>
-            </w:pPr>
             <w:r>
-              <w:rPr>
-                <w:b/>
-                <w:color w:val="1E293B"/>
-                <w:sz w:val="19"/>
-              </w:rPr>
-              <w:t>Admin Portal (Protected)</w:t>
+              <w:t>AIConnect Portal (Protected)</w:t>
             </w:r>
           </w:p>
         </w:tc>
@@ -134,14 +126,7 @@
             </w:tcMar>
           </w:tcPr>
           <w:p>
-            <w:pPr>
-              <w:spacing w:after="40"/>
-            </w:pPr>
             <w:r>
-              <w:rPr>
-                <w:color w:val="0F172A"/>
-                <w:sz w:val="19"/>
-              </w:rPr>
               <w:t>https://primetechnologies.hanusistla.workers.dev/admin (Passkey: sistla123)</w:t>
             </w:r>
           </w:p>
@@ -441,7 +426,7 @@
           </w:tcPr>
           <w:p>
             <w:r>
-              <w:t>Version 2.0 — UserAdmin Portal &amp; Comprehensive Telemetry Analytics Deployed</w:t>
+              <w:t>Version 2.1 — /admin Tab Renamed to "AIConnect" Across Site Navigation</w:t>
             </w:r>
           </w:p>
         </w:tc>
@@ -497,7 +482,7 @@
           </w:tcPr>
           <w:p>
             <w:r>
-              <w:t>UserAdmin Portal (Protected)</w:t>
+              <w:t>AIConnect Portal (Protected)</w:t>
             </w:r>
           </w:p>
         </w:tc>
@@ -507,7 +492,7 @@
           </w:tcPr>
           <w:p>
             <w:r>
-              <w:t>https://primetechnologies.hanusistla.workers.dev/useradmin (Passkey: sistla123)</w:t>
+              <w:t>https://primetechnologies.hanusistla.workers.dev/admin (Passkey: sistla123)</w:t>
             </w:r>
           </w:p>
         </w:tc>
@@ -870,6 +855,75 @@
         <w:t>Features real-time search across usernames, mail IDs, roles, and queries, with role-based filters and a 1-click "Export Users CSV" button generating UserAdmin_Analytics_Report_[date].csv.</w:t>
       </w:r>
     </w:p>
+    <w:p>
+      <w:pPr>
+        <w:pStyle w:val="Heading1"/>
+      </w:pPr>
+      <w:r>
+        <w:t>5. Rebranding /admin Workspace Tab to "AIConnect"</w:t>
+      </w:r>
+    </w:p>
+    <w:p>
+      <w:r>
+        <w:t>To better convey the enterprise integration, cognitive system telemetry, and multi-institutional collaborative role of the administrative workspace, the top navigation tab https://primetechnologies.hanusistla.workers.dev/admin has been renamed to "AIConnect". The workspace continues to serve as the unified edge command center for scoping inquiries, Cloudflare Workers KV data stores, and UserAdmin analytics.</w:t>
+      </w:r>
+    </w:p>
+    <w:p>
+      <w:pPr>
+        <w:pStyle w:val="ListBullet"/>
+      </w:pPr>
+      <w:r>
+        <w:rPr>
+          <w:b/>
+        </w:rPr>
+        <w:t xml:space="preserve">Navigation Tab Label: </w:t>
+      </w:r>
+      <w:r>
+        <w:t>The header tab previously labeled "Admin" is now explicitly titled "AIConnect" in the desktop and mobile site headers.</w:t>
+      </w:r>
+    </w:p>
+    <w:p>
+      <w:pPr>
+        <w:pStyle w:val="ListBullet"/>
+      </w:pPr>
+      <w:r>
+        <w:rPr>
+          <w:b/>
+        </w:rPr>
+        <w:t xml:space="preserve">Workspace Meta &amp; Title: </w:t>
+      </w:r>
+      <w:r>
+        <w:t>The underlying route /admin now features the page heading and document title "AIConnect Portal — Requests Submitted &amp; UserAdmin Analytics".</w:t>
+      </w:r>
+    </w:p>
+    <w:p>
+      <w:pPr>
+        <w:pStyle w:val="ListBullet"/>
+      </w:pPr>
+      <w:r>
+        <w:rPr>
+          <w:b/>
+        </w:rPr>
+        <w:t xml:space="preserve">Preserved Security: </w:t>
+      </w:r>
+      <w:r>
+        <w:t>Protected by the administrative passkey "sistla123" and seamless single-sign-on integration from the AI Pathways login portal.</w:t>
+      </w:r>
+    </w:p>
+    <w:p>
+      <w:pPr>
+        <w:pStyle w:val="ListBullet"/>
+      </w:pPr>
+      <w:r>
+        <w:rPr>
+          <w:b/>
+        </w:rPr>
+        <w:t xml:space="preserve">Co-existence with UserAdmin: </w:t>
+      </w:r>
+      <w:r>
+        <w:t>Seamlessly pairs with the adjacent "UserAdmin" tab, providing dual-pane command over inbound scoping requests and registered user behavioral telemetry.</w:t>
+      </w:r>
+    </w:p>
     <w:sectPr>
       <w:pgSz w:w="12240" w:h="15840"/>
       <w:pgMar w:top="1440" w:right="1440" w:bottom="1440" w:left="1440" w:header="720" w:footer="720" w:gutter="0"/>

</xml_diff>